<commit_message>
Add writing about NER
</commit_message>
<xml_diff>
--- a/writing/Carmel_Suchard_NER_model_comparison.docx
+++ b/writing/Carmel_Suchard_NER_model_comparison.docx
@@ -1,122 +1,36 @@
 
 <file path=word/document.xml><?xml version="1.0" encoding="utf-8"?>
-<w:document xmlns:wpc="http://schemas.microsoft.com/office/word/2010/wordprocessingCanvas" xmlns:cx="http://schemas.microsoft.com/office/drawing/2014/chartex" xmlns:cx1="http://schemas.microsoft.com/office/drawing/2015/9/8/chartex" xmlns:cx2="http://schemas.microsoft.com/office/drawing/2015/10/21/chartex" xmlns:cx3="http://schemas.microsoft.com/office/drawing/2016/5/9/chartex" xmlns:cx4="http://schemas.microsoft.com/office/drawing/2016/5/10/chartex" xmlns:cx5="http://schemas.microsoft.com/office/drawing/2016/5/11/chartex" xmlns:cx6="http://schemas.microsoft.com/office/drawing/2016/5/12/chartex" xmlns:cx7="http://schemas.microsoft.com/office/drawing/2016/5/13/chartex" xmlns:cx8="http://schemas.microsoft.com/office/drawing/2016/5/14/chartex" xmlns:mc="http://schemas.openxmlformats.org/markup-compatibility/2006" xmlns:aink="http://schemas.microsoft.com/office/drawing/2016/ink" xmlns:am3d="http://schemas.microsoft.com/office/drawing/2017/model3d" xmlns:o="urn:schemas-microsoft-com:office:office" xmlns:oel="http://schemas.microsoft.com/office/2019/extlst" xmlns:r="http://schemas.openxmlformats.org/officeDocument/2006/relationships" xmlns:m="http://schemas.openxmlformats.org/officeDocument/2006/math" xmlns:v="urn:schemas-microsoft-com:vml" xmlns:wp14="http://schemas.microsoft.com/office/word/2010/wordprocessingDrawing" xmlns:wp="http://schemas.openxmlformats.org/drawingml/2006/wordprocessingDrawing" xmlns:w10="urn:schemas-microsoft-com:office:word" xmlns:w="http://schemas.openxmlformats.org/wordprocessingml/2006/main" xmlns:w14="http://schemas.microsoft.com/office/word/2010/wordml" xmlns:w15="http://schemas.microsoft.com/office/word/2012/wordml" xmlns:w16cex="http://schemas.microsoft.com/office/word/2018/wordml/cex" xmlns:w16cid="http://schemas.microsoft.com/office/word/2016/wordml/cid" xmlns:w16="http://schemas.microsoft.com/office/word/2018/wordml" xmlns:w16du="http://schemas.microsoft.com/office/word/2023/wordml/word16du" xmlns:w16sdtdh="http://schemas.microsoft.com/office/word/2020/wordml/sdtdatahash" xmlns:w16sdtfl="http://schemas.microsoft.com/office/word/2024/wordml/sdtformatlock" xmlns:w16se="http://schemas.microsoft.com/office/word/2015/wordml/symex" xmlns:wpg="http://schemas.microsoft.com/office/word/2010/wordprocessingGroup" xmlns:wpi="http://schemas.microsoft.com/office/word/2010/wordprocessingInk" xmlns:wne="http://schemas.microsoft.com/office/word/2006/wordml" xmlns:wps="http://schemas.microsoft.com/office/word/2010/wordprocessingShape" mc:Ignorable="w14 w15 w16se w16cid w16 w16cex w16sdtdh w16sdtfl w16du wp14">
+<w:document xmlns:wpc="http://schemas.microsoft.com/office/word/2010/wordprocessingCanvas" xmlns:cx="http://schemas.microsoft.com/office/drawing/2014/chartex" xmlns:cx1="http://schemas.microsoft.com/office/drawing/2015/9/8/chartex" xmlns:cx2="http://schemas.microsoft.com/office/drawing/2015/10/21/chartex" xmlns:cx3="http://schemas.microsoft.com/office/drawing/2016/5/9/chartex" xmlns:cx4="http://schemas.microsoft.com/office/drawing/2016/5/10/chartex" xmlns:cx5="http://schemas.microsoft.com/office/drawing/2016/5/11/chartex" xmlns:cx6="http://schemas.microsoft.com/office/drawing/2016/5/12/chartex" xmlns:cx7="http://schemas.microsoft.com/office/drawing/2016/5/13/chartex" xmlns:cx8="http://schemas.microsoft.com/office/drawing/2016/5/14/chartex" xmlns:mc="http://schemas.openxmlformats.org/markup-compatibility/2006" xmlns:aink="http://schemas.microsoft.com/office/drawing/2016/ink" xmlns:am3d="http://schemas.microsoft.com/office/drawing/2017/model3d" xmlns:o="urn:schemas-microsoft-com:office:office" xmlns:oel="http://schemas.microsoft.com/office/2019/extlst" xmlns:r="http://schemas.openxmlformats.org/officeDocument/2006/relationships" xmlns:m="http://schemas.openxmlformats.org/officeDocument/2006/math" xmlns:v="urn:schemas-microsoft-com:vml" xmlns:wp14="http://schemas.microsoft.com/office/word/2010/wordprocessingDrawing" xmlns:wp="http://schemas.openxmlformats.org/drawingml/2006/wordprocessingDrawing" xmlns:w10="urn:schemas-microsoft-com:office:word" xmlns:w="http://schemas.openxmlformats.org/wordprocessingml/2006/main" xmlns:w14="http://schemas.microsoft.com/office/word/2010/wordml" xmlns:w15="http://schemas.microsoft.com/office/word/2012/wordml" xmlns:w16cex="http://schemas.microsoft.com/office/word/2018/wordml/cex" xmlns:w16cid="http://schemas.microsoft.com/office/word/2016/wordml/cid" xmlns:w16="http://schemas.microsoft.com/office/word/2018/wordml" xmlns:w16sdtdh="http://schemas.microsoft.com/office/word/2020/wordml/sdtdatahash" xmlns:w16se="http://schemas.microsoft.com/office/word/2015/wordml/symex" xmlns:wpg="http://schemas.microsoft.com/office/word/2010/wordprocessingGroup" xmlns:wpi="http://schemas.microsoft.com/office/word/2010/wordprocessingInk" xmlns:wne="http://schemas.microsoft.com/office/word/2006/wordml" xmlns:wps="http://schemas.microsoft.com/office/word/2010/wordprocessingShape" mc:Ignorable="w14 w15 w16se w16cid w16 w16cex w16sdtdh wp14">
   <w:body>
     <w:p>
       <w:pPr>
         <w:pStyle w:val="Heading1"/>
       </w:pPr>
       <w:r>
-        <w:t xml:space="preserve">Named Entity Recognition </w:t>
-      </w:r>
-    </w:p>
-    <w:p>
-      <w:pPr>
-        <w:spacing w:line="276" w:lineRule="auto"/>
-      </w:pPr>
-      <w:r>
-        <w:t xml:space="preserve">Manual annotation of the entire thesis archive is not only time-consuming </w:t>
-      </w:r>
-      <w:r>
-        <w:t xml:space="preserve">and </w:t>
-      </w:r>
-      <w:r>
-        <w:t>non-</w:t>
-      </w:r>
-      <w:r>
-        <w:t xml:space="preserve">scalable, but </w:t>
-      </w:r>
-      <w:r>
-        <w:t xml:space="preserve">also </w:t>
-      </w:r>
-      <w:r>
-        <w:t>prone to human error. Therefore, a more efficient automatic approach</w:t>
-      </w:r>
-      <w:r>
-        <w:t xml:space="preserve"> based on</w:t>
-      </w:r>
-      <w:r>
-        <w:t xml:space="preserve"> deep learning models</w:t>
-      </w:r>
-      <w:r>
-        <w:t xml:space="preserve"> was explored.</w:t>
-      </w:r>
-      <w:r>
-        <w:t xml:space="preserve"> </w:t>
-      </w:r>
-      <w:r>
-        <w:t>A preliminary experiment compared t</w:t>
-      </w:r>
-      <w:r>
-        <w:t>wo model</w:t>
-      </w:r>
-      <w:r>
-        <w:t xml:space="preserve"> types: </w:t>
-      </w:r>
-      <w:r>
+        <w:t>Entity Extraction</w:t>
+      </w:r>
+    </w:p>
+    <w:p>
+      <w:pPr>
+        <w:pStyle w:val="Heading2"/>
+      </w:pPr>
+      <w:r>
+        <w:t>Motivation</w:t>
+      </w:r>
+    </w:p>
+    <w:p>
+      <w:pPr>
         <w:rPr>
           <w:b/>
           <w:bCs/>
         </w:rPr>
-        <w:t>BERT</w:t>
-      </w:r>
-      <w:r>
-        <w:t xml:space="preserve"> (Bidirectional Encoder model from Transformers), a </w:t>
-      </w:r>
-      <w:r>
-        <w:t xml:space="preserve">pretrained </w:t>
-      </w:r>
-      <w:r>
-        <w:t xml:space="preserve">NLP model </w:t>
-      </w:r>
-      <w:r>
-        <w:t xml:space="preserve">commonly used for </w:t>
-      </w:r>
-      <w:r>
-        <w:t>sequence labeling tasks</w:t>
-      </w:r>
-      <w:r>
-        <w:t xml:space="preserve">, </w:t>
-      </w:r>
-      <w:r>
-        <w:t>a</w:t>
-      </w:r>
-      <w:r>
-        <w:t xml:space="preserve">nd </w:t>
-      </w:r>
+      </w:pPr>
       <w:r>
         <w:rPr>
           <w:b/>
           <w:bCs/>
         </w:rPr>
-        <w:t>Gemini</w:t>
-      </w:r>
-      <w:r>
-        <w:t xml:space="preserve">, a general-purpose generative AI model </w:t>
-      </w:r>
-      <w:r>
-        <w:t>developed by</w:t>
-      </w:r>
-      <w:r>
-        <w:t xml:space="preserve"> Google. </w:t>
-      </w:r>
-      <w:r>
-        <w:t>The models</w:t>
-      </w:r>
-      <w:r>
-        <w:t xml:space="preserve"> were evaluated on their </w:t>
-      </w:r>
-      <w:r>
-        <w:t>performance</w:t>
-      </w:r>
-      <w:r>
-        <w:t xml:space="preserve"> in the NER task, using the same labeling scheme and rules </w:t>
-      </w:r>
-      <w:r>
-        <w:t>that</w:t>
-      </w:r>
-      <w:r>
-        <w:t xml:space="preserve"> were used by the human annotators.</w:t>
+        <w:t>Models</w:t>
       </w:r>
     </w:p>
     <w:p>
@@ -124,586 +38,1423 @@
         <w:spacing w:line="276" w:lineRule="auto"/>
       </w:pPr>
       <w:r>
-        <w:t>The comparison was motivated by</w:t>
-      </w:r>
-      <w:r>
-        <w:t xml:space="preserve"> need to find the </w:t>
-      </w:r>
-      <w:r>
-        <w:t>model</w:t>
-      </w:r>
-      <w:r>
-        <w:t xml:space="preserve"> that is most appropriate for the</w:t>
-      </w:r>
-      <w:r>
-        <w:t xml:space="preserve"> </w:t>
-      </w:r>
-      <w:r>
-        <w:t xml:space="preserve">available </w:t>
-      </w:r>
-      <w:r>
-        <w:t>training data</w:t>
-      </w:r>
-      <w:r>
-        <w:t xml:space="preserve">. While BERT </w:t>
-      </w:r>
-      <w:r>
-        <w:t>and related architectures</w:t>
-      </w:r>
-      <w:r>
-        <w:t xml:space="preserve"> are commonly used for NER, most models </w:t>
-      </w:r>
-      <w:r>
-        <w:t>assume</w:t>
-      </w:r>
-      <w:r>
-        <w:t xml:space="preserve"> that the training data is fully</w:t>
-      </w:r>
-      <w:r>
-        <w:t xml:space="preserve"> and consistently</w:t>
-      </w:r>
-      <w:r>
-        <w:t xml:space="preserve"> annotated</w:t>
-      </w:r>
-      <w:r>
-        <w:t xml:space="preserve"> </w:t>
-      </w:r>
-      <w:r>
-        <w:fldChar w:fldCharType="begin"/>
-      </w:r>
-      <w:r>
-        <w:instrText xml:space="preserve"> ADDIN ZOTERO_ITEM CSL_CITATION {"citationID":"9FLLlDka","properties":{"formattedCitation":"(Jie et al., 2019)","plainCitation":"(Jie et al., 2019)","noteIndex":0},"citationItems":[{"id":1988,"uris":["http://zotero.org/users/11765017/items/U7I9B8QM"],"itemData":{"id":1988,"type":"paper-conference","container-title":"Proceedings of the 2019 Conference of the North","DOI":"10.18653/v1/N19-1079","event-place":"Minneapolis, Minnesota","event-title":"Proceedings of the 2019 Conference of the North","language":"en","page":"729-734","publisher":"Association for Computational Linguistics","publisher-place":"Minneapolis, Minnesota","source":"DOI.org (Crossref)","title":"Better Modeling of Incomplete Annotations for Named Entity Recognition","URL":"http://aclweb.org/anthology/N19-1079","author":[{"family":"Jie","given":"Zhanming"},{"family":"Xie","given":"Pengjun"},{"family":"Lu","given":"Wei"},{"family":"Ding","given":"Ruixue"},{"family":"Li","given":"Linlin"}],"accessed":{"date-parts":[["2026",1,25]]},"issued":{"date-parts":[["2019"]]}}}],"schema":"https://github.com/citation-style-language/schema/raw/master/csl-citation.json"} </w:instrText>
-      </w:r>
-      <w:r>
-        <w:fldChar w:fldCharType="separate"/>
-      </w:r>
-      <w:r>
-        <w:rPr>
-          <w:rFonts w:ascii="Aptos" w:hAnsi="Aptos"/>
-        </w:rPr>
-        <w:t>(Jie et al., 2019)</w:t>
-      </w:r>
-      <w:r>
-        <w:fldChar w:fldCharType="end"/>
-      </w:r>
-      <w:r>
-        <w:t xml:space="preserve">. They </w:t>
-      </w:r>
-      <w:r>
-        <w:t xml:space="preserve">struggle when </w:t>
-      </w:r>
-      <w:r>
-        <w:t xml:space="preserve">a large proportion of the </w:t>
-      </w:r>
-      <w:r>
-        <w:t xml:space="preserve">entities are labeled as </w:t>
+        <w:t xml:space="preserve">Manual annotation of the entire thesis archive is not only time-consuming </w:t>
+      </w:r>
+      <w:r>
+        <w:t xml:space="preserve">and </w:t>
+      </w:r>
+      <w:r>
+        <w:t>non-</w:t>
+      </w:r>
+      <w:r>
+        <w:t xml:space="preserve">scalable, but </w:t>
+      </w:r>
+      <w:r>
+        <w:t xml:space="preserve">also </w:t>
+      </w:r>
+      <w:r>
+        <w:t>prone to human error. Therefore, a more efficient automatic approach</w:t>
+      </w:r>
+      <w:r>
+        <w:t xml:space="preserve"> based on</w:t>
+      </w:r>
+      <w:r>
+        <w:t xml:space="preserve"> deep learning models</w:t>
+      </w:r>
+      <w:r>
+        <w:t xml:space="preserve"> was explored.</w:t>
+      </w:r>
+    </w:p>
+    <w:p>
+      <w:r>
+        <w:t xml:space="preserve">The </w:t>
+      </w:r>
+      <w:r>
+        <w:t>challenges</w:t>
+      </w:r>
+      <w:r>
+        <w:t xml:space="preserve"> of entity extraction</w:t>
+      </w:r>
+      <w:r>
+        <w:t>,</w:t>
+      </w:r>
+      <w:r>
+        <w:t xml:space="preserve"> and the model</w:t>
+      </w:r>
+      <w:r>
+        <w:t>s</w:t>
+      </w:r>
+      <w:r>
+        <w:t xml:space="preserve"> required for this task, depend on the categorization of the labels as objective or subjective. Bibliometric labels – </w:t>
       </w:r>
       <w:r>
         <w:rPr>
           <w:i/>
           <w:iCs/>
         </w:rPr>
-        <w:t xml:space="preserve">outside </w:t>
-      </w:r>
-      <w:r>
-        <w:t xml:space="preserve">(O) </w:t>
-      </w:r>
-      <w:r>
-        <w:t xml:space="preserve">due to incomplete </w:t>
-      </w:r>
-      <w:r>
-        <w:t>annotation</w:t>
-      </w:r>
-      <w:r>
-        <w:t xml:space="preserve">. As </w:t>
-      </w:r>
-      <w:r>
-        <w:t>specified</w:t>
-      </w:r>
-      <w:r>
-        <w:t xml:space="preserve"> in the annotation guidelines, human annotators only </w:t>
-      </w:r>
-      <w:r>
-        <w:t>labeled</w:t>
-      </w:r>
-      <w:r>
-        <w:t xml:space="preserve"> the first five instances of each entity</w:t>
-      </w:r>
-      <w:r>
-        <w:t xml:space="preserve">, and </w:t>
-      </w:r>
-      <w:r>
-        <w:t xml:space="preserve">restricted their </w:t>
-      </w:r>
-      <w:r>
-        <w:t>work</w:t>
-      </w:r>
-      <w:r>
-        <w:t xml:space="preserve"> to the main sections, </w:t>
-      </w:r>
-      <w:r>
-        <w:t>leaving the rest of the text unto</w:t>
-      </w:r>
-      <w:r>
-        <w:t xml:space="preserve">uched (annotated entities were automatically propagated to other occurrences of the same entity in the text). </w:t>
-      </w:r>
-      <w:r>
-        <w:t xml:space="preserve">Consequently, </w:t>
-      </w:r>
-      <w:r>
-        <w:t>while most</w:t>
-      </w:r>
-      <w:r>
-        <w:t xml:space="preserve"> identified entities are correct, not all </w:t>
-      </w:r>
-      <w:r>
-        <w:t xml:space="preserve">relevant </w:t>
-      </w:r>
-      <w:r>
-        <w:t xml:space="preserve">entities </w:t>
-      </w:r>
-      <w:r>
-        <w:t>were</w:t>
-      </w:r>
-      <w:r>
-        <w:t xml:space="preserve"> identified, and examples of the negative class </w:t>
-      </w:r>
-      <w:r>
-        <w:t>are not reliable</w:t>
-      </w:r>
-      <w:r>
-        <w:t xml:space="preserve">. </w:t>
-      </w:r>
-      <w:r>
-        <w:t>This creates</w:t>
-      </w:r>
-      <w:r>
-        <w:t xml:space="preserve"> noisy</w:t>
-      </w:r>
-      <w:r>
-        <w:t xml:space="preserve"> training data</w:t>
-      </w:r>
-      <w:r>
-        <w:t xml:space="preserve">, which undermines the effectiveness of the BERT model’s fine-tuning. </w:t>
-      </w:r>
-      <w:r>
-        <w:t>T</w:t>
-      </w:r>
-      <w:r>
-        <w:t xml:space="preserve">raining and evaluation loss are commonly used to describe model convergence </w:t>
-      </w:r>
-      <w:r>
-        <w:t>during training</w:t>
+        <w:t>title</w:t>
       </w:r>
       <w:r>
         <w:t xml:space="preserve">, </w:t>
-      </w:r>
-      <w:r>
-        <w:t xml:space="preserve">but </w:t>
-      </w:r>
-      <w:r>
-        <w:t>because of the high ratio of O-labels relative to all other labels</w:t>
-      </w:r>
-      <w:r>
-        <w:t xml:space="preserve"> (</w:t>
-      </w:r>
-      <w:r>
-        <w:t>0.9975</w:t>
-      </w:r>
-      <w:r>
-        <w:t>%)</w:t>
-      </w:r>
-      <w:r>
-        <w:t>, loss approaches zero even if</w:t>
-      </w:r>
-      <w:r>
-        <w:t xml:space="preserve"> </w:t>
-      </w:r>
-      <w:r>
-        <w:t>entity predictions are incorrect</w:t>
-      </w:r>
-      <w:r>
-        <w:t xml:space="preserve">. </w:t>
-      </w:r>
-      <w:r>
-        <w:t xml:space="preserve">A large </w:t>
-      </w:r>
-      <w:r>
-        <w:t>language model that can reason and has access to web content may be able to rely less on training data and more on background knowledge.</w:t>
-      </w:r>
-    </w:p>
-    <w:p>
-      <w:r>
-        <w:t>A further limitation of</w:t>
-      </w:r>
-      <w:r>
-        <w:t xml:space="preserve"> BERT models </w:t>
-      </w:r>
-      <w:r>
-        <w:t xml:space="preserve">is their </w:t>
-      </w:r>
-      <w:r>
-        <w:t xml:space="preserve">context window of just 512 tokens. </w:t>
-      </w:r>
-      <w:r>
-        <w:t>Give that the</w:t>
-      </w:r>
-      <w:r>
-        <w:t xml:space="preserve"> training theses have an average word count of </w:t>
-      </w:r>
-      <w:r>
-        <w:t>more than 40 thousand</w:t>
-      </w:r>
-      <w:r>
-        <w:t xml:space="preserve">, </w:t>
-      </w:r>
-      <w:r>
-        <w:t>texts</w:t>
-      </w:r>
-      <w:r>
-        <w:t xml:space="preserve"> </w:t>
-      </w:r>
-      <w:r>
-        <w:t xml:space="preserve">need to be split </w:t>
-      </w:r>
-      <w:r>
-        <w:t xml:space="preserve">into </w:t>
-      </w:r>
-      <w:r>
-        <w:t xml:space="preserve">smaller </w:t>
-      </w:r>
-      <w:r>
-        <w:t>sequences</w:t>
-      </w:r>
-      <w:r>
-        <w:t xml:space="preserve">. While this is a reasonable </w:t>
-      </w:r>
-      <w:r>
-        <w:t>approach</w:t>
-      </w:r>
-      <w:r>
-        <w:t xml:space="preserve"> for training</w:t>
-      </w:r>
-      <w:r>
-        <w:t xml:space="preserve"> for sentence-level learning</w:t>
-      </w:r>
-      <w:r>
-        <w:t xml:space="preserve">, it </w:t>
-      </w:r>
-      <w:r>
-        <w:t xml:space="preserve">limits </w:t>
-      </w:r>
-      <w:r>
-        <w:t xml:space="preserve">the opportunity for document-level learning. </w:t>
-      </w:r>
-      <w:r>
-        <w:t>Gemini models can have</w:t>
-      </w:r>
-      <w:r>
-        <w:t xml:space="preserve"> context </w:t>
-      </w:r>
-      <w:r>
-        <w:t>windows of more than a million tokens</w:t>
-      </w:r>
-      <w:r>
-        <w:t xml:space="preserve">, </w:t>
-      </w:r>
-      <w:r>
-        <w:t xml:space="preserve">allowing </w:t>
-      </w:r>
-      <w:r>
-        <w:t>them</w:t>
-      </w:r>
-      <w:r>
-        <w:t xml:space="preserve"> to </w:t>
-      </w:r>
-      <w:r>
-        <w:t>process</w:t>
-      </w:r>
-      <w:r>
-        <w:t xml:space="preserve"> entire </w:t>
-      </w:r>
-      <w:r>
-        <w:t>theses</w:t>
-      </w:r>
-      <w:r>
-        <w:t xml:space="preserve">. This allows </w:t>
-      </w:r>
-      <w:r>
-        <w:t>them</w:t>
-      </w:r>
-      <w:r>
-        <w:t xml:space="preserve"> to benefit from document-level patterns such as </w:t>
-      </w:r>
-      <w:r>
-        <w:t xml:space="preserve">that the </w:t>
       </w:r>
       <w:r>
         <w:rPr>
           <w:i/>
           <w:iCs/>
         </w:rPr>
-        <w:t>Title</w:t>
-      </w:r>
-      <w:r>
-        <w:t xml:space="preserve"> an</w:t>
-      </w:r>
-      <w:r>
-        <w:t xml:space="preserve">d </w:t>
+        <w:t>author</w:t>
+      </w:r>
+      <w:r>
+        <w:t xml:space="preserve">, and </w:t>
       </w:r>
       <w:r>
         <w:rPr>
           <w:i/>
           <w:iCs/>
         </w:rPr>
+        <w:t>issued</w:t>
+      </w:r>
+      <w:r>
+        <w:t xml:space="preserve"> – can be unambiguously determined; they are not subject to interpretation. Where </w:t>
+      </w:r>
+      <w:r>
+        <w:t>disagreement</w:t>
+      </w:r>
+      <w:r>
+        <w:t xml:space="preserve"> </w:t>
+      </w:r>
+      <w:r>
+        <w:t xml:space="preserve">may </w:t>
+      </w:r>
+      <w:r>
+        <w:t xml:space="preserve">exist among </w:t>
+      </w:r>
+      <w:r>
+        <w:t>human annotators, it can be attributed to unclear guidelines for uncommon</w:t>
+      </w:r>
+      <w:r>
+        <w:t xml:space="preserve"> </w:t>
+      </w:r>
+      <w:r>
+        <w:t>situations (ex. how to label a subtitle</w:t>
+      </w:r>
+      <w:r>
+        <w:t>)</w:t>
+      </w:r>
+      <w:r>
+        <w:t xml:space="preserve"> and</w:t>
+      </w:r>
+      <w:r>
+        <w:t xml:space="preserve"> unstandardized</w:t>
+      </w:r>
+      <w:r>
+        <w:t xml:space="preserve"> level of detail (</w:t>
+      </w:r>
+      <w:r>
+        <w:t>labeling ‘</w:t>
+      </w:r>
+      <w:r>
+        <w:t xml:space="preserve">12 </w:t>
+      </w:r>
+      <w:r>
+        <w:t>N</w:t>
+      </w:r>
+      <w:r>
+        <w:t>ovember 2007</w:t>
+      </w:r>
+      <w:r>
+        <w:t>’</w:t>
+      </w:r>
+      <w:r>
+        <w:t xml:space="preserve"> instead of an </w:t>
+      </w:r>
+      <w:r>
+        <w:t>just</w:t>
+      </w:r>
+      <w:r>
+        <w:t xml:space="preserve"> </w:t>
+      </w:r>
+      <w:r>
+        <w:t>2007</w:t>
+      </w:r>
+      <w:r>
+        <w:t xml:space="preserve">). </w:t>
+      </w:r>
+      <w:r>
+        <w:t>A m</w:t>
+      </w:r>
+      <w:r>
+        <w:t xml:space="preserve">odel evaluated </w:t>
+      </w:r>
+      <w:r>
+        <w:t xml:space="preserve">that performs this Named Entity Extraction task does not need to understand document-level relationships, </w:t>
+      </w:r>
+      <w:r>
+        <w:t xml:space="preserve">just spot and categorize entities. </w:t>
+      </w:r>
+      <w:r>
+        <w:t>However, the evaluation of such a model is complicated by n</w:t>
+      </w:r>
+      <w:r>
+        <w:t xml:space="preserve">oise </w:t>
+      </w:r>
+      <w:r>
+        <w:t>from</w:t>
+      </w:r>
+      <w:r>
+        <w:t xml:space="preserve"> characters that were incorrectly interpreted by the OCR software. Since these born-analogue documents almost always have a predicable title page(s) with this exact information, the task of extracting </w:t>
+      </w:r>
+      <w:r>
+        <w:t>the objective labels from</w:t>
+      </w:r>
+      <w:r>
+        <w:t xml:space="preserve"> can </w:t>
+      </w:r>
+      <w:r>
+        <w:t xml:space="preserve">also </w:t>
+      </w:r>
+      <w:r>
+        <w:t>be called Key Information Extraction (KIE), which unlocks a toolbox of document-understanding models, some of them vision-based which bypass the OCR step.</w:t>
+      </w:r>
+    </w:p>
+    <w:p>
+      <w:r>
+        <w:t>[Here goes the requirements of the subjective task].</w:t>
+      </w:r>
+    </w:p>
+    <w:tbl>
+      <w:tblPr>
+        <w:tblStyle w:val="TableGrid"/>
+        <w:tblW w:w="0" w:type="auto"/>
+        <w:tblLook w:val="04A0" w:firstRow="1" w:lastRow="0" w:firstColumn="1" w:lastColumn="0" w:noHBand="0" w:noVBand="1"/>
+      </w:tblPr>
+      <w:tblGrid>
+        <w:gridCol w:w="2408"/>
+        <w:gridCol w:w="2312"/>
+        <w:gridCol w:w="2090"/>
+        <w:gridCol w:w="2540"/>
+      </w:tblGrid>
+      <w:tr>
+        <w:tc>
+          <w:tcPr>
+            <w:tcW w:w="2408" w:type="dxa"/>
+          </w:tcPr>
+          <w:p>
+            <w:r>
+              <w:t>Type</w:t>
+            </w:r>
+          </w:p>
+        </w:tc>
+        <w:tc>
+          <w:tcPr>
+            <w:tcW w:w="2312" w:type="dxa"/>
+          </w:tcPr>
+          <w:p>
+            <w:r>
+              <w:t>Labels</w:t>
+            </w:r>
+          </w:p>
+        </w:tc>
+        <w:tc>
+          <w:tcPr>
+            <w:tcW w:w="2090" w:type="dxa"/>
+          </w:tcPr>
+          <w:p>
+            <w:r>
+              <w:t>Task name</w:t>
+            </w:r>
+          </w:p>
+        </w:tc>
+        <w:tc>
+          <w:tcPr>
+            <w:tcW w:w="2540" w:type="dxa"/>
+          </w:tcPr>
+          <w:p>
+            <w:r>
+              <w:t>Model requirements</w:t>
+            </w:r>
+          </w:p>
+        </w:tc>
+      </w:tr>
+      <w:tr>
+        <w:tc>
+          <w:tcPr>
+            <w:tcW w:w="2408" w:type="dxa"/>
+          </w:tcPr>
+          <w:p>
+            <w:pPr>
+              <w:jc w:val="left"/>
+            </w:pPr>
+            <w:r>
+              <w:t>Objective</w:t>
+            </w:r>
+          </w:p>
+        </w:tc>
+        <w:tc>
+          <w:tcPr>
+            <w:tcW w:w="2312" w:type="dxa"/>
+          </w:tcPr>
+          <w:p>
+            <w:pPr>
+              <w:jc w:val="left"/>
+            </w:pPr>
+            <w:r>
+              <w:t>Title</w:t>
+            </w:r>
+          </w:p>
+          <w:p>
+            <w:pPr>
+              <w:jc w:val="left"/>
+            </w:pPr>
+            <w:r>
+              <w:t>Author</w:t>
+            </w:r>
+          </w:p>
+          <w:p>
+            <w:pPr>
+              <w:jc w:val="left"/>
+            </w:pPr>
+            <w:r>
+              <w:t>Issued</w:t>
+            </w:r>
+          </w:p>
+        </w:tc>
+        <w:tc>
+          <w:tcPr>
+            <w:tcW w:w="2090" w:type="dxa"/>
+          </w:tcPr>
+          <w:p>
+            <w:pPr>
+              <w:jc w:val="left"/>
+            </w:pPr>
+            <w:r>
+              <w:t>Key Information Extraction (KEI)/Named Entity Recognition (NER)</w:t>
+            </w:r>
+          </w:p>
+        </w:tc>
+        <w:tc>
+          <w:tcPr>
+            <w:tcW w:w="2540" w:type="dxa"/>
+          </w:tcPr>
+          <w:p>
+            <w:pPr>
+              <w:jc w:val="left"/>
+            </w:pPr>
+          </w:p>
+        </w:tc>
+      </w:tr>
+      <w:tr>
+        <w:tc>
+          <w:tcPr>
+            <w:tcW w:w="2408" w:type="dxa"/>
+          </w:tcPr>
+          <w:p>
+            <w:pPr>
+              <w:jc w:val="left"/>
+            </w:pPr>
+            <w:r>
+              <w:t>Subjective</w:t>
+            </w:r>
+          </w:p>
+        </w:tc>
+        <w:tc>
+          <w:tcPr>
+            <w:tcW w:w="2312" w:type="dxa"/>
+          </w:tcPr>
+          <w:p>
+            <w:pPr>
+              <w:jc w:val="left"/>
+            </w:pPr>
+            <w:r>
+              <w:t>Spatial</w:t>
+            </w:r>
+          </w:p>
+          <w:p>
+            <w:pPr>
+              <w:jc w:val="left"/>
+            </w:pPr>
+            <w:r>
+              <w:t>Subject</w:t>
+            </w:r>
+          </w:p>
+          <w:p>
+            <w:pPr>
+              <w:jc w:val="left"/>
+            </w:pPr>
+            <w:r>
+              <w:t>InGroup</w:t>
+            </w:r>
+          </w:p>
+        </w:tc>
+        <w:tc>
+          <w:tcPr>
+            <w:tcW w:w="2090" w:type="dxa"/>
+          </w:tcPr>
+          <w:p>
+            <w:pPr>
+              <w:jc w:val="left"/>
+            </w:pPr>
+          </w:p>
+        </w:tc>
+        <w:tc>
+          <w:tcPr>
+            <w:tcW w:w="2540" w:type="dxa"/>
+          </w:tcPr>
+          <w:p>
+            <w:pPr>
+              <w:jc w:val="left"/>
+            </w:pPr>
+          </w:p>
+        </w:tc>
+      </w:tr>
+    </w:tbl>
+    <w:p/>
+    <w:p>
+      <w:pPr>
+        <w:rPr>
+          <w:b/>
+          <w:bCs/>
+        </w:rPr>
+      </w:pPr>
+    </w:p>
+    <w:p>
+      <w:pPr>
+        <w:rPr>
+          <w:b/>
+          <w:bCs/>
+        </w:rPr>
+      </w:pPr>
+      <w:r>
+        <w:rPr>
+          <w:b/>
+          <w:bCs/>
+        </w:rPr>
+        <w:t>Ground-truth data</w:t>
+      </w:r>
+    </w:p>
+    <w:p>
+      <w:r>
+        <w:t xml:space="preserve">It is tempting to use the manual annotations as the ground-truth data to which model predictions can be compared, but this __ the assumptions that. </w:t>
+      </w:r>
+    </w:p>
+    <w:p>
+      <w:r>
+        <w:t xml:space="preserve">As an example, </w:t>
+      </w:r>
+      <w:r>
+        <w:rPr>
+          <w:highlight w:val="yellow"/>
+        </w:rPr>
+        <w:t>Figure x shows</w:t>
+      </w:r>
+      <w:r>
+        <w:t xml:space="preserve"> the title page of a 1971 thesis as it was scanned, and as it was converted to text by OCR software and manually annotated. </w:t>
+      </w:r>
+      <w:r>
+        <w:t>Labels extracted from this text are:</w:t>
+      </w:r>
+    </w:p>
+    <w:p>
+      <w:pPr>
+        <w:ind w:firstLine="720"/>
+        <w:rPr>
+          <w:lang w:val="nl-NL"/>
+        </w:rPr>
+      </w:pPr>
+      <w:r>
+        <w:rPr>
+          <w:b/>
+          <w:bCs/>
+          <w:lang w:val="nl-NL"/>
+        </w:rPr>
+        <w:lastRenderedPageBreak/>
+        <w:t>Title</w:t>
+      </w:r>
+      <w:r>
+        <w:rPr>
+          <w:lang w:val="nl-NL"/>
+        </w:rPr>
+        <w:t xml:space="preserve">: </w:t>
+      </w:r>
+      <w:r>
+        <w:rPr>
+          <w:lang w:val="nl-NL"/>
+        </w:rPr>
+        <w:t xml:space="preserve">ONTWIKKELINGEN IN DE INDUSTRIËLE STRUCTUUR VAN ZUID - WEST - NEDERLAND </w:t>
+      </w:r>
+      <w:r>
+        <w:rPr>
+          <w:lang w:val="nl-NL"/>
+        </w:rPr>
+        <w:t>`</w:t>
+      </w:r>
+      <w:r>
+        <w:rPr>
+          <w:lang w:val="nl-NL"/>
+        </w:rPr>
+        <w:tab/>
+      </w:r>
+      <w:r>
+        <w:rPr>
+          <w:lang w:val="nl-NL"/>
+        </w:rPr>
+        <w:t>1945 - 19 7 0</w:t>
+      </w:r>
+      <w:r>
+        <w:rPr>
+          <w:lang w:val="nl-NL"/>
+        </w:rPr>
+        <w:t xml:space="preserve">   </w:t>
+      </w:r>
+    </w:p>
+    <w:p>
+      <w:pPr>
+        <w:ind w:firstLine="720"/>
+      </w:pPr>
+      <w:r>
+        <w:rPr>
+          <w:b/>
+          <w:bCs/>
+        </w:rPr>
         <w:t>Author</w:t>
       </w:r>
       <w:r>
-        <w:t xml:space="preserve"> are always found near the beginning of a </w:t>
-      </w:r>
-      <w:r>
-        <w:t>document</w:t>
-      </w:r>
-      <w:r>
-        <w:t xml:space="preserve">, and that the </w:t>
+        <w:t>:</w:t>
+      </w:r>
+      <w:r>
+        <w:t xml:space="preserve"> </w:t>
+      </w:r>
+      <w:r>
+        <w:t>F*</w:t>
+      </w:r>
+      <w:r>
+        <w:t>Abcouwer</w:t>
+      </w:r>
+    </w:p>
+    <w:p>
+      <w:pPr>
+        <w:ind w:firstLine="720"/>
+      </w:pPr>
+      <w:r>
+        <w:rPr>
+          <w:b/>
+          <w:bCs/>
+        </w:rPr>
+        <w:t>Issued</w:t>
+      </w:r>
+      <w:r>
+        <w:t>: february 1971</w:t>
+      </w:r>
+    </w:p>
+    <w:p>
+      <w:r>
+        <w:t>A human annotator could easily see that that these are small character recognition mistakes, but a a model evaluation procedure which is based on string similarity would not.</w:t>
+      </w:r>
+    </w:p>
+    <w:tbl>
+      <w:tblPr>
+        <w:tblStyle w:val="TableGrid"/>
+        <w:tblW w:w="0" w:type="auto"/>
+        <w:tblLook w:val="04A0" w:firstRow="1" w:lastRow="0" w:firstColumn="1" w:lastColumn="0" w:noHBand="0" w:noVBand="1"/>
+      </w:tblPr>
+      <w:tblGrid>
+        <w:gridCol w:w="6426"/>
+        <w:gridCol w:w="2924"/>
+      </w:tblGrid>
+      <w:tr>
+        <w:tc>
+          <w:tcPr>
+            <w:tcW w:w="4675" w:type="dxa"/>
+          </w:tcPr>
+          <w:p>
+            <w:r>
+              <w:drawing>
+                <wp:inline distT="0" distB="0" distL="0" distR="0" wp14:anchorId="20DB7DE7" wp14:editId="1F79CB41">
+                  <wp:extent cx="3943553" cy="5105662"/>
+                  <wp:effectExtent l="0" t="0" r="0" b="0"/>
+                  <wp:docPr id="1952162018" name="Picture 1"/>
+                  <wp:cNvGraphicFramePr>
+                    <a:graphicFrameLocks xmlns:a="http://schemas.openxmlformats.org/drawingml/2006/main" noChangeAspect="1"/>
+                  </wp:cNvGraphicFramePr>
+                  <a:graphic xmlns:a="http://schemas.openxmlformats.org/drawingml/2006/main">
+                    <a:graphicData uri="http://schemas.openxmlformats.org/drawingml/2006/picture">
+                      <pic:pic xmlns:pic="http://schemas.openxmlformats.org/drawingml/2006/picture">
+                        <pic:nvPicPr>
+                          <pic:cNvPr id="1952162018" name=""/>
+                          <pic:cNvPicPr/>
+                        </pic:nvPicPr>
+                        <pic:blipFill>
+                          <a:blip r:embed="rId8"/>
+                          <a:stretch>
+                            <a:fillRect/>
+                          </a:stretch>
+                        </pic:blipFill>
+                        <pic:spPr>
+                          <a:xfrm>
+                            <a:off x="0" y="0"/>
+                            <a:ext cx="3943553" cy="5105662"/>
+                          </a:xfrm>
+                          <a:prstGeom prst="rect">
+                            <a:avLst/>
+                          </a:prstGeom>
+                        </pic:spPr>
+                      </pic:pic>
+                    </a:graphicData>
+                  </a:graphic>
+                </wp:inline>
+              </w:drawing>
+            </w:r>
+          </w:p>
+        </w:tc>
+        <w:tc>
+          <w:tcPr>
+            <w:tcW w:w="4675" w:type="dxa"/>
+          </w:tcPr>
+          <w:p>
+            <w:pPr>
+              <w:spacing w:after="0" w:line="240" w:lineRule="auto"/>
+              <w:rPr>
+                <w:lang w:val="nl-NL"/>
+              </w:rPr>
+            </w:pPr>
+            <w:r>
+              <w:rPr>
+                <w:lang w:val="nl-NL"/>
+              </w:rPr>
+              <w:t>ONTWIKKELINGEN B-title</w:t>
+            </w:r>
+          </w:p>
+          <w:p>
+            <w:pPr>
+              <w:spacing w:after="0" w:line="240" w:lineRule="auto"/>
+              <w:rPr>
+                <w:lang w:val="nl-NL"/>
+              </w:rPr>
+            </w:pPr>
+            <w:r>
+              <w:rPr>
+                <w:lang w:val="nl-NL"/>
+              </w:rPr>
+              <w:t>IN I-title</w:t>
+            </w:r>
+          </w:p>
+          <w:p>
+            <w:pPr>
+              <w:spacing w:after="0" w:line="240" w:lineRule="auto"/>
+            </w:pPr>
+            <w:r>
+              <w:t>DE I-title</w:t>
+            </w:r>
+          </w:p>
+          <w:p>
+            <w:pPr>
+              <w:spacing w:after="0" w:line="240" w:lineRule="auto"/>
+            </w:pPr>
+            <w:r>
+              <w:t>INDUSTRIËLE I-title</w:t>
+            </w:r>
+          </w:p>
+          <w:p>
+            <w:pPr>
+              <w:spacing w:after="0" w:line="240" w:lineRule="auto"/>
+            </w:pPr>
+            <w:r>
+              <w:t>STRUCTUUR I-title</w:t>
+            </w:r>
+          </w:p>
+          <w:p>
+            <w:pPr>
+              <w:spacing w:after="0" w:line="240" w:lineRule="auto"/>
+            </w:pPr>
+            <w:r>
+              <w:t>VAN I-title</w:t>
+            </w:r>
+          </w:p>
+          <w:p>
+            <w:pPr>
+              <w:spacing w:after="0" w:line="240" w:lineRule="auto"/>
+            </w:pPr>
+            <w:r>
+              <w:t>ZUID I-title</w:t>
+            </w:r>
+          </w:p>
+          <w:p>
+            <w:pPr>
+              <w:spacing w:after="0" w:line="240" w:lineRule="auto"/>
+            </w:pPr>
+            <w:r>
+              <w:t>- I-title</w:t>
+            </w:r>
+          </w:p>
+          <w:p>
+            <w:pPr>
+              <w:spacing w:after="0" w:line="240" w:lineRule="auto"/>
+            </w:pPr>
+            <w:r>
+              <w:t>WEST I-title</w:t>
+            </w:r>
+          </w:p>
+          <w:p>
+            <w:pPr>
+              <w:spacing w:after="0" w:line="240" w:lineRule="auto"/>
+            </w:pPr>
+            <w:r>
+              <w:t>- I-title</w:t>
+            </w:r>
+          </w:p>
+          <w:p>
+            <w:pPr>
+              <w:spacing w:after="0" w:line="240" w:lineRule="auto"/>
+            </w:pPr>
+            <w:r>
+              <w:t>NEDERLAND I-title</w:t>
+            </w:r>
+          </w:p>
+          <w:p>
+            <w:pPr>
+              <w:spacing w:after="0" w:line="240" w:lineRule="auto"/>
+            </w:pPr>
+            <w:r>
+              <w:t>1945 I-title</w:t>
+            </w:r>
+          </w:p>
+          <w:p>
+            <w:pPr>
+              <w:spacing w:after="0" w:line="240" w:lineRule="auto"/>
+            </w:pPr>
+            <w:r>
+              <w:t>- I-title</w:t>
+            </w:r>
+          </w:p>
+          <w:p>
+            <w:pPr>
+              <w:spacing w:after="0" w:line="240" w:lineRule="auto"/>
+            </w:pPr>
+            <w:r>
+              <w:t>19 I-title</w:t>
+            </w:r>
+          </w:p>
+          <w:p>
+            <w:pPr>
+              <w:spacing w:after="0" w:line="240" w:lineRule="auto"/>
+            </w:pPr>
+            <w:r>
+              <w:t>7 I-title</w:t>
+            </w:r>
+          </w:p>
+          <w:p>
+            <w:pPr>
+              <w:spacing w:after="0" w:line="240" w:lineRule="auto"/>
+            </w:pPr>
+            <w:r>
+              <w:t>0 I-title</w:t>
+            </w:r>
+          </w:p>
+          <w:p>
+            <w:pPr>
+              <w:spacing w:after="0" w:line="240" w:lineRule="auto"/>
+            </w:pPr>
+            <w:r>
+              <w:t>een B-title</w:t>
+            </w:r>
+          </w:p>
+          <w:p>
+            <w:pPr>
+              <w:spacing w:after="0" w:line="240" w:lineRule="auto"/>
+            </w:pPr>
+            <w:r>
+              <w:t>sociaal-geografische I-title</w:t>
+            </w:r>
+          </w:p>
+          <w:p>
+            <w:pPr>
+              <w:spacing w:after="0" w:line="240" w:lineRule="auto"/>
+            </w:pPr>
+            <w:r>
+              <w:t>verkenning I-title</w:t>
+            </w:r>
+          </w:p>
+          <w:p>
+            <w:pPr>
+              <w:spacing w:after="0" w:line="240" w:lineRule="auto"/>
+            </w:pPr>
+            <w:r>
+              <w:t>N O</w:t>
+            </w:r>
+          </w:p>
+          <w:p>
+            <w:pPr>
+              <w:spacing w:after="0" w:line="240" w:lineRule="auto"/>
+            </w:pPr>
+            <w:r>
+              <w:t>. O</w:t>
+            </w:r>
+          </w:p>
+          <w:p>
+            <w:pPr>
+              <w:spacing w:after="0" w:line="240" w:lineRule="auto"/>
+            </w:pPr>
+          </w:p>
+          <w:p>
+            <w:pPr>
+              <w:spacing w:after="0" w:line="240" w:lineRule="auto"/>
+            </w:pPr>
+            <w:r>
+              <w:t>F B-author</w:t>
+            </w:r>
+          </w:p>
+          <w:p>
+            <w:pPr>
+              <w:spacing w:after="0" w:line="240" w:lineRule="auto"/>
+            </w:pPr>
+            <w:r>
+              <w:t>* I-author</w:t>
+            </w:r>
+          </w:p>
+          <w:p>
+            <w:pPr>
+              <w:spacing w:after="0" w:line="240" w:lineRule="auto"/>
+            </w:pPr>
+            <w:r>
+              <w:t>Abcouwer I-author</w:t>
+            </w:r>
+          </w:p>
+          <w:p>
+            <w:pPr>
+              <w:spacing w:after="0" w:line="240" w:lineRule="auto"/>
+            </w:pPr>
+            <w:r>
+              <w:t>Utrecht O</w:t>
+            </w:r>
+          </w:p>
+          <w:p>
+            <w:pPr>
+              <w:spacing w:after="0" w:line="240" w:lineRule="auto"/>
+            </w:pPr>
+            <w:r>
+              <w:t>, O</w:t>
+            </w:r>
+          </w:p>
+          <w:p>
+            <w:pPr>
+              <w:spacing w:after="0" w:line="240" w:lineRule="auto"/>
+            </w:pPr>
+            <w:r>
+              <w:t>februari B-issued</w:t>
+            </w:r>
+          </w:p>
+          <w:p>
+            <w:r>
+              <w:t>1971 I-issued</w:t>
+            </w:r>
+          </w:p>
+        </w:tc>
+      </w:tr>
+    </w:tbl>
+    <w:p/>
+    <w:p/>
+    <w:p/>
+    <w:p>
+      <w:pPr>
+        <w:rPr>
+          <w:b/>
+          <w:bCs/>
+        </w:rPr>
+      </w:pPr>
+    </w:p>
+    <w:p>
+      <w:pPr>
+        <w:pStyle w:val="Heading2"/>
+      </w:pPr>
+      <w:r>
+        <w:lastRenderedPageBreak/>
+        <w:t>Methodology</w:t>
+      </w:r>
+    </w:p>
+    <w:p>
+      <w:pPr>
+        <w:pStyle w:val="Heading3"/>
+      </w:pPr>
+      <w:r>
+        <w:t>Objective labels</w:t>
+      </w:r>
+    </w:p>
+    <w:p>
+      <w:pPr>
+        <w:spacing w:line="276" w:lineRule="auto"/>
+      </w:pPr>
+      <w:r>
+        <w:t>For the extraction of objective labels, a</w:t>
+      </w:r>
+      <w:r>
+        <w:t xml:space="preserve"> preliminary experiment compared two model types: </w:t>
+      </w:r>
+      <w:r>
+        <w:rPr>
+          <w:b/>
+          <w:bCs/>
+        </w:rPr>
+        <w:t>BERT</w:t>
+      </w:r>
+      <w:r>
+        <w:t xml:space="preserve"> (Bidirectional Encoder model from Transformers), a </w:t>
+      </w:r>
+      <w:r>
+        <w:t xml:space="preserve">pretrained </w:t>
+      </w:r>
+      <w:r>
+        <w:t xml:space="preserve">NLP model commonly used for </w:t>
+      </w:r>
+      <w:r>
+        <w:t>sequence labeling tasks</w:t>
+      </w:r>
+      <w:r>
+        <w:t xml:space="preserve">, and </w:t>
+      </w:r>
+      <w:r>
+        <w:rPr>
+          <w:b/>
+          <w:bCs/>
+        </w:rPr>
+        <w:t>Gemini</w:t>
+      </w:r>
+      <w:r>
+        <w:t xml:space="preserve">, a </w:t>
+      </w:r>
+      <w:commentRangeStart w:id="0"/>
+      <w:r>
+        <w:t xml:space="preserve">general-purpose generative AI model developed by Google. The models were evaluated on their performance in the </w:t>
+      </w:r>
+      <w:r>
+        <w:rPr>
+          <w:highlight w:val="yellow"/>
+        </w:rPr>
+        <w:t>NER</w:t>
+      </w:r>
+      <w:r>
+        <w:t xml:space="preserve"> task, using the same labeling scheme and rules that were used by the human annotators.</w:t>
+      </w:r>
+      <w:r>
+        <w:t xml:space="preserve"> </w:t>
+      </w:r>
+      <w:commentRangeEnd w:id="0"/>
+      <w:r>
+        <w:rPr>
+          <w:rStyle w:val="CommentReference"/>
+        </w:rPr>
+        <w:commentReference w:id="0"/>
+      </w:r>
+    </w:p>
+    <w:p>
+      <w:r>
+        <w:t xml:space="preserve">To enable comparison between </w:t>
+      </w:r>
+      <w:r>
+        <w:t xml:space="preserve">the models on the KEI task, we limited the inputs to sections where the key information was likeliest to be found. For the BERT model, the text of each thesis was reduced to the first 1,000 words that have more than one character. </w:t>
+      </w:r>
+      <w:r>
+        <w:t xml:space="preserve">This was done </w:t>
+      </w:r>
+      <w:r>
+        <w:t xml:space="preserve">because </w:t>
+      </w:r>
+      <w:r>
+        <w:t xml:space="preserve">sometimes the OCR can create hundreds of </w:t>
+      </w:r>
+      <w:r>
+        <w:t>one-character words</w:t>
+      </w:r>
+      <w:r>
+        <w:t xml:space="preserve"> out of, for example, a </w:t>
+      </w:r>
+      <w:r>
+        <w:t>decorative</w:t>
+      </w:r>
+      <w:r>
+        <w:t xml:space="preserve"> </w:t>
+      </w:r>
+      <w:r>
+        <w:t xml:space="preserve">dividing </w:t>
+      </w:r>
+      <w:r>
+        <w:t>line made of dashes.</w:t>
+      </w:r>
+      <w:r>
+        <w:t xml:space="preserve"> PDF documents of each thesis were reduced to the first three pages, which are always title pages. Each of the resulting text and PDF documents were manually checked to ensure that they contained the three objective labels. Automating the reduction of inputs to where the key information was located both improved the processing time and made it scalable to the entire archive for future inference.</w:t>
+      </w:r>
+    </w:p>
+    <w:p>
+      <w:r>
+        <w:t>During development, b</w:t>
+      </w:r>
+      <w:commentRangeStart w:id="1"/>
+      <w:r>
+        <w:t xml:space="preserve">oth models were evaluated using a </w:t>
+      </w:r>
+      <w:r>
+        <w:t xml:space="preserve">K-Fold cross-validation strategy with K=5.  </w:t>
+      </w:r>
+      <w:commentRangeEnd w:id="1"/>
+      <w:r>
+        <w:rPr>
+          <w:rStyle w:val="CommentReference"/>
+        </w:rPr>
+        <w:commentReference w:id="1"/>
+      </w:r>
+      <w:r>
+        <w:t>At each fold, 80% of the data was used for training and 20% for evaluation. The F1 score of best-performing epoch was saved, and the result of the folds were averaged together to determine the overall success of the model. In addition, the annotated theses were dividing into folds using</w:t>
+      </w:r>
+      <w:r>
+        <w:t xml:space="preserve"> </w:t>
+      </w:r>
+      <w:r>
+        <w:t xml:space="preserve">a </w:t>
+      </w:r>
+      <w:r>
+        <w:t>document-level splitting strategy</w:t>
+      </w:r>
+      <w:r>
+        <w:t xml:space="preserve">. </w:t>
+      </w:r>
+      <w:r>
+        <w:t>This approach was chosen over random sequence-level splitting chiefly to reflect real-world document processing and achieve a relatively balanced distribution of label types between training and validation</w:t>
+      </w:r>
+      <w:r>
+        <w:t>, effectively serving as a stratified K-fold cross-validating strategy</w:t>
+      </w:r>
+      <w:r>
+        <w:rPr>
+          <w:highlight w:val="yellow"/>
+        </w:rPr>
+        <w:t xml:space="preserve">. </w:t>
+      </w:r>
+      <w:r>
+        <w:rPr>
+          <w:highlight w:val="yellow"/>
+        </w:rPr>
+        <w:t xml:space="preserve"> </w:t>
+      </w:r>
+      <w:commentRangeStart w:id="2"/>
+      <w:r>
+        <w:rPr>
+          <w:highlight w:val="yellow"/>
+        </w:rPr>
+        <w:t>Using</w:t>
+      </w:r>
+      <w:commentRangeEnd w:id="2"/>
+      <w:r>
+        <w:rPr>
+          <w:rStyle w:val="CommentReference"/>
+        </w:rPr>
+        <w:commentReference w:id="2"/>
+      </w:r>
+      <w:r>
+        <w:rPr>
+          <w:highlight w:val="yellow"/>
+        </w:rPr>
+        <w:t xml:space="preserve"> the same training and validation data also enables a fair comparison between the different types of models.</w:t>
+      </w:r>
+      <w:r>
+        <w:t xml:space="preserve">    </w:t>
+      </w:r>
+    </w:p>
+    <w:p/>
+    <w:p/>
+    <w:p>
+      <w:pPr>
+        <w:spacing w:line="276" w:lineRule="auto"/>
+      </w:pPr>
+      <w:r>
+        <w:t xml:space="preserve">BERT is pre-trained on large language corpora to understand context using bidirectional masked language modeling and next-sentence prediction </w:t>
+      </w:r>
+      <w:r>
+        <w:fldChar w:fldCharType="begin"/>
+      </w:r>
+      <w:r>
+        <w:instrText xml:space="preserve"> ADDIN ZOTERO_ITEM CSL_CITATION {"citationID":"mToimSpd","properties":{"formattedCitation":"(Devlin et al., 2019)","plainCitation":"(Devlin et al., 2019)","noteIndex":0},"citationItems":[{"id":1982,"uris":["http://zotero.org/users/11765017/items/W24K7F7Q"],"itemData":{"id":1982,"type":"paper-conference","container-title":"Proceedings of the 2019 Conference of the North American Chapter of the Association for Computational Linguistics: Human Language Technologies, Volume 1 (Long and Short Papers)","DOI":"10.18653/v1/N19-1423","event-place":"Minneapolis, Minnesota","event-title":"2019 Conference of the North American Chapter of the Association for Computational Linguistics: Human Language Technologies","language":"en","page":"4171-4186","publisher":"Association for Computational Linguistics","publisher-place":"Minneapolis, Minnesota","source":"DOI.org (Crossref)","title":"BERT: Pre-training of Deep Bidirectional Transformers for Language Understanding","URL":"http://aclweb.org/anthology/N19-1423","author":[{"family":"Devlin","given":"Jacob"},{"family":"Chang","given":"Ming-Wei"},{"family":"Lee","given":"Kenton"},{"family":"Toutanova","given":"Kristina"}],"accessed":{"date-parts":[["2026",1,25]]},"issued":{"date-parts":[["2019"]]}}}],"schema":"https://github.com/citation-style-language/schema/raw/master/csl-citation.json"} </w:instrText>
+      </w:r>
+      <w:r>
+        <w:fldChar w:fldCharType="separate"/>
+      </w:r>
+      <w:r>
+        <w:rPr>
+          <w:rFonts w:ascii="Aptos" w:hAnsi="Aptos"/>
+        </w:rPr>
+        <w:t>(Devlin et al., 2019)</w:t>
+      </w:r>
+      <w:r>
+        <w:fldChar w:fldCharType="end"/>
+      </w:r>
+      <w:r>
+        <w:t xml:space="preserve">. Through transfer learning, it can be fine-tuned on annotated training data for specific NLP tasks. This study used BERTje, a monolingual Dutch BERT model with a token-level classification head for sequence labeling tasks </w:t>
+      </w:r>
+      <w:r>
+        <w:fldChar w:fldCharType="begin"/>
+      </w:r>
+      <w:r>
+        <w:instrText xml:space="preserve"> ADDIN ZOTERO_ITEM CSL_CITATION {"citationID":"tEsXJ6ev","properties":{"formattedCitation":"(Vries et al., 2019)","plainCitation":"(Vries et al., 2019)","noteIndex":0},"citationItems":[{"id":1984,"uris":["http://zotero.org/users/11765017/items/CY3LEHHL"],"itemData":{"id":1984,"type":"article","abstract":"The transformer-based pre-trained language model BERT has helped to improve state-of-the-art performance on many natural language processing (NLP) tasks. Using the same architecture and parameters, we developed and evaluated a monolingual Dutch BERT model called BERTje. Compared to the multilingual BERT model, which includes Dutch but is only based on Wikipedia text, BERTje is based on a large and diverse dataset of 2.4 billion tokens. BERTje consistently outperforms the equally-sized multilingual BERT model on downstream NLP tasks (part-of-speech tagging, named-entity recognition, semantic role labeling, and sentiment analysis). Our pre-trained Dutch BERT model is made available at https://github.com/wietsedv/bertje.","DOI":"10.48550/arXiv.1912.09582","note":"arXiv:1912.09582 [cs]","number":"arXiv:1912.09582","publisher":"arXiv","source":"arXiv.org","title":"BERTje: A Dutch BERT Model","title-short":"BERTje","URL":"http://arxiv.org/abs/1912.09582","author":[{"family":"Vries","given":"Wietse","dropping-particle":"de"},{"family":"Cranenburgh","given":"Andreas","dropping-particle":"van"},{"family":"Bisazza","given":"Arianna"},{"family":"Caselli","given":"Tommaso"},{"family":"Noord","given":"Gertjan","dropping-particle":"van"},{"family":"Nissim","given":"Malvina"}],"accessed":{"date-parts":[["2026",1,25]]},"issued":{"date-parts":[["2019",12,19]]}}}],"schema":"https://github.com/citation-style-language/schema/raw/master/csl-citation.json"} </w:instrText>
+      </w:r>
+      <w:r>
+        <w:fldChar w:fldCharType="separate"/>
+      </w:r>
+      <w:r>
+        <w:rPr>
+          <w:rFonts w:ascii="Aptos" w:hAnsi="Aptos"/>
+        </w:rPr>
+        <w:t>(Vries et al., 2019)</w:t>
+      </w:r>
+      <w:r>
+        <w:fldChar w:fldCharType="end"/>
+      </w:r>
+      <w:r>
+        <w:t>.</w:t>
+      </w:r>
+    </w:p>
+    <w:p>
+      <w:pPr>
+        <w:spacing w:line="276" w:lineRule="auto"/>
+      </w:pPr>
+      <w:r>
+        <w:t>The BERTje checkpoint</w:t>
+      </w:r>
+      <w:r>
+        <w:rPr>
+          <w:rStyle w:val="FootnoteReference"/>
+        </w:rPr>
+        <w:footnoteReference w:id="1"/>
+      </w:r>
+      <w:r>
+        <w:t xml:space="preserve"> was fine-tuned on two versions of the training dataset to assess the effect of label sample size. The original BIO labeling scheme resulted in 13 possible labels, leading to a small sample size for per class. To avoid this, the documents were re-labeled with an IO (inside-outside) </w:t>
+      </w:r>
+      <w:r>
+        <w:lastRenderedPageBreak/>
+        <w:t xml:space="preserve">scheme. This reduced the number of labels, increased the sample size of each, and made explicit that that tokens that were previously labeled with B or I and the same label type are semantically related. </w:t>
+      </w:r>
+    </w:p>
+    <w:p/>
+    <w:p>
+      <w:pPr>
+        <w:rPr>
+          <w:u w:val="single"/>
+        </w:rPr>
+      </w:pPr>
+      <w:r>
+        <w:rPr>
+          <w:u w:val="single"/>
+        </w:rPr>
+        <w:t xml:space="preserve">Gemini Model </w:t>
+      </w:r>
+    </w:p>
+    <w:p>
+      <w:r>
+        <w:t xml:space="preserve">Gemini 3 Flash is </w:t>
+      </w:r>
+      <w:r>
+        <w:t>the latest</w:t>
+      </w:r>
+      <w:r>
+        <w:t xml:space="preserve"> </w:t>
+      </w:r>
+      <w:r>
+        <w:t xml:space="preserve">Multimodal Large Language Model (MLLM) by Google, and is built upon transformer architecture. It is </w:t>
+      </w:r>
+      <w:r>
+        <w:t>intended</w:t>
+      </w:r>
+      <w:r>
+        <w:t xml:space="preserve"> to handle inputs from multiple modalities such as text, image, and documents, and integrate them through specialized attention mechanisms. This model was selected because it scored the highest in the KEI task on the I</w:t>
+      </w:r>
+      <w:r>
+        <w:t>ntelligent Document Processing (IDP) Leaderboard</w:t>
+      </w:r>
+      <w:r>
+        <w:t xml:space="preserve">, an evaluation framework for assessing the capabilities of models in document understanding tasks. Among commercial MLLM models, it is also the latest offering with a </w:t>
+      </w:r>
+      <w:r>
+        <w:t>free tier.</w:t>
+      </w:r>
+    </w:p>
+    <w:p>
+      <w:r>
+        <w:t>Two different iterations of the model were tested with different prompts, which correspond to zero-shot and fine-tuned prompting strategies. In the zero-shot run, the model was provided with a short prompt and a PDF document from which to extract key information. The results were evaluated according to the strategy described in the previous section, and the results of all models were averaged. In the fine-tuned run, the K-Fold cross-validation strategy was implemented by providing the model with a short text prompt 20 examples, each of which consisted of a three-page PDF and its corresponding labels.</w:t>
+      </w:r>
+    </w:p>
+    <w:p>
+      <w:r>
+        <w:t>Two different iterations of the model were tested with different prompts, which correspond to a few-shot and a zero-shot run. In the few-shot run, the model was provided with instructions, annotation rules, two examples of labeled texts, and an unlabeled thesis to annotate. Only two training examples could be provided (instead of 16 like in the BERT model) because of the model’s limit on 250,000 input tokens per minute on the free tier. The training examples were randomly chosen for each run. The annotation rules were taken from the same annotation guide used by the human annotators. In the zero-shot run, the same prompt was used, but examples were not provided. English-language prompts were created based on the prompt engineering recommendations</w:t>
+      </w:r>
+      <w:r>
+        <w:rPr>
+          <w:rStyle w:val="FootnoteReference"/>
+        </w:rPr>
+        <w:footnoteReference w:id="2"/>
+      </w:r>
+      <w:r>
+        <w:t xml:space="preserve"> suggested by Google, and a few different versions were tested to find the best-performing prompt. The prompts used are shown in the appendix.  </w:t>
+      </w:r>
+    </w:p>
+    <w:p>
+      <w:r>
+        <w:t xml:space="preserve">The following boxplots show the distribution of recall, precision, F1, and </w:t>
+      </w:r>
+      <w:r>
+        <w:t>Jaccard index</w:t>
+      </w:r>
+      <w:r>
+        <w:t xml:space="preserve"> when the models were applied to the four validation theses. (Please note that I don’t think that all of these boxplots should be presented in the thesis, perhaps just the means, but I wanted to show the differences in results between the four thesis).</w:t>
+      </w:r>
+    </w:p>
+    <w:p/>
+    <w:p/>
+    <w:p>
+      <w:pPr>
+        <w:pStyle w:val="Heading3"/>
+      </w:pPr>
+      <w:r>
+        <w:lastRenderedPageBreak/>
+        <w:t>Subjective labels</w:t>
+      </w:r>
+    </w:p>
+    <w:p>
+      <w:pPr>
+        <w:spacing w:line="276" w:lineRule="auto"/>
+      </w:pPr>
+    </w:p>
+    <w:p>
+      <w:pPr>
+        <w:spacing w:line="276" w:lineRule="auto"/>
+      </w:pPr>
+    </w:p>
+    <w:p>
+      <w:pPr>
+        <w:spacing w:line="276" w:lineRule="auto"/>
+      </w:pPr>
+    </w:p>
+    <w:p>
+      <w:pPr>
+        <w:spacing w:line="276" w:lineRule="auto"/>
+      </w:pPr>
+    </w:p>
+    <w:p>
+      <w:pPr>
+        <w:pStyle w:val="Heading2"/>
+      </w:pPr>
+      <w:r>
+        <w:t>Model evaluation</w:t>
+      </w:r>
+    </w:p>
+    <w:p>
+      <w:pPr>
+        <w:spacing w:line="276" w:lineRule="auto"/>
+      </w:pPr>
+      <w:r>
+        <w:t xml:space="preserve">A custom evaluation methodology was developed </w:t>
+      </w:r>
+      <w:r>
+        <w:t>to</w:t>
+      </w:r>
+      <w:r>
+        <w:t xml:space="preserve"> compare the </w:t>
+      </w:r>
+      <w:r>
+        <w:t>effectiveness</w:t>
+      </w:r>
+      <w:r>
+        <w:t xml:space="preserve"> of the models</w:t>
+      </w:r>
+      <w:r>
+        <w:t xml:space="preserve"> in </w:t>
+      </w:r>
+      <w:r>
+        <w:t>extracting entities</w:t>
+      </w:r>
+      <w:r>
+        <w:t xml:space="preserve">, </w:t>
+      </w:r>
+      <w:r>
+        <w:t xml:space="preserve">with a focus their applicability </w:t>
+      </w:r>
+      <w:r>
+        <w:t>to the downstream task of entity linking.</w:t>
+      </w:r>
+      <w:r>
+        <w:t xml:space="preserve"> </w:t>
+      </w:r>
+      <w:r>
+        <w:t>Standard</w:t>
+      </w:r>
+      <w:r>
+        <w:t xml:space="preserve"> evaluation metrics of NER models</w:t>
+      </w:r>
+      <w:r>
+        <w:t xml:space="preserve"> </w:t>
+      </w:r>
+      <w:r>
+        <w:t xml:space="preserve">are </w:t>
+      </w:r>
+      <w:r>
+        <w:t>derived from</w:t>
+      </w:r>
+      <w:r>
+        <w:t xml:space="preserve"> a confusion matrix</w:t>
+      </w:r>
+      <w:r>
+        <w:t xml:space="preserve">. </w:t>
+      </w:r>
+      <w:r>
+        <w:t>Rather than computing metrics</w:t>
+      </w:r>
+      <w:r>
+        <w:t xml:space="preserve"> at a sentence level, they were calculated </w:t>
+      </w:r>
+      <w:r>
+        <w:t xml:space="preserve">at a document level, based </w:t>
+      </w:r>
+      <w:r>
+        <w:t xml:space="preserve">on </w:t>
+      </w:r>
+      <w:r>
+        <w:t xml:space="preserve">the </w:t>
+      </w:r>
+      <w:r>
+        <w:t xml:space="preserve">model’s prediction </w:t>
+      </w:r>
+      <w:r>
+        <w:t>across</w:t>
+      </w:r>
+      <w:r>
+        <w:t xml:space="preserve"> an entire thesis.</w:t>
+      </w:r>
+    </w:p>
+    <w:p>
+      <w:pPr>
+        <w:spacing w:line="276" w:lineRule="auto"/>
+      </w:pPr>
+      <w:r>
+        <w:t>For evaluation,</w:t>
+      </w:r>
+      <w:r>
+        <w:t xml:space="preserve"> </w:t>
+      </w:r>
+      <w:r>
+        <w:t xml:space="preserve">the set of </w:t>
+      </w:r>
+      <w:r>
+        <w:t xml:space="preserve">entities </w:t>
+      </w:r>
+      <w:r>
+        <w:t>in the reference data was</w:t>
+      </w:r>
+      <w:r>
+        <w:t xml:space="preserve"> compared </w:t>
+      </w:r>
+      <w:r>
+        <w:t>against</w:t>
+      </w:r>
+      <w:r>
+        <w:t xml:space="preserve"> </w:t>
+      </w:r>
+      <w:r>
+        <w:t xml:space="preserve">the set of </w:t>
+      </w:r>
+      <w:r>
+        <w:t>entities</w:t>
+      </w:r>
+      <w:r>
+        <w:t xml:space="preserve"> predicted anywhere within the same thesis,</w:t>
+      </w:r>
+      <w:r>
+        <w:t xml:space="preserve"> regardless of</w:t>
+      </w:r>
+      <w:r>
+        <w:t xml:space="preserve"> their exact</w:t>
+      </w:r>
+      <w:r>
+        <w:t xml:space="preserve"> location</w:t>
+      </w:r>
+      <w:r>
+        <w:t xml:space="preserve"> or number of occurrences</w:t>
+      </w:r>
+      <w:r>
+        <w:t>.</w:t>
+      </w:r>
+      <w:r>
+        <w:t xml:space="preserve"> </w:t>
+      </w:r>
+      <w:r>
+        <w:t>For</w:t>
+      </w:r>
+      <w:r>
+        <w:t xml:space="preserve"> example, if </w:t>
       </w:r>
       <w:r>
         <w:rPr>
           <w:i/>
           <w:iCs/>
         </w:rPr>
-        <w:t>subject</w:t>
-      </w:r>
-      <w:r>
-        <w:t xml:space="preserve"> label should only appear a few times in a document.</w:t>
-      </w:r>
-    </w:p>
-    <w:p>
-      <w:pPr>
-        <w:spacing w:line="276" w:lineRule="auto"/>
-      </w:pPr>
-    </w:p>
-    <w:p>
-      <w:pPr>
-        <w:pStyle w:val="Heading2"/>
-      </w:pPr>
-      <w:r>
-        <w:t>Model evaluation</w:t>
-      </w:r>
-    </w:p>
-    <w:p>
-      <w:pPr>
-        <w:spacing w:line="276" w:lineRule="auto"/>
-      </w:pPr>
-      <w:r>
-        <w:t xml:space="preserve">A custom evaluation methodology was developed </w:t>
-      </w:r>
-      <w:r>
-        <w:t>to</w:t>
-      </w:r>
-      <w:r>
-        <w:t xml:space="preserve"> compare the </w:t>
-      </w:r>
-      <w:r>
-        <w:t>effectiveness</w:t>
-      </w:r>
-      <w:r>
-        <w:t xml:space="preserve"> of the models</w:t>
-      </w:r>
-      <w:r>
-        <w:t xml:space="preserve"> in </w:t>
-      </w:r>
-      <w:r>
-        <w:t>extracting entities</w:t>
-      </w:r>
-      <w:r>
-        <w:t xml:space="preserve">, </w:t>
-      </w:r>
-      <w:r>
-        <w:t xml:space="preserve">with a focus their applicability </w:t>
-      </w:r>
-      <w:r>
-        <w:t>to the downstream task of entity linking.</w:t>
-      </w:r>
-      <w:r>
-        <w:t xml:space="preserve"> </w:t>
-      </w:r>
-      <w:r>
-        <w:t>Standard</w:t>
-      </w:r>
-      <w:r>
-        <w:t xml:space="preserve"> evaluation metrics of NER models</w:t>
-      </w:r>
-      <w:r>
-        <w:t xml:space="preserve"> </w:t>
-      </w:r>
-      <w:r>
-        <w:t xml:space="preserve">are </w:t>
-      </w:r>
-      <w:r>
-        <w:t>derived from</w:t>
-      </w:r>
-      <w:r>
-        <w:t xml:space="preserve"> a confusion matrix</w:t>
-      </w:r>
-      <w:r>
-        <w:t xml:space="preserve">. </w:t>
-      </w:r>
-      <w:r>
-        <w:t>Rather than computing metrics</w:t>
-      </w:r>
-      <w:r>
-        <w:t xml:space="preserve"> at a sentence level, they were calculated </w:t>
-      </w:r>
-      <w:r>
-        <w:t xml:space="preserve">at a document level, based </w:t>
-      </w:r>
-      <w:r>
-        <w:t xml:space="preserve">on </w:t>
-      </w:r>
-      <w:r>
-        <w:t xml:space="preserve">the </w:t>
-      </w:r>
-      <w:r>
-        <w:t xml:space="preserve">model’s prediction </w:t>
-      </w:r>
-      <w:r>
-        <w:t>across</w:t>
-      </w:r>
-      <w:r>
-        <w:t xml:space="preserve"> an entire thesis.</w:t>
-      </w:r>
-    </w:p>
-    <w:p>
-      <w:pPr>
-        <w:spacing w:line="276" w:lineRule="auto"/>
-      </w:pPr>
-      <w:r>
-        <w:lastRenderedPageBreak/>
-        <w:t>For evaluation,</w:t>
-      </w:r>
-      <w:r>
-        <w:t xml:space="preserve"> </w:t>
-      </w:r>
-      <w:r>
-        <w:t xml:space="preserve">the set of </w:t>
-      </w:r>
-      <w:r>
-        <w:t xml:space="preserve">entities </w:t>
-      </w:r>
-      <w:r>
-        <w:t>in the reference data was</w:t>
-      </w:r>
-      <w:r>
-        <w:t xml:space="preserve"> compared </w:t>
-      </w:r>
-      <w:r>
-        <w:t>against</w:t>
-      </w:r>
-      <w:r>
-        <w:t xml:space="preserve"> </w:t>
-      </w:r>
-      <w:r>
-        <w:t xml:space="preserve">the set of </w:t>
-      </w:r>
-      <w:r>
-        <w:t>entities</w:t>
-      </w:r>
-      <w:r>
-        <w:t xml:space="preserve"> predicted anywhere within the same thesis,</w:t>
-      </w:r>
-      <w:r>
-        <w:t xml:space="preserve"> regardless of</w:t>
-      </w:r>
-      <w:r>
-        <w:t xml:space="preserve"> their exact</w:t>
-      </w:r>
-      <w:r>
-        <w:t xml:space="preserve"> location</w:t>
-      </w:r>
-      <w:r>
-        <w:t xml:space="preserve"> or number of occurrences</w:t>
-      </w:r>
-      <w:r>
-        <w:t>.</w:t>
-      </w:r>
-      <w:r>
-        <w:t xml:space="preserve"> </w:t>
-      </w:r>
-      <w:r>
-        <w:t>For</w:t>
-      </w:r>
-      <w:r>
-        <w:t xml:space="preserve"> example, if </w:t>
+        <w:t>“Nieuwegein”</w:t>
+      </w:r>
+      <w:r>
+        <w:t xml:space="preserve"> was </w:t>
+      </w:r>
+      <w:r>
+        <w:t xml:space="preserve">labeled as </w:t>
       </w:r>
       <w:r>
         <w:rPr>
           <w:i/>
           <w:iCs/>
         </w:rPr>
-        <w:t>“Nieuwegein”</w:t>
-      </w:r>
-      <w:r>
-        <w:t xml:space="preserve"> was </w:t>
-      </w:r>
-      <w:r>
-        <w:t xml:space="preserve">labeled as </w:t>
+        <w:t>spatial</w:t>
       </w:r>
       <w:r>
         <w:rPr>
           <w:i/>
           <w:iCs/>
         </w:rPr>
-        <w:t>spatial</w:t>
+        <w:t xml:space="preserve"> </w:t>
+      </w:r>
+      <w:r>
+        <w:t xml:space="preserve">in a given </w:t>
+      </w:r>
+      <w:r>
+        <w:t xml:space="preserve">thesis, and the model </w:t>
+      </w:r>
+      <w:r>
+        <w:t>predicted</w:t>
+      </w:r>
+      <w:r>
+        <w:t xml:space="preserve"> </w:t>
       </w:r>
       <w:r>
         <w:rPr>
           <w:i/>
           <w:iCs/>
         </w:rPr>
-        <w:t xml:space="preserve"> </w:t>
-      </w:r>
-      <w:r>
-        <w:t xml:space="preserve">in a given </w:t>
-      </w:r>
-      <w:r>
-        <w:t xml:space="preserve">thesis, and the model </w:t>
-      </w:r>
-      <w:r>
-        <w:t>predicted</w:t>
-      </w:r>
-      <w:r>
-        <w:t xml:space="preserve"> </w:t>
+        <w:t>“Nieuwegein</w:t>
       </w:r>
       <w:r>
         <w:rPr>
           <w:i/>
           <w:iCs/>
         </w:rPr>
-        <w:t>“Nieuwegein</w:t>
+        <w:t>”</w:t>
       </w:r>
       <w:r>
         <w:rPr>
           <w:i/>
           <w:iCs/>
         </w:rPr>
-        <w:t>”</w:t>
+        <w:t xml:space="preserve"> </w:t>
+      </w:r>
+      <w:r>
+        <w:t xml:space="preserve">as </w:t>
       </w:r>
       <w:r>
         <w:rPr>
           <w:i/>
           <w:iCs/>
         </w:rPr>
-        <w:t xml:space="preserve"> </w:t>
-      </w:r>
-      <w:r>
-        <w:t xml:space="preserve">as </w:t>
-      </w:r>
-      <w:r>
-        <w:rPr>
-          <w:i/>
-          <w:iCs/>
-        </w:rPr>
         <w:t xml:space="preserve">spatial </w:t>
       </w:r>
       <w:r>
@@ -744,15 +1495,7 @@
         <w:t>missing labels</w:t>
       </w:r>
       <w:r>
-        <w:t xml:space="preserve"> in the </w:t>
-      </w:r>
-      <w:proofErr w:type="gramStart"/>
-      <w:r>
-        <w:t>annotations, and</w:t>
-      </w:r>
-      <w:proofErr w:type="gramEnd"/>
-      <w:r>
-        <w:t xml:space="preserve"> </w:t>
+        <w:t xml:space="preserve"> in the annotations, and </w:t>
       </w:r>
       <w:r>
         <w:t xml:space="preserve">reflects the </w:t>
@@ -1140,7 +1883,11 @@
         <w:t xml:space="preserve">he Jaccard similarity index </w:t>
       </w:r>
       <w:r>
-        <w:t>is a quantification of the s</w:t>
+        <w:t xml:space="preserve">is a </w:t>
+      </w:r>
+      <w:r>
+        <w:lastRenderedPageBreak/>
+        <w:t>quantification of the s</w:t>
       </w:r>
       <w:r>
         <w:t>imilarity between two sets</w:t>
@@ -1174,7 +1921,7 @@
                     <pic:cNvPicPr/>
                   </pic:nvPicPr>
                   <pic:blipFill>
-                    <a:blip r:embed="rId7"/>
+                    <a:blip r:embed="rId13"/>
                     <a:stretch>
                       <a:fillRect/>
                     </a:stretch>
@@ -1201,6 +1948,9 @@
         <w:jc w:val="center"/>
       </w:pPr>
       <w:r>
+        <w:rPr>
+          <w:noProof/>
+        </w:rPr>
         <w:drawing>
           <wp:inline distT="0" distB="0" distL="0" distR="0" wp14:anchorId="16D33D0B" wp14:editId="53DF1DAC">
             <wp:extent cx="3716104" cy="434566"/>
@@ -1217,7 +1967,7 @@
                     <pic:cNvPicPr/>
                   </pic:nvPicPr>
                   <pic:blipFill>
-                    <a:blip r:embed="rId8"/>
+                    <a:blip r:embed="rId14"/>
                     <a:stretch>
                       <a:fillRect/>
                     </a:stretch>
@@ -1243,6 +1993,9 @@
         <w:jc w:val="center"/>
       </w:pPr>
       <w:r>
+        <w:rPr>
+          <w:noProof/>
+        </w:rPr>
         <w:drawing>
           <wp:inline distT="0" distB="0" distL="0" distR="0" wp14:anchorId="696FC684" wp14:editId="0C809A5A">
             <wp:extent cx="1643204" cy="500000"/>
@@ -1259,7 +2012,7 @@
                     <pic:cNvPicPr/>
                   </pic:nvPicPr>
                   <pic:blipFill>
-                    <a:blip r:embed="rId9"/>
+                    <a:blip r:embed="rId15"/>
                     <a:stretch>
                       <a:fillRect/>
                     </a:stretch>
@@ -1286,6 +2039,9 @@
         <w:jc w:val="center"/>
       </w:pPr>
       <w:r>
+        <w:rPr>
+          <w:noProof/>
+        </w:rPr>
         <w:drawing>
           <wp:inline distT="0" distB="0" distL="0" distR="0" wp14:anchorId="67EEEC40" wp14:editId="61A5DCAE">
             <wp:extent cx="1982709" cy="425774"/>
@@ -1302,7 +2058,7 @@
                     <pic:cNvPicPr/>
                   </pic:nvPicPr>
                   <pic:blipFill>
-                    <a:blip r:embed="rId10"/>
+                    <a:blip r:embed="rId16"/>
                     <a:stretch>
                       <a:fillRect/>
                     </a:stretch>
@@ -1367,11 +2123,7 @@
         <w:t xml:space="preserve"> calculated from </w:t>
       </w:r>
       <w:r>
-        <w:t xml:space="preserve">the </w:t>
-      </w:r>
-      <w:r>
-        <w:lastRenderedPageBreak/>
-        <w:t xml:space="preserve">response produced for each </w:t>
+        <w:t xml:space="preserve">the response produced for each </w:t>
       </w:r>
       <w:r>
         <w:t xml:space="preserve">evaluation </w:t>
@@ -1414,13 +2166,8 @@
       <w:r>
         <w:t xml:space="preserve">can be ambiguous since it </w:t>
       </w:r>
-      <w:proofErr w:type="gramStart"/>
-      <w:r>
-        <w:t>assess</w:t>
-      </w:r>
-      <w:proofErr w:type="gramEnd"/>
-      <w:r>
-        <w:t xml:space="preserve"> not only if an entity was </w:t>
+      <w:r>
+        <w:t xml:space="preserve">assess not only if an entity was </w:t>
       </w:r>
       <w:r>
         <w:t>given</w:t>
@@ -1583,262 +2330,205 @@
         <w:t>.</w:t>
       </w:r>
       <w:r>
-        <w:t xml:space="preserve"> Strings were converted into lowercase and all punctuation was removed, and pairs with </w:t>
-      </w:r>
-      <w:proofErr w:type="gramStart"/>
-      <w:r>
-        <w:t>a distance of more</w:t>
-      </w:r>
-      <w:proofErr w:type="gramEnd"/>
-      <w:r>
-        <w:t xml:space="preserve"> than 0.9 </w:t>
-      </w:r>
-      <w:proofErr w:type="gramStart"/>
-      <w:r>
-        <w:t>were considered to be</w:t>
-      </w:r>
-      <w:proofErr w:type="gramEnd"/>
-      <w:r>
-        <w:t xml:space="preserve"> a match. In all cases, the labels type assigned by the model was required to be the same as the reference label.</w:t>
+        <w:t xml:space="preserve"> Strings were converted into lowercase and all punctuation was removed, and pairs with a distance of more than 0.9 were considered to be a match. In all cases, the labels type assigned by the model was required to be the same as the reference label.</w:t>
       </w:r>
     </w:p>
     <w:p>
       <w:pPr>
         <w:spacing w:line="276" w:lineRule="auto"/>
       </w:pPr>
-      <w:r>
-        <w:t xml:space="preserve">A document-level splitting strategy was used to randomly divide the annotated theses into a training set of 16 and an evaluation set of 4. This </w:t>
-      </w:r>
-      <w:r>
-        <w:t>approach was chosen</w:t>
-      </w:r>
-      <w:r>
-        <w:t xml:space="preserve"> over random sequence-level splitting chiefly to reflect real-world document processing and achieve a relatively balanced distribution of label types between training and validation. </w:t>
-      </w:r>
-      <w:r>
-        <w:t xml:space="preserve">Using the same training and validation data </w:t>
-      </w:r>
-      <w:r>
-        <w:t>also</w:t>
-      </w:r>
-      <w:r>
-        <w:t xml:space="preserve"> enables a fair comparison between</w:t>
+    </w:p>
+    <w:p>
+      <w:pPr>
+        <w:pStyle w:val="Heading2"/>
+      </w:pPr>
+      <w:r>
+        <w:t>Model Results</w:t>
+      </w:r>
+    </w:p>
+    <w:p>
+      <w:pPr>
+        <w:spacing w:line="276" w:lineRule="auto"/>
+      </w:pPr>
+      <w:r>
+        <w:t xml:space="preserve">BERT </w:t>
+      </w:r>
+      <w:r>
+        <w:t xml:space="preserve">is pre-trained on large language corpora to understand context using </w:t>
+      </w:r>
+      <w:r>
+        <w:t xml:space="preserve">bidirectional </w:t>
+      </w:r>
+      <w:r>
+        <w:t xml:space="preserve">masked language modeling and next-sentence prediction </w:t>
+      </w:r>
+      <w:r>
+        <w:fldChar w:fldCharType="begin"/>
+      </w:r>
+      <w:r>
+        <w:instrText xml:space="preserve"> ADDIN ZOTERO_ITEM CSL_CITATION {"citationID":"mToimSpd","properties":{"formattedCitation":"(Devlin et al., 2019)","plainCitation":"(Devlin et al., 2019)","noteIndex":0},"citationItems":[{"id":1982,"uris":["http://zotero.org/users/11765017/items/W24K7F7Q"],"itemData":{"id":1982,"type":"paper-conference","container-title":"Proceedings of the 2019 Conference of the North American Chapter of the Association for Computational Linguistics: Human Language Technologies, Volume 1 (Long and Short Papers)","DOI":"10.18653/v1/N19-1423","event-place":"Minneapolis, Minnesota","event-title":"2019 Conference of the North American Chapter of the Association for Computational Linguistics: Human Language Technologies","language":"en","page":"4171-4186","publisher":"Association for Computational Linguistics","publisher-place":"Minneapolis, Minnesota","source":"DOI.org (Crossref)","title":"BERT: Pre-training of Deep Bidirectional Transformers for Language Understanding","URL":"http://aclweb.org/anthology/N19-1423","author":[{"family":"Devlin","given":"Jacob"},{"family":"Chang","given":"Ming-Wei"},{"family":"Lee","given":"Kenton"},{"family":"Toutanova","given":"Kristina"}],"accessed":{"date-parts":[["2026",1,25]]},"issued":{"date-parts":[["2019"]]}}}],"schema":"https://github.com/citation-style-language/schema/raw/master/csl-citation.json"} </w:instrText>
+      </w:r>
+      <w:r>
+        <w:fldChar w:fldCharType="separate"/>
+      </w:r>
+      <w:r>
+        <w:rPr>
+          <w:rFonts w:ascii="Aptos" w:hAnsi="Aptos"/>
+        </w:rPr>
+        <w:t>(Devlin et al., 2019)</w:t>
+      </w:r>
+      <w:r>
+        <w:fldChar w:fldCharType="end"/>
+      </w:r>
+      <w:r>
+        <w:t>. Through transfer</w:t>
+      </w:r>
+      <w:r>
+        <w:t xml:space="preserve"> learning</w:t>
+      </w:r>
+      <w:r>
+        <w:t xml:space="preserve">, </w:t>
+      </w:r>
+      <w:r>
+        <w:t xml:space="preserve">it </w:t>
+      </w:r>
+      <w:r>
+        <w:t xml:space="preserve">can be </w:t>
+      </w:r>
+      <w:r>
+        <w:t xml:space="preserve">fine-tuned </w:t>
+      </w:r>
+      <w:r>
+        <w:t>on annotated training data for</w:t>
+      </w:r>
+      <w:r>
+        <w:t xml:space="preserve"> specific </w:t>
+      </w:r>
+      <w:r>
+        <w:t xml:space="preserve">NLP </w:t>
+      </w:r>
+      <w:r>
+        <w:t>tasks</w:t>
+      </w:r>
+      <w:r>
+        <w:t xml:space="preserve">. </w:t>
+      </w:r>
+      <w:r>
+        <w:t>This study used</w:t>
+      </w:r>
+      <w:r>
+        <w:t xml:space="preserve"> BERTj</w:t>
+      </w:r>
+      <w:r>
+        <w:t xml:space="preserve">e, </w:t>
+      </w:r>
+      <w:r>
+        <w:t>a monolingual Dutch BERT model with a token-level classification head for sequence labeling tasks</w:t>
       </w:r>
       <w:r>
         <w:t xml:space="preserve"> </w:t>
       </w:r>
       <w:r>
-        <w:t>the different types of models.</w:t>
+        <w:fldChar w:fldCharType="begin"/>
+      </w:r>
+      <w:r>
+        <w:instrText xml:space="preserve"> ADDIN ZOTERO_ITEM CSL_CITATION {"citationID":"tEsXJ6ev","properties":{"formattedCitation":"(Vries et al., 2019)","plainCitation":"(Vries et al., 2019)","noteIndex":0},"citationItems":[{"id":1984,"uris":["http://zotero.org/users/11765017/items/CY3LEHHL"],"itemData":{"id":1984,"type":"article","abstract":"The transformer-based pre-trained language model BERT has helped to improve state-of-the-art performance on many natural language processing (NLP) tasks. Using the same architecture and parameters, we developed and evaluated a monolingual Dutch BERT model called BERTje. Compared to the multilingual BERT model, which includes Dutch but is only based on Wikipedia text, BERTje is based on a large and diverse dataset of 2.4 billion tokens. BERTje consistently outperforms the equally-sized multilingual BERT model on downstream NLP tasks (part-of-speech tagging, named-entity recognition, semantic role labeling, and sentiment analysis). Our pre-trained Dutch BERT model is made available at https://github.com/wietsedv/bertje.","DOI":"10.48550/arXiv.1912.09582","note":"arXiv:1912.09582 [cs]","number":"arXiv:1912.09582","publisher":"arXiv","source":"arXiv.org","title":"BERTje: A Dutch BERT Model","title-short":"BERTje","URL":"http://arxiv.org/abs/1912.09582","author":[{"family":"Vries","given":"Wietse","dropping-particle":"de"},{"family":"Cranenburgh","given":"Andreas","dropping-particle":"van"},{"family":"Bisazza","given":"Arianna"},{"family":"Caselli","given":"Tommaso"},{"family":"Noord","given":"Gertjan","dropping-particle":"van"},{"family":"Nissim","given":"Malvina"}],"accessed":{"date-parts":[["2026",1,25]]},"issued":{"date-parts":[["2019",12,19]]}}}],"schema":"https://github.com/citation-style-language/schema/raw/master/csl-citation.json"} </w:instrText>
+      </w:r>
+      <w:r>
+        <w:fldChar w:fldCharType="separate"/>
+      </w:r>
+      <w:r>
+        <w:rPr>
+          <w:rFonts w:ascii="Aptos" w:hAnsi="Aptos"/>
+        </w:rPr>
+        <w:t>(Vries et al., 2019)</w:t>
+      </w:r>
+      <w:r>
+        <w:fldChar w:fldCharType="end"/>
+      </w:r>
+      <w:r>
+        <w:t>.</w:t>
       </w:r>
     </w:p>
     <w:p>
       <w:pPr>
         <w:spacing w:line="276" w:lineRule="auto"/>
       </w:pPr>
-    </w:p>
-    <w:p>
-      <w:pPr>
-        <w:pStyle w:val="Heading2"/>
-      </w:pPr>
-      <w:r>
-        <w:t>Model Results</w:t>
-      </w:r>
-    </w:p>
-    <w:p>
-      <w:pPr>
-        <w:spacing w:line="276" w:lineRule="auto"/>
-      </w:pPr>
-      <w:r>
-        <w:t xml:space="preserve">BERT </w:t>
-      </w:r>
-      <w:r>
-        <w:t xml:space="preserve">is pre-trained on large language corpora to understand context using </w:t>
-      </w:r>
-      <w:r>
-        <w:t xml:space="preserve">bidirectional </w:t>
-      </w:r>
-      <w:r>
-        <w:t xml:space="preserve">masked language modeling and next-sentence prediction </w:t>
-      </w:r>
-      <w:r>
-        <w:fldChar w:fldCharType="begin"/>
-      </w:r>
-      <w:r>
-        <w:instrText xml:space="preserve"> ADDIN ZOTERO_ITEM CSL_CITATION {"citationID":"mToimSpd","properties":{"formattedCitation":"(Devlin et al., 2019)","plainCitation":"(Devlin et al., 2019)","noteIndex":0},"citationItems":[{"id":1982,"uris":["http://zotero.org/users/11765017/items/W24K7F7Q"],"itemData":{"id":1982,"type":"paper-conference","container-title":"Proceedings of the 2019 Conference of the North American Chapter of the Association for Computational Linguistics: Human Language Technologies, Volume 1 (Long and Short Papers)","DOI":"10.18653/v1/N19-1423","event-place":"Minneapolis, Minnesota","event-title":"2019 Conference of the North American Chapter of the Association for Computational Linguistics: Human Language Technologies","language":"en","page":"4171-4186","publisher":"Association for Computational Linguistics","publisher-place":"Minneapolis, Minnesota","source":"DOI.org (Crossref)","title":"BERT: Pre-training of Deep Bidirectional Transformers for Language Understanding","URL":"http://aclweb.org/anthology/N19-1423","author":[{"family":"Devlin","given":"Jacob"},{"family":"Chang","given":"Ming-Wei"},{"family":"Lee","given":"Kenton"},{"family":"Toutanova","given":"Kristina"}],"accessed":{"date-parts":[["2026",1,25]]},"issued":{"date-parts":[["2019"]]}}}],"schema":"https://github.com/citation-style-language/schema/raw/master/csl-citation.json"} </w:instrText>
-      </w:r>
-      <w:r>
-        <w:fldChar w:fldCharType="separate"/>
-      </w:r>
-      <w:r>
-        <w:rPr>
-          <w:rFonts w:ascii="Aptos" w:hAnsi="Aptos"/>
-        </w:rPr>
-        <w:t>(Devlin et al., 2019)</w:t>
-      </w:r>
-      <w:r>
-        <w:fldChar w:fldCharType="end"/>
-      </w:r>
-      <w:r>
-        <w:t>. Through transfer</w:t>
-      </w:r>
-      <w:r>
-        <w:t xml:space="preserve"> learning</w:t>
-      </w:r>
-      <w:r>
-        <w:t xml:space="preserve">, </w:t>
-      </w:r>
-      <w:r>
-        <w:t xml:space="preserve">it </w:t>
-      </w:r>
-      <w:r>
-        <w:t xml:space="preserve">can be </w:t>
-      </w:r>
-      <w:r>
-        <w:t xml:space="preserve">fine-tuned </w:t>
-      </w:r>
-      <w:r>
-        <w:t>on annotated training data for</w:t>
-      </w:r>
-      <w:r>
-        <w:t xml:space="preserve"> specific </w:t>
-      </w:r>
-      <w:r>
-        <w:t xml:space="preserve">NLP </w:t>
-      </w:r>
-      <w:r>
-        <w:t>tasks</w:t>
-      </w:r>
-      <w:r>
-        <w:t xml:space="preserve">. </w:t>
-      </w:r>
-      <w:r>
-        <w:t>This study used</w:t>
-      </w:r>
-      <w:r>
-        <w:t xml:space="preserve"> BERTj</w:t>
-      </w:r>
-      <w:r>
-        <w:t xml:space="preserve">e, </w:t>
-      </w:r>
-      <w:r>
-        <w:t>a monolingual Dutch BERT model with a token-level classification head for sequence labeling tasks</w:t>
+      <w:r>
+        <w:lastRenderedPageBreak/>
+        <w:t>The BERTje checkpoint</w:t>
+      </w:r>
+      <w:r>
+        <w:rPr>
+          <w:rStyle w:val="FootnoteReference"/>
+        </w:rPr>
+        <w:footnoteReference w:id="3"/>
       </w:r>
       <w:r>
         <w:t xml:space="preserve"> </w:t>
       </w:r>
       <w:r>
-        <w:fldChar w:fldCharType="begin"/>
-      </w:r>
-      <w:r>
-        <w:instrText xml:space="preserve"> ADDIN ZOTERO_ITEM CSL_CITATION {"citationID":"tEsXJ6ev","properties":{"formattedCitation":"(Vries et al., 2019)","plainCitation":"(Vries et al., 2019)","noteIndex":0},"citationItems":[{"id":1984,"uris":["http://zotero.org/users/11765017/items/CY3LEHHL"],"itemData":{"id":1984,"type":"article","abstract":"The transformer-based pre-trained language model BERT has helped to improve state-of-the-art performance on many natural language processing (NLP) tasks. Using the same architecture and parameters, we developed and evaluated a monolingual Dutch BERT model called BERTje. Compared to the multilingual BERT model, which includes Dutch but is only based on Wikipedia text, BERTje is based on a large and diverse dataset of 2.4 billion tokens. BERTje consistently outperforms the equally-sized multilingual BERT model on downstream NLP tasks (part-of-speech tagging, named-entity recognition, semantic role labeling, and sentiment analysis). Our pre-trained Dutch BERT model is made available at https://github.com/wietsedv/bertje.","DOI":"10.48550/arXiv.1912.09582","note":"arXiv:1912.09582 [cs]","number":"arXiv:1912.09582","publisher":"arXiv","source":"arXiv.org","title":"BERTje: A Dutch BERT Model","title-short":"BERTje","URL":"http://arxiv.org/abs/1912.09582","author":[{"family":"Vries","given":"Wietse","dropping-particle":"de"},{"family":"Cranenburgh","given":"Andreas","dropping-particle":"van"},{"family":"Bisazza","given":"Arianna"},{"family":"Caselli","given":"Tommaso"},{"family":"Noord","given":"Gertjan","dropping-particle":"van"},{"family":"Nissim","given":"Malvina"}],"accessed":{"date-parts":[["2026",1,25]]},"issued":{"date-parts":[["2019",12,19]]}}}],"schema":"https://github.com/citation-style-language/schema/raw/master/csl-citation.json"} </w:instrText>
-      </w:r>
-      <w:r>
-        <w:fldChar w:fldCharType="separate"/>
-      </w:r>
-      <w:r>
-        <w:rPr>
-          <w:rFonts w:ascii="Aptos" w:hAnsi="Aptos"/>
-        </w:rPr>
-        <w:t>(Vries et al., 2019)</w:t>
-      </w:r>
-      <w:r>
-        <w:fldChar w:fldCharType="end"/>
+        <w:t xml:space="preserve">was fine-tuned on two versions of the training dataset to </w:t>
+      </w:r>
+      <w:r>
+        <w:t>assess</w:t>
+      </w:r>
+      <w:r>
+        <w:t xml:space="preserve"> the effect of label sample size. The original BIO labeling scheme resulted in 13 possible labels, </w:t>
+      </w:r>
+      <w:r>
+        <w:t>leading to</w:t>
+      </w:r>
+      <w:r>
+        <w:t xml:space="preserve"> a small sample size for </w:t>
+      </w:r>
+      <w:r>
+        <w:t>per class</w:t>
       </w:r>
       <w:r>
         <w:t>.</w:t>
       </w:r>
-    </w:p>
-    <w:p>
-      <w:pPr>
-        <w:spacing w:line="276" w:lineRule="auto"/>
-      </w:pPr>
-      <w:r>
-        <w:t>The BERTje checkpoint</w:t>
-      </w:r>
-      <w:r>
-        <w:rPr>
-          <w:rStyle w:val="FootnoteReference"/>
-        </w:rPr>
-        <w:footnoteReference w:id="1"/>
+      <w:r>
+        <w:t xml:space="preserve"> To avoid this, </w:t>
+      </w:r>
+      <w:r>
+        <w:t>the documents were re</w:t>
+      </w:r>
+      <w:r>
+        <w:t>-</w:t>
+      </w:r>
+      <w:r>
+        <w:t>labeled with an IO (inside-</w:t>
+      </w:r>
+      <w:r>
+        <w:t>outside</w:t>
+      </w:r>
+      <w:r>
+        <w:t>)</w:t>
+      </w:r>
+      <w:r>
+        <w:t xml:space="preserve"> scheme</w:t>
+      </w:r>
+      <w:r>
+        <w:t>. This</w:t>
+      </w:r>
+      <w:r>
+        <w:t xml:space="preserve"> reduced the number of labels,</w:t>
+      </w:r>
+      <w:r>
+        <w:t xml:space="preserve"> increased the sample size of each</w:t>
+      </w:r>
+      <w:r>
+        <w:t>, and</w:t>
       </w:r>
       <w:r>
         <w:t xml:space="preserve"> </w:t>
       </w:r>
       <w:r>
-        <w:t xml:space="preserve">was fine-tuned on two versions of the training dataset to </w:t>
-      </w:r>
-      <w:r>
-        <w:t>assess</w:t>
-      </w:r>
-      <w:r>
-        <w:t xml:space="preserve"> the effect of label sample size. The original BIO labeling scheme resulted in 13 possible labels, </w:t>
-      </w:r>
-      <w:r>
-        <w:t>leading to</w:t>
-      </w:r>
-      <w:r>
-        <w:t xml:space="preserve"> a small sample size for </w:t>
-      </w:r>
-      <w:r>
-        <w:t>per class</w:t>
-      </w:r>
-      <w:r>
-        <w:t>.</w:t>
-      </w:r>
-      <w:r>
-        <w:t xml:space="preserve"> To avoid this, </w:t>
-      </w:r>
-      <w:r>
-        <w:t>the documents were re</w:t>
-      </w:r>
-      <w:r>
-        <w:t>-</w:t>
-      </w:r>
-      <w:r>
-        <w:t>labeled with an IO (inside-</w:t>
-      </w:r>
-      <w:r>
-        <w:t>outside</w:t>
-      </w:r>
-      <w:r>
-        <w:t>)</w:t>
-      </w:r>
-      <w:r>
-        <w:t xml:space="preserve"> scheme</w:t>
-      </w:r>
-      <w:r>
-        <w:t>. This</w:t>
-      </w:r>
-      <w:r>
-        <w:t xml:space="preserve"> reduced the number of labels,</w:t>
-      </w:r>
-      <w:r>
-        <w:t xml:space="preserve"> increased the sample size of each</w:t>
-      </w:r>
-      <w:r>
-        <w:t>, and</w:t>
-      </w:r>
-      <w:r>
-        <w:t xml:space="preserve"> </w:t>
-      </w:r>
-      <w:proofErr w:type="gramStart"/>
-      <w:r>
-        <w:t>made</w:t>
-      </w:r>
-      <w:proofErr w:type="gramEnd"/>
-      <w:r>
-        <w:t xml:space="preserve"> explicit that</w:t>
-      </w:r>
-      <w:r>
-        <w:t xml:space="preserve"> </w:t>
-      </w:r>
-      <w:proofErr w:type="gramStart"/>
-      <w:r>
-        <w:t>that</w:t>
-      </w:r>
-      <w:proofErr w:type="gramEnd"/>
-      <w:r>
-        <w:t xml:space="preserve"> </w:t>
+        <w:t>made explicit that</w:t>
+      </w:r>
+      <w:r>
+        <w:t xml:space="preserve"> that </w:t>
       </w:r>
       <w:r>
         <w:t>tokens</w:t>
@@ -2345,13 +3035,8 @@
               <w:jc w:val="center"/>
             </w:pPr>
             <w:r>
-              <w:t>I-</w:t>
-            </w:r>
-            <w:proofErr w:type="spellStart"/>
-            <w:r>
-              <w:t>inGroup</w:t>
-            </w:r>
-            <w:proofErr w:type="spellEnd"/>
+              <w:t>I-inGroup</w:t>
+            </w:r>
           </w:p>
         </w:tc>
         <w:tc>
@@ -2625,13 +3310,8 @@
               <w:jc w:val="center"/>
             </w:pPr>
             <w:r>
-              <w:t>B-</w:t>
-            </w:r>
-            <w:proofErr w:type="spellStart"/>
-            <w:r>
-              <w:t>inGroup</w:t>
-            </w:r>
-            <w:proofErr w:type="spellEnd"/>
+              <w:t>B-inGroup</w:t>
+            </w:r>
           </w:p>
         </w:tc>
         <w:tc>
@@ -2826,163 +3506,13 @@
         <w:rPr>
           <w:u w:val="single"/>
         </w:rPr>
-        <w:t xml:space="preserve">Gemini Model </w:t>
-      </w:r>
-    </w:p>
-    <w:p>
-      <w:r>
-        <w:t>Gemin</w:t>
-      </w:r>
-      <w:r>
-        <w:t xml:space="preserve">i 3 Flash is a proprietary reasoning model </w:t>
-      </w:r>
-      <w:r>
-        <w:t>intended for</w:t>
-      </w:r>
-      <w:r>
-        <w:t xml:space="preserve"> multi-model inputs</w:t>
-      </w:r>
-      <w:r>
-        <w:t xml:space="preserve">. This model was chosen among commercial LLMs because it is the latest model with a free tier. </w:t>
-      </w:r>
-      <w:r>
-        <w:t xml:space="preserve">Two different iterations of the model were </w:t>
-      </w:r>
-      <w:r>
-        <w:t>tested</w:t>
-      </w:r>
-      <w:r>
-        <w:t xml:space="preserve"> with different prompts, which correspond to a </w:t>
-      </w:r>
-      <w:r>
-        <w:t xml:space="preserve">few-shot </w:t>
-      </w:r>
-      <w:r>
-        <w:t>and a zero-shot</w:t>
-      </w:r>
-      <w:r>
-        <w:t xml:space="preserve"> run.</w:t>
-      </w:r>
-      <w:r>
-        <w:t xml:space="preserve"> In the few-shot run, the model was provided with instructions, annotation rules, two examples of labeled texts, and an unlabeled thesis to annotate. Only two training examples could be provided (instead of 16 like in the BERT model) because of the model’s limit </w:t>
-      </w:r>
-      <w:proofErr w:type="gramStart"/>
-      <w:r>
-        <w:t>on</w:t>
-      </w:r>
-      <w:proofErr w:type="gramEnd"/>
-      <w:r>
-        <w:t xml:space="preserve"> 250,000 input tokens per minute</w:t>
-      </w:r>
-      <w:r>
-        <w:t xml:space="preserve"> on the free </w:t>
-      </w:r>
-      <w:proofErr w:type="gramStart"/>
-      <w:r>
-        <w:t>tier</w:t>
-      </w:r>
-      <w:proofErr w:type="gramEnd"/>
-      <w:r>
-        <w:t>. The training examples were randomly chosen for each run. The annotation rules were taken from the same annotation guide used by the human annotators. In the zero-shot run, the same prompt was used, but examples were not provided.</w:t>
-      </w:r>
-      <w:r>
-        <w:t xml:space="preserve"> </w:t>
-      </w:r>
-      <w:r>
-        <w:t>English-language p</w:t>
-      </w:r>
-      <w:r>
-        <w:t>rompts were created based on the prompt engineering recommendations</w:t>
-      </w:r>
-      <w:r>
-        <w:rPr>
-          <w:rStyle w:val="FootnoteReference"/>
-        </w:rPr>
-        <w:footnoteReference w:id="2"/>
-      </w:r>
-      <w:r>
-        <w:t xml:space="preserve"> suggested by Google, and a few different versions were tested to find the best-performing prompt. The prompts used are shown in </w:t>
-      </w:r>
-      <w:r>
-        <w:t>the appendix.</w:t>
-      </w:r>
-      <w:r>
-        <w:t xml:space="preserve">  </w:t>
-      </w:r>
-    </w:p>
-    <w:p>
-      <w:r>
-        <w:t xml:space="preserve">The following boxplots show the distribution of recall, precision, F1, and </w:t>
-      </w:r>
-      <w:r>
-        <w:t>Jaccard index</w:t>
-      </w:r>
-      <w:r>
-        <w:t xml:space="preserve"> when the models were applied to the four validation theses. (Please note that I don’t think that </w:t>
-      </w:r>
-      <w:proofErr w:type="gramStart"/>
-      <w:r>
-        <w:t>all of</w:t>
-      </w:r>
-      <w:proofErr w:type="gramEnd"/>
-      <w:r>
-        <w:t xml:space="preserve"> these </w:t>
-      </w:r>
-      <w:r>
-        <w:lastRenderedPageBreak/>
-        <w:t xml:space="preserve">boxplots </w:t>
-      </w:r>
-      <w:r>
-        <w:t>should be presented</w:t>
-      </w:r>
-      <w:r>
-        <w:t xml:space="preserve"> in the thesis</w:t>
-      </w:r>
-      <w:r>
-        <w:t>,</w:t>
-      </w:r>
-      <w:r>
-        <w:t xml:space="preserve"> perhaps just the means,</w:t>
-      </w:r>
-      <w:r>
-        <w:t xml:space="preserve"> but I wanted to show the differences </w:t>
-      </w:r>
-      <w:r>
-        <w:t>in results</w:t>
-      </w:r>
-      <w:r>
-        <w:t xml:space="preserve"> between </w:t>
-      </w:r>
-      <w:r>
-        <w:t>the four thesis</w:t>
-      </w:r>
-      <w:r>
-        <w:t>).</w:t>
-      </w:r>
-    </w:p>
-    <w:p>
-      <w:pPr>
+        <w:t>Gemini model</w:t>
+      </w:r>
+      <w:r>
         <w:rPr>
           <w:u w:val="single"/>
         </w:rPr>
-      </w:pPr>
-      <w:r>
-        <w:rPr>
-          <w:u w:val="single"/>
-        </w:rPr>
-        <w:t>Gemini model</w:t>
-      </w:r>
-      <w:r>
-        <w:rPr>
-          <w:u w:val="single"/>
-        </w:rPr>
-        <w:t xml:space="preserve"> </w:t>
-      </w:r>
-      <w:r>
-        <w:rPr>
-          <w:u w:val="single"/>
-        </w:rPr>
-        <w:t>Zero-shot</w:t>
+        <w:t xml:space="preserve"> Zero-shot</w:t>
       </w:r>
     </w:p>
     <w:tbl>
@@ -3016,7 +3546,7 @@
                 <w:noProof/>
               </w:rPr>
               <w:drawing>
-                <wp:inline distT="0" distB="0" distL="0" distR="0" wp14:anchorId="2B097BA5" wp14:editId="502EC193">
+                <wp:inline distT="0" distB="0" distL="0" distR="0" wp14:anchorId="2B097BA5" wp14:editId="51D32F53">
                   <wp:extent cx="2591187" cy="1554480"/>
                   <wp:effectExtent l="0" t="0" r="0" b="7620"/>
                   <wp:docPr id="913220108" name="Picture 12"/>
@@ -3033,7 +3563,7 @@
                           </pic:cNvPicPr>
                         </pic:nvPicPr>
                         <pic:blipFill>
-                          <a:blip r:embed="rId11" cstate="print">
+                          <a:blip r:embed="rId17" cstate="print">
                             <a:extLst>
                               <a:ext uri="{28A0092B-C50C-407E-A947-70E740481C1C}">
                                 <a14:useLocalDpi xmlns:a14="http://schemas.microsoft.com/office/drawing/2010/main" val="0"/>
@@ -3080,7 +3610,7 @@
                 <w:noProof/>
               </w:rPr>
               <w:drawing>
-                <wp:inline distT="0" distB="0" distL="0" distR="0" wp14:anchorId="378B7171" wp14:editId="1F746AB7">
+                <wp:inline distT="0" distB="0" distL="0" distR="0" wp14:anchorId="378B7171" wp14:editId="1E05712B">
                   <wp:extent cx="2591187" cy="1554480"/>
                   <wp:effectExtent l="0" t="0" r="0" b="7620"/>
                   <wp:docPr id="779736674" name="Picture 13"/>
@@ -3097,7 +3627,7 @@
                           </pic:cNvPicPr>
                         </pic:nvPicPr>
                         <pic:blipFill>
-                          <a:blip r:embed="rId12" cstate="print">
+                          <a:blip r:embed="rId18" cstate="print">
                             <a:extLst>
                               <a:ext uri="{28A0092B-C50C-407E-A947-70E740481C1C}">
                                 <a14:useLocalDpi xmlns:a14="http://schemas.microsoft.com/office/drawing/2010/main" val="0"/>
@@ -3149,8 +3679,9 @@
               <w:rPr>
                 <w:noProof/>
               </w:rPr>
+              <w:lastRenderedPageBreak/>
               <w:drawing>
-                <wp:inline distT="0" distB="0" distL="0" distR="0" wp14:anchorId="1C4A4BB7" wp14:editId="302BE81D">
+                <wp:inline distT="0" distB="0" distL="0" distR="0" wp14:anchorId="1C4A4BB7" wp14:editId="3F4A3CA6">
                   <wp:extent cx="2591187" cy="1554480"/>
                   <wp:effectExtent l="0" t="0" r="0" b="7620"/>
                   <wp:docPr id="94020838" name="Picture 14"/>
@@ -3167,7 +3698,7 @@
                           </pic:cNvPicPr>
                         </pic:nvPicPr>
                         <pic:blipFill>
-                          <a:blip r:embed="rId13" cstate="print">
+                          <a:blip r:embed="rId19" cstate="print">
                             <a:extLst>
                               <a:ext uri="{28A0092B-C50C-407E-A947-70E740481C1C}">
                                 <a14:useLocalDpi xmlns:a14="http://schemas.microsoft.com/office/drawing/2010/main" val="0"/>
@@ -3214,7 +3745,7 @@
                 <w:noProof/>
               </w:rPr>
               <w:drawing>
-                <wp:inline distT="0" distB="0" distL="0" distR="0" wp14:anchorId="6D27AE8D" wp14:editId="072EF9A5">
+                <wp:inline distT="0" distB="0" distL="0" distR="0" wp14:anchorId="6D27AE8D" wp14:editId="24F7537A">
                   <wp:extent cx="2591187" cy="1554480"/>
                   <wp:effectExtent l="0" t="0" r="0" b="7620"/>
                   <wp:docPr id="1247163256" name="Picture 15"/>
@@ -3231,7 +3762,7 @@
                           </pic:cNvPicPr>
                         </pic:nvPicPr>
                         <pic:blipFill>
-                          <a:blip r:embed="rId14" cstate="print">
+                          <a:blip r:embed="rId20" cstate="print">
                             <a:extLst>
                               <a:ext uri="{28A0092B-C50C-407E-A947-70E740481C1C}">
                                 <a14:useLocalDpi xmlns:a14="http://schemas.microsoft.com/office/drawing/2010/main" val="0"/>
@@ -3323,7 +3854,7 @@
                 <w:noProof/>
               </w:rPr>
               <w:drawing>
-                <wp:inline distT="0" distB="0" distL="0" distR="0" wp14:anchorId="6530FD25" wp14:editId="7F44A305">
+                <wp:inline distT="0" distB="0" distL="0" distR="0" wp14:anchorId="6530FD25" wp14:editId="322A89DB">
                   <wp:extent cx="2589878" cy="1554480"/>
                   <wp:effectExtent l="0" t="0" r="1270" b="7620"/>
                   <wp:docPr id="1777130799" name="Picture 2"/>
@@ -3340,7 +3871,7 @@
                           </pic:cNvPicPr>
                         </pic:nvPicPr>
                         <pic:blipFill>
-                          <a:blip r:embed="rId15" cstate="print">
+                          <a:blip r:embed="rId21" cstate="print">
                             <a:extLst>
                               <a:ext uri="{28A0092B-C50C-407E-A947-70E740481C1C}">
                                 <a14:useLocalDpi xmlns:a14="http://schemas.microsoft.com/office/drawing/2010/main" val="0"/>
@@ -3404,7 +3935,7 @@
                           </pic:cNvPicPr>
                         </pic:nvPicPr>
                         <pic:blipFill>
-                          <a:blip r:embed="rId16" cstate="print">
+                          <a:blip r:embed="rId22" cstate="print">
                             <a:extLst>
                               <a:ext uri="{28A0092B-C50C-407E-A947-70E740481C1C}">
                                 <a14:useLocalDpi xmlns:a14="http://schemas.microsoft.com/office/drawing/2010/main" val="0"/>
@@ -3474,7 +4005,7 @@
                           </pic:cNvPicPr>
                         </pic:nvPicPr>
                         <pic:blipFill>
-                          <a:blip r:embed="rId17" cstate="print">
+                          <a:blip r:embed="rId23" cstate="print">
                             <a:extLst>
                               <a:ext uri="{28A0092B-C50C-407E-A947-70E740481C1C}">
                                 <a14:useLocalDpi xmlns:a14="http://schemas.microsoft.com/office/drawing/2010/main" val="0"/>
@@ -3521,7 +4052,7 @@
                 <w:noProof/>
               </w:rPr>
               <w:drawing>
-                <wp:inline distT="0" distB="0" distL="0" distR="0" wp14:anchorId="3F5275A1" wp14:editId="17C726B4">
+                <wp:inline distT="0" distB="0" distL="0" distR="0" wp14:anchorId="3F5275A1" wp14:editId="337F353F">
                   <wp:extent cx="2589880" cy="1554480"/>
                   <wp:effectExtent l="0" t="0" r="1270" b="7620"/>
                   <wp:docPr id="129154295" name="Picture 10"/>
@@ -3538,7 +4069,7 @@
                           </pic:cNvPicPr>
                         </pic:nvPicPr>
                         <pic:blipFill>
-                          <a:blip r:embed="rId18" cstate="print">
+                          <a:blip r:embed="rId24" cstate="print">
                             <a:extLst>
                               <a:ext uri="{28A0092B-C50C-407E-A947-70E740481C1C}">
                                 <a14:useLocalDpi xmlns:a14="http://schemas.microsoft.com/office/drawing/2010/main" val="0"/>
@@ -3589,19 +4120,115 @@
           <w:szCs w:val="36"/>
           <w:u w:val="single"/>
         </w:rPr>
+        <w:t>Inference</w:t>
+      </w:r>
+    </w:p>
+    <w:p>
+      <w:pPr>
+        <w:spacing w:line="276" w:lineRule="auto"/>
+      </w:pPr>
+      <w:r>
+        <w:t xml:space="preserve">The model determined to produce the best results will be used for inference. </w:t>
+      </w:r>
+      <w:r>
+        <w:t>The inference results of form the pool of entities for each thesis that can now be used for entity linking.</w:t>
+      </w:r>
+    </w:p>
+    <w:p>
+      <w:pPr>
+        <w:jc w:val="left"/>
+      </w:pPr>
+    </w:p>
+    <w:p>
+      <w:pPr>
+        <w:jc w:val="left"/>
+      </w:pPr>
+      <w:r>
+        <w:t>OTHER SECTIONS THAT I DON’T KNOW WHERE THEY BELONG ANYMORE:</w:t>
+      </w:r>
+    </w:p>
+    <w:p>
+      <w:pPr>
+        <w:spacing w:line="276" w:lineRule="auto"/>
+      </w:pPr>
+      <w:r>
+        <w:t xml:space="preserve">The comparison was motivated by need to find the model that is most appropriate for the available training data. While BERT and related architectures are commonly used for NER, most models assume that the training data is fully and consistently annotated </w:t>
+      </w:r>
+      <w:r>
+        <w:fldChar w:fldCharType="begin"/>
+      </w:r>
+      <w:r>
+        <w:instrText xml:space="preserve"> ADDIN ZOTERO_ITEM CSL_CITATION {"citationID":"9FLLlDka","properties":{"formattedCitation":"(Jie et al., 2019)","plainCitation":"(Jie et al., 2019)","noteIndex":0},"citationItems":[{"id":1988,"uris":["http://zotero.org/users/11765017/items/U7I9B8QM"],"itemData":{"id":1988,"type":"paper-conference","container-title":"Proceedings of the 2019 Conference of the North","DOI":"10.18653/v1/N19-1079","event-place":"Minneapolis, Minnesota","event-title":"Proceedings of the 2019 Conference of the North","language":"en","page":"729-734","publisher":"Association for Computational Linguistics","publisher-place":"Minneapolis, Minnesota","source":"DOI.org (Crossref)","title":"Better Modeling of Incomplete Annotations for Named Entity Recognition","URL":"http://aclweb.org/anthology/N19-1079","author":[{"family":"Jie","given":"Zhanming"},{"family":"Xie","given":"Pengjun"},{"family":"Lu","given":"Wei"},{"family":"Ding","given":"Ruixue"},{"family":"Li","given":"Linlin"}],"accessed":{"date-parts":[["2026",1,25]]},"issued":{"date-parts":[["2019"]]}}}],"schema":"https://github.com/citation-style-language/schema/raw/master/csl-citation.json"} </w:instrText>
+      </w:r>
+      <w:r>
+        <w:fldChar w:fldCharType="separate"/>
+      </w:r>
+      <w:r>
+        <w:rPr>
+          <w:rFonts w:ascii="Aptos" w:hAnsi="Aptos"/>
+        </w:rPr>
+        <w:t>(Jie et al., 2019)</w:t>
+      </w:r>
+      <w:r>
+        <w:fldChar w:fldCharType="end"/>
+      </w:r>
+      <w:r>
+        <w:t xml:space="preserve">. They struggle when a large proportion of the entities are labeled as </w:t>
+      </w:r>
+      <w:r>
+        <w:rPr>
+          <w:i/>
+          <w:iCs/>
+        </w:rPr>
+        <w:t xml:space="preserve">outside </w:t>
+      </w:r>
+      <w:r>
+        <w:t xml:space="preserve">(O) due to incomplete annotation. As specified in the annotation guidelines, human annotators only labeled the first five instances of each </w:t>
+      </w:r>
+      <w:r>
         <w:lastRenderedPageBreak/>
-        <w:t>Inference</w:t>
-      </w:r>
-    </w:p>
-    <w:p>
-      <w:pPr>
-        <w:spacing w:line="276" w:lineRule="auto"/>
-      </w:pPr>
-      <w:r>
-        <w:t xml:space="preserve">The model determined to produce the best results will be used for inference. </w:t>
-      </w:r>
-      <w:r>
-        <w:t>The inference results of form the pool of entities for each thesis that can now be used for entity linking.</w:t>
+        <w:t>entity, and restricted their work to the main sections, leaving the rest of the text untouched (annotated entities were automatically propagated to other occurrences of the same entity in the text). Consequently, while most identified entities are correct, not all relevant entities were identified, and examples of the negative class are not reliable. This creates noisy training data, which undermines the effectiveness of the BERT model’s fine-tuning. Training and evaluation loss are commonly used to describe model convergence during training, but because of the high ratio of O-labels relative to all other labels (</w:t>
+      </w:r>
+      <w:r>
+        <w:t>0.9975</w:t>
+      </w:r>
+      <w:r>
+        <w:t>%), loss approaches zero even if entity predictions are incorrect. A large language model that can reason and has access to web content may be able to rely less on training data and more on background knowledge.</w:t>
+      </w:r>
+    </w:p>
+    <w:p>
+      <w:r>
+        <w:t xml:space="preserve">A further limitation of BERT models is their context window of just 512 tokens. Give that the training theses have an average word count of more than 40 thousand, texts need to be split into smaller sequences. While this is a reasonable approach for training for sentence-level learning, it limits the opportunity for document-level learning. Gemini models can have context windows of more than a million tokens, allowing them to process entire theses. This allows them to benefit from document-level patterns such as that the </w:t>
+      </w:r>
+      <w:r>
+        <w:rPr>
+          <w:i/>
+          <w:iCs/>
+        </w:rPr>
+        <w:t>Title</w:t>
+      </w:r>
+      <w:r>
+        <w:t xml:space="preserve"> and </w:t>
+      </w:r>
+      <w:r>
+        <w:rPr>
+          <w:i/>
+          <w:iCs/>
+        </w:rPr>
+        <w:t>Author</w:t>
+      </w:r>
+      <w:r>
+        <w:t xml:space="preserve"> are always found near the beginning of a document, and that the </w:t>
+      </w:r>
+      <w:r>
+        <w:rPr>
+          <w:i/>
+          <w:iCs/>
+        </w:rPr>
+        <w:t>subject</w:t>
+      </w:r>
+      <w:r>
+        <w:t xml:space="preserve"> label should only appear a few times in a document.</w:t>
       </w:r>
     </w:p>
     <w:p>
@@ -4368,33 +4995,7 @@
           <w:lang w:eastAsia="nl-NL"/>
           <w14:ligatures w14:val="none"/>
         </w:rPr>
-        <w:t xml:space="preserve">Please </w:t>
-      </w:r>
-      <w:proofErr w:type="gramStart"/>
-      <w:r>
-        <w:rPr>
-          <w:rFonts w:ascii="Consolas" w:eastAsia="Times New Roman" w:hAnsi="Consolas" w:cs="Times New Roman"/>
-          <w:color w:val="448C27"/>
-          <w:kern w:val="0"/>
-          <w:sz w:val="21"/>
-          <w:szCs w:val="21"/>
-          <w:lang w:eastAsia="nl-NL"/>
-          <w14:ligatures w14:val="none"/>
-        </w:rPr>
-        <w:t>annotate</w:t>
-      </w:r>
-      <w:proofErr w:type="gramEnd"/>
-      <w:r>
-        <w:rPr>
-          <w:rFonts w:ascii="Consolas" w:eastAsia="Times New Roman" w:hAnsi="Consolas" w:cs="Times New Roman"/>
-          <w:color w:val="448C27"/>
-          <w:kern w:val="0"/>
-          <w:sz w:val="21"/>
-          <w:szCs w:val="21"/>
-          <w:lang w:eastAsia="nl-NL"/>
-          <w14:ligatures w14:val="none"/>
-        </w:rPr>
-        <w:t xml:space="preserve"> the following student thesis:</w:t>
+        <w:t>Please annotate the following student thesis:</w:t>
       </w:r>
     </w:p>
     <w:p>
@@ -4928,33 +5529,7 @@
           <w:lang w:eastAsia="nl-NL"/>
           <w14:ligatures w14:val="none"/>
         </w:rPr>
-        <w:t xml:space="preserve">Please </w:t>
-      </w:r>
-      <w:proofErr w:type="gramStart"/>
-      <w:r>
-        <w:rPr>
-          <w:rFonts w:ascii="Consolas" w:eastAsia="Times New Roman" w:hAnsi="Consolas" w:cs="Times New Roman"/>
-          <w:color w:val="448C27"/>
-          <w:kern w:val="0"/>
-          <w:sz w:val="21"/>
-          <w:szCs w:val="21"/>
-          <w:lang w:eastAsia="nl-NL"/>
-          <w14:ligatures w14:val="none"/>
-        </w:rPr>
-        <w:t>annotate</w:t>
-      </w:r>
-      <w:proofErr w:type="gramEnd"/>
-      <w:r>
-        <w:rPr>
-          <w:rFonts w:ascii="Consolas" w:eastAsia="Times New Roman" w:hAnsi="Consolas" w:cs="Times New Roman"/>
-          <w:color w:val="448C27"/>
-          <w:kern w:val="0"/>
-          <w:sz w:val="21"/>
-          <w:szCs w:val="21"/>
-          <w:lang w:eastAsia="nl-NL"/>
-          <w14:ligatures w14:val="none"/>
-        </w:rPr>
-        <w:t xml:space="preserve"> the following student thesis:</w:t>
+        <w:t>Please annotate the following student thesis:</w:t>
       </w:r>
     </w:p>
     <w:p>
@@ -5079,8 +5654,88 @@
 </w:document>
 </file>
 
+<file path=word/comments.xml><?xml version="1.0" encoding="utf-8"?>
+<w:comments xmlns:wpc="http://schemas.microsoft.com/office/word/2010/wordprocessingCanvas" xmlns:cx="http://schemas.microsoft.com/office/drawing/2014/chartex" xmlns:cx1="http://schemas.microsoft.com/office/drawing/2015/9/8/chartex" xmlns:cx2="http://schemas.microsoft.com/office/drawing/2015/10/21/chartex" xmlns:cx3="http://schemas.microsoft.com/office/drawing/2016/5/9/chartex" xmlns:cx4="http://schemas.microsoft.com/office/drawing/2016/5/10/chartex" xmlns:cx5="http://schemas.microsoft.com/office/drawing/2016/5/11/chartex" xmlns:cx6="http://schemas.microsoft.com/office/drawing/2016/5/12/chartex" xmlns:cx7="http://schemas.microsoft.com/office/drawing/2016/5/13/chartex" xmlns:cx8="http://schemas.microsoft.com/office/drawing/2016/5/14/chartex" xmlns:mc="http://schemas.openxmlformats.org/markup-compatibility/2006" xmlns:aink="http://schemas.microsoft.com/office/drawing/2016/ink" xmlns:am3d="http://schemas.microsoft.com/office/drawing/2017/model3d" xmlns:o="urn:schemas-microsoft-com:office:office" xmlns:oel="http://schemas.microsoft.com/office/2019/extlst" xmlns:r="http://schemas.openxmlformats.org/officeDocument/2006/relationships" xmlns:m="http://schemas.openxmlformats.org/officeDocument/2006/math" xmlns:v="urn:schemas-microsoft-com:vml" xmlns:wp14="http://schemas.microsoft.com/office/word/2010/wordprocessingDrawing" xmlns:wp="http://schemas.openxmlformats.org/drawingml/2006/wordprocessingDrawing" xmlns:w10="urn:schemas-microsoft-com:office:word" xmlns:w="http://schemas.openxmlformats.org/wordprocessingml/2006/main" xmlns:w14="http://schemas.microsoft.com/office/word/2010/wordml" xmlns:w15="http://schemas.microsoft.com/office/word/2012/wordml" xmlns:w16cex="http://schemas.microsoft.com/office/word/2018/wordml/cex" xmlns:w16cid="http://schemas.microsoft.com/office/word/2016/wordml/cid" xmlns:w16="http://schemas.microsoft.com/office/word/2018/wordml" xmlns:w16sdtdh="http://schemas.microsoft.com/office/word/2020/wordml/sdtdatahash" xmlns:w16se="http://schemas.microsoft.com/office/word/2015/wordml/symex" xmlns:wpg="http://schemas.microsoft.com/office/word/2010/wordprocessingGroup" xmlns:wpi="http://schemas.microsoft.com/office/word/2010/wordprocessingInk" xmlns:wne="http://schemas.microsoft.com/office/word/2006/wordml" xmlns:wps="http://schemas.microsoft.com/office/word/2010/wordprocessingShape" mc:Ignorable="w14 w15 w16se w16cid w16 w16cex w16sdtdh wp14">
+  <w:comment w:id="0" w:author="Suchard, O. (Carmel)" w:date="2026-02-14T16:42:00Z" w:initials="SO(">
+    <w:p>
+      <w:pPr>
+        <w:pStyle w:val="CommentText"/>
+        <w:jc w:val="left"/>
+      </w:pPr>
+      <w:r>
+        <w:rPr>
+          <w:rStyle w:val="CommentReference"/>
+        </w:rPr>
+        <w:annotationRef/>
+      </w:r>
+      <w:r>
+        <w:t>Here I obvioulsy need to cite the papers with the findings of the multimodal results. And cite why Gemini was chosen from that paper that I found.</w:t>
+      </w:r>
+    </w:p>
+  </w:comment>
+  <w:comment w:id="1" w:author="Suchard, O. (Carmel)" w:date="2026-02-14T16:50:00Z" w:initials="SO(">
+    <w:p>
+      <w:pPr>
+        <w:pStyle w:val="CommentText"/>
+        <w:jc w:val="left"/>
+      </w:pPr>
+      <w:r>
+        <w:rPr>
+          <w:rStyle w:val="CommentReference"/>
+        </w:rPr>
+        <w:annotationRef/>
+      </w:r>
+      <w:r>
+        <w:t>Maybe here I need to explain more explicitly what this is.</w:t>
+      </w:r>
+    </w:p>
+  </w:comment>
+  <w:comment w:id="2" w:author="Suchard, O. (Carmel)" w:date="2026-02-14T16:57:00Z" w:initials="SO(">
+    <w:p>
+      <w:pPr>
+        <w:pStyle w:val="CommentText"/>
+        <w:jc w:val="left"/>
+      </w:pPr>
+      <w:r>
+        <w:rPr>
+          <w:rStyle w:val="CommentReference"/>
+        </w:rPr>
+        <w:annotationRef/>
+      </w:r>
+      <w:r>
+        <w:t>IDK if this is still relevant</w:t>
+      </w:r>
+    </w:p>
+  </w:comment>
+</w:comments>
+</file>
+
+<file path=word/commentsExtended.xml><?xml version="1.0" encoding="utf-8"?>
+<w15:commentsEx xmlns:wpc="http://schemas.microsoft.com/office/word/2010/wordprocessingCanvas" xmlns:cx="http://schemas.microsoft.com/office/drawing/2014/chartex" xmlns:cx1="http://schemas.microsoft.com/office/drawing/2015/9/8/chartex" xmlns:cx2="http://schemas.microsoft.com/office/drawing/2015/10/21/chartex" xmlns:cx3="http://schemas.microsoft.com/office/drawing/2016/5/9/chartex" xmlns:cx4="http://schemas.microsoft.com/office/drawing/2016/5/10/chartex" xmlns:cx5="http://schemas.microsoft.com/office/drawing/2016/5/11/chartex" xmlns:cx6="http://schemas.microsoft.com/office/drawing/2016/5/12/chartex" xmlns:cx7="http://schemas.microsoft.com/office/drawing/2016/5/13/chartex" xmlns:cx8="http://schemas.microsoft.com/office/drawing/2016/5/14/chartex" xmlns:mc="http://schemas.openxmlformats.org/markup-compatibility/2006" xmlns:aink="http://schemas.microsoft.com/office/drawing/2016/ink" xmlns:am3d="http://schemas.microsoft.com/office/drawing/2017/model3d" xmlns:o="urn:schemas-microsoft-com:office:office" xmlns:oel="http://schemas.microsoft.com/office/2019/extlst" xmlns:r="http://schemas.openxmlformats.org/officeDocument/2006/relationships" xmlns:m="http://schemas.openxmlformats.org/officeDocument/2006/math" xmlns:v="urn:schemas-microsoft-com:vml" xmlns:wp14="http://schemas.microsoft.com/office/word/2010/wordprocessingDrawing" xmlns:wp="http://schemas.openxmlformats.org/drawingml/2006/wordprocessingDrawing" xmlns:w10="urn:schemas-microsoft-com:office:word" xmlns:w="http://schemas.openxmlformats.org/wordprocessingml/2006/main" xmlns:w14="http://schemas.microsoft.com/office/word/2010/wordml" xmlns:w15="http://schemas.microsoft.com/office/word/2012/wordml" xmlns:w16cex="http://schemas.microsoft.com/office/word/2018/wordml/cex" xmlns:w16cid="http://schemas.microsoft.com/office/word/2016/wordml/cid" xmlns:w16="http://schemas.microsoft.com/office/word/2018/wordml" xmlns:w16sdtdh="http://schemas.microsoft.com/office/word/2020/wordml/sdtdatahash" xmlns:w16se="http://schemas.microsoft.com/office/word/2015/wordml/symex" xmlns:wpg="http://schemas.microsoft.com/office/word/2010/wordprocessingGroup" xmlns:wpi="http://schemas.microsoft.com/office/word/2010/wordprocessingInk" xmlns:wne="http://schemas.microsoft.com/office/word/2006/wordml" xmlns:wps="http://schemas.microsoft.com/office/word/2010/wordprocessingShape" mc:Ignorable="w14 w15 w16se w16cid w16 w16cex w16sdtdh wp14">
+  <w15:commentEx w15:paraId="1B5E727B" w15:done="0"/>
+  <w15:commentEx w15:paraId="4C6460F9" w15:done="0"/>
+  <w15:commentEx w15:paraId="0A2E3AF6" w15:done="0"/>
+</w15:commentsEx>
+</file>
+
+<file path=word/commentsExtensible.xml><?xml version="1.0" encoding="utf-8"?>
+<w16cex:commentsExtensible xmlns:wpc="http://schemas.microsoft.com/office/word/2010/wordprocessingCanvas" xmlns:cx="http://schemas.microsoft.com/office/drawing/2014/chartex" xmlns:cx1="http://schemas.microsoft.com/office/drawing/2015/9/8/chartex" xmlns:cx2="http://schemas.microsoft.com/office/drawing/2015/10/21/chartex" xmlns:cx3="http://schemas.microsoft.com/office/drawing/2016/5/9/chartex" xmlns:cx4="http://schemas.microsoft.com/office/drawing/2016/5/10/chartex" xmlns:cx5="http://schemas.microsoft.com/office/drawing/2016/5/11/chartex" xmlns:cx6="http://schemas.microsoft.com/office/drawing/2016/5/12/chartex" xmlns:cx7="http://schemas.microsoft.com/office/drawing/2016/5/13/chartex" xmlns:cx8="http://schemas.microsoft.com/office/drawing/2016/5/14/chartex" xmlns:cr="http://schemas.microsoft.com/office/comments/2020/reactions" xmlns:mc="http://schemas.openxmlformats.org/markup-compatibility/2006" xmlns:aink="http://schemas.microsoft.com/office/drawing/2016/ink" xmlns:am3d="http://schemas.microsoft.com/office/drawing/2017/model3d" xmlns:o="urn:schemas-microsoft-com:office:office" xmlns:oel="http://schemas.microsoft.com/office/2019/extlst" xmlns:r="http://schemas.openxmlformats.org/officeDocument/2006/relationships" xmlns:m="http://schemas.openxmlformats.org/officeDocument/2006/math" xmlns:v="urn:schemas-microsoft-com:vml" xmlns:wp14="http://schemas.microsoft.com/office/word/2010/wordprocessingDrawing" xmlns:wp="http://schemas.openxmlformats.org/drawingml/2006/wordprocessingDrawing" xmlns:w10="urn:schemas-microsoft-com:office:word" xmlns:w="http://schemas.openxmlformats.org/wordprocessingml/2006/main" xmlns:w14="http://schemas.microsoft.com/office/word/2010/wordml" xmlns:w15="http://schemas.microsoft.com/office/word/2012/wordml" xmlns:w16cex="http://schemas.microsoft.com/office/word/2018/wordml/cex" xmlns:w16cid="http://schemas.microsoft.com/office/word/2016/wordml/cid" xmlns:w16="http://schemas.microsoft.com/office/word/2018/wordml" xmlns:w16sdtdh="http://schemas.microsoft.com/office/word/2020/wordml/sdtdatahash" xmlns:w16se="http://schemas.microsoft.com/office/word/2015/wordml/symex" xmlns:wpg="http://schemas.microsoft.com/office/word/2010/wordprocessingGroup" xmlns:wpi="http://schemas.microsoft.com/office/word/2010/wordprocessingInk" xmlns:wne="http://schemas.microsoft.com/office/word/2006/wordml" xmlns:wps="http://schemas.microsoft.com/office/word/2010/wordprocessingShape" mc:Ignorable="w14 w15 w16se w16cid w16 w16cex w16sdtdh cr wp14">
+  <w16cex:commentExtensible w16cex:durableId="2D3B247C" w16cex:dateUtc="2026-02-14T15:42:00Z"/>
+  <w16cex:commentExtensible w16cex:durableId="2D3B265B" w16cex:dateUtc="2026-02-14T15:50:00Z"/>
+  <w16cex:commentExtensible w16cex:durableId="2D3B27ED" w16cex:dateUtc="2026-02-14T15:57:00Z"/>
+</w16cex:commentsExtensible>
+</file>
+
+<file path=word/commentsIds.xml><?xml version="1.0" encoding="utf-8"?>
+<w16cid:commentsIds xmlns:wpc="http://schemas.microsoft.com/office/word/2010/wordprocessingCanvas" xmlns:cx="http://schemas.microsoft.com/office/drawing/2014/chartex" xmlns:cx1="http://schemas.microsoft.com/office/drawing/2015/9/8/chartex" xmlns:cx2="http://schemas.microsoft.com/office/drawing/2015/10/21/chartex" xmlns:cx3="http://schemas.microsoft.com/office/drawing/2016/5/9/chartex" xmlns:cx4="http://schemas.microsoft.com/office/drawing/2016/5/10/chartex" xmlns:cx5="http://schemas.microsoft.com/office/drawing/2016/5/11/chartex" xmlns:cx6="http://schemas.microsoft.com/office/drawing/2016/5/12/chartex" xmlns:cx7="http://schemas.microsoft.com/office/drawing/2016/5/13/chartex" xmlns:cx8="http://schemas.microsoft.com/office/drawing/2016/5/14/chartex" xmlns:mc="http://schemas.openxmlformats.org/markup-compatibility/2006" xmlns:aink="http://schemas.microsoft.com/office/drawing/2016/ink" xmlns:am3d="http://schemas.microsoft.com/office/drawing/2017/model3d" xmlns:o="urn:schemas-microsoft-com:office:office" xmlns:oel="http://schemas.microsoft.com/office/2019/extlst" xmlns:r="http://schemas.openxmlformats.org/officeDocument/2006/relationships" xmlns:m="http://schemas.openxmlformats.org/officeDocument/2006/math" xmlns:v="urn:schemas-microsoft-com:vml" xmlns:wp14="http://schemas.microsoft.com/office/word/2010/wordprocessingDrawing" xmlns:wp="http://schemas.openxmlformats.org/drawingml/2006/wordprocessingDrawing" xmlns:w10="urn:schemas-microsoft-com:office:word" xmlns:w="http://schemas.openxmlformats.org/wordprocessingml/2006/main" xmlns:w14="http://schemas.microsoft.com/office/word/2010/wordml" xmlns:w15="http://schemas.microsoft.com/office/word/2012/wordml" xmlns:w16cex="http://schemas.microsoft.com/office/word/2018/wordml/cex" xmlns:w16cid="http://schemas.microsoft.com/office/word/2016/wordml/cid" xmlns:w16="http://schemas.microsoft.com/office/word/2018/wordml" xmlns:w16sdtdh="http://schemas.microsoft.com/office/word/2020/wordml/sdtdatahash" xmlns:w16se="http://schemas.microsoft.com/office/word/2015/wordml/symex" xmlns:wpg="http://schemas.microsoft.com/office/word/2010/wordprocessingGroup" xmlns:wpi="http://schemas.microsoft.com/office/word/2010/wordprocessingInk" xmlns:wne="http://schemas.microsoft.com/office/word/2006/wordml" xmlns:wps="http://schemas.microsoft.com/office/word/2010/wordprocessingShape" mc:Ignorable="w14 w15 w16se w16cid w16 w16cex w16sdtdh wp14">
+  <w16cid:commentId w16cid:paraId="1B5E727B" w16cid:durableId="2D3B247C"/>
+  <w16cid:commentId w16cid:paraId="4C6460F9" w16cid:durableId="2D3B265B"/>
+  <w16cid:commentId w16cid:paraId="0A2E3AF6" w16cid:durableId="2D3B27ED"/>
+</w16cid:commentsIds>
+</file>
+
 <file path=word/endnotes.xml><?xml version="1.0" encoding="utf-8"?>
-<w:endnotes xmlns:wpc="http://schemas.microsoft.com/office/word/2010/wordprocessingCanvas" xmlns:cx="http://schemas.microsoft.com/office/drawing/2014/chartex" xmlns:cx1="http://schemas.microsoft.com/office/drawing/2015/9/8/chartex" xmlns:cx2="http://schemas.microsoft.com/office/drawing/2015/10/21/chartex" xmlns:cx3="http://schemas.microsoft.com/office/drawing/2016/5/9/chartex" xmlns:cx4="http://schemas.microsoft.com/office/drawing/2016/5/10/chartex" xmlns:cx5="http://schemas.microsoft.com/office/drawing/2016/5/11/chartex" xmlns:cx6="http://schemas.microsoft.com/office/drawing/2016/5/12/chartex" xmlns:cx7="http://schemas.microsoft.com/office/drawing/2016/5/13/chartex" xmlns:cx8="http://schemas.microsoft.com/office/drawing/2016/5/14/chartex" xmlns:mc="http://schemas.openxmlformats.org/markup-compatibility/2006" xmlns:aink="http://schemas.microsoft.com/office/drawing/2016/ink" xmlns:am3d="http://schemas.microsoft.com/office/drawing/2017/model3d" xmlns:o="urn:schemas-microsoft-com:office:office" xmlns:oel="http://schemas.microsoft.com/office/2019/extlst" xmlns:r="http://schemas.openxmlformats.org/officeDocument/2006/relationships" xmlns:m="http://schemas.openxmlformats.org/officeDocument/2006/math" xmlns:v="urn:schemas-microsoft-com:vml" xmlns:wp14="http://schemas.microsoft.com/office/word/2010/wordprocessingDrawing" xmlns:wp="http://schemas.openxmlformats.org/drawingml/2006/wordprocessingDrawing" xmlns:w10="urn:schemas-microsoft-com:office:word" xmlns:w="http://schemas.openxmlformats.org/wordprocessingml/2006/main" xmlns:w14="http://schemas.microsoft.com/office/word/2010/wordml" xmlns:w15="http://schemas.microsoft.com/office/word/2012/wordml" xmlns:w16cex="http://schemas.microsoft.com/office/word/2018/wordml/cex" xmlns:w16cid="http://schemas.microsoft.com/office/word/2016/wordml/cid" xmlns:w16="http://schemas.microsoft.com/office/word/2018/wordml" xmlns:w16du="http://schemas.microsoft.com/office/word/2023/wordml/word16du" xmlns:w16sdtdh="http://schemas.microsoft.com/office/word/2020/wordml/sdtdatahash" xmlns:w16sdtfl="http://schemas.microsoft.com/office/word/2024/wordml/sdtformatlock" xmlns:w16se="http://schemas.microsoft.com/office/word/2015/wordml/symex" xmlns:wpg="http://schemas.microsoft.com/office/word/2010/wordprocessingGroup" xmlns:wpi="http://schemas.microsoft.com/office/word/2010/wordprocessingInk" xmlns:wne="http://schemas.microsoft.com/office/word/2006/wordml" xmlns:wps="http://schemas.microsoft.com/office/word/2010/wordprocessingShape" mc:Ignorable="w14 w15 w16se w16cid w16 w16cex w16sdtdh w16sdtfl w16du wp14">
+<w:endnotes xmlns:wpc="http://schemas.microsoft.com/office/word/2010/wordprocessingCanvas" xmlns:cx="http://schemas.microsoft.com/office/drawing/2014/chartex" xmlns:cx1="http://schemas.microsoft.com/office/drawing/2015/9/8/chartex" xmlns:cx2="http://schemas.microsoft.com/office/drawing/2015/10/21/chartex" xmlns:cx3="http://schemas.microsoft.com/office/drawing/2016/5/9/chartex" xmlns:cx4="http://schemas.microsoft.com/office/drawing/2016/5/10/chartex" xmlns:cx5="http://schemas.microsoft.com/office/drawing/2016/5/11/chartex" xmlns:cx6="http://schemas.microsoft.com/office/drawing/2016/5/12/chartex" xmlns:cx7="http://schemas.microsoft.com/office/drawing/2016/5/13/chartex" xmlns:cx8="http://schemas.microsoft.com/office/drawing/2016/5/14/chartex" xmlns:mc="http://schemas.openxmlformats.org/markup-compatibility/2006" xmlns:aink="http://schemas.microsoft.com/office/drawing/2016/ink" xmlns:am3d="http://schemas.microsoft.com/office/drawing/2017/model3d" xmlns:o="urn:schemas-microsoft-com:office:office" xmlns:oel="http://schemas.microsoft.com/office/2019/extlst" xmlns:r="http://schemas.openxmlformats.org/officeDocument/2006/relationships" xmlns:m="http://schemas.openxmlformats.org/officeDocument/2006/math" xmlns:v="urn:schemas-microsoft-com:vml" xmlns:wp14="http://schemas.microsoft.com/office/word/2010/wordprocessingDrawing" xmlns:wp="http://schemas.openxmlformats.org/drawingml/2006/wordprocessingDrawing" xmlns:w10="urn:schemas-microsoft-com:office:word" xmlns:w="http://schemas.openxmlformats.org/wordprocessingml/2006/main" xmlns:w14="http://schemas.microsoft.com/office/word/2010/wordml" xmlns:w15="http://schemas.microsoft.com/office/word/2012/wordml" xmlns:w16cex="http://schemas.microsoft.com/office/word/2018/wordml/cex" xmlns:w16cid="http://schemas.microsoft.com/office/word/2016/wordml/cid" xmlns:w16="http://schemas.microsoft.com/office/word/2018/wordml" xmlns:w16sdtdh="http://schemas.microsoft.com/office/word/2020/wordml/sdtdatahash" xmlns:w16se="http://schemas.microsoft.com/office/word/2015/wordml/symex" xmlns:wpg="http://schemas.microsoft.com/office/word/2010/wordprocessingGroup" xmlns:wpi="http://schemas.microsoft.com/office/word/2010/wordprocessingInk" xmlns:wne="http://schemas.microsoft.com/office/word/2006/wordml" xmlns:wps="http://schemas.microsoft.com/office/word/2010/wordprocessingShape" mc:Ignorable="w14 w15 w16se w16cid w16 w16cex w16sdtdh wp14">
   <w:endnote w:type="separator" w:id="-1">
     <w:p>
       <w:pPr>
@@ -5105,7 +5760,7 @@
 </file>
 
 <file path=word/footnotes.xml><?xml version="1.0" encoding="utf-8"?>
-<w:footnotes xmlns:wpc="http://schemas.microsoft.com/office/word/2010/wordprocessingCanvas" xmlns:cx="http://schemas.microsoft.com/office/drawing/2014/chartex" xmlns:cx1="http://schemas.microsoft.com/office/drawing/2015/9/8/chartex" xmlns:cx2="http://schemas.microsoft.com/office/drawing/2015/10/21/chartex" xmlns:cx3="http://schemas.microsoft.com/office/drawing/2016/5/9/chartex" xmlns:cx4="http://schemas.microsoft.com/office/drawing/2016/5/10/chartex" xmlns:cx5="http://schemas.microsoft.com/office/drawing/2016/5/11/chartex" xmlns:cx6="http://schemas.microsoft.com/office/drawing/2016/5/12/chartex" xmlns:cx7="http://schemas.microsoft.com/office/drawing/2016/5/13/chartex" xmlns:cx8="http://schemas.microsoft.com/office/drawing/2016/5/14/chartex" xmlns:mc="http://schemas.openxmlformats.org/markup-compatibility/2006" xmlns:aink="http://schemas.microsoft.com/office/drawing/2016/ink" xmlns:am3d="http://schemas.microsoft.com/office/drawing/2017/model3d" xmlns:o="urn:schemas-microsoft-com:office:office" xmlns:oel="http://schemas.microsoft.com/office/2019/extlst" xmlns:r="http://schemas.openxmlformats.org/officeDocument/2006/relationships" xmlns:m="http://schemas.openxmlformats.org/officeDocument/2006/math" xmlns:v="urn:schemas-microsoft-com:vml" xmlns:wp14="http://schemas.microsoft.com/office/word/2010/wordprocessingDrawing" xmlns:wp="http://schemas.openxmlformats.org/drawingml/2006/wordprocessingDrawing" xmlns:w10="urn:schemas-microsoft-com:office:word" xmlns:w="http://schemas.openxmlformats.org/wordprocessingml/2006/main" xmlns:w14="http://schemas.microsoft.com/office/word/2010/wordml" xmlns:w15="http://schemas.microsoft.com/office/word/2012/wordml" xmlns:w16cex="http://schemas.microsoft.com/office/word/2018/wordml/cex" xmlns:w16cid="http://schemas.microsoft.com/office/word/2016/wordml/cid" xmlns:w16="http://schemas.microsoft.com/office/word/2018/wordml" xmlns:w16du="http://schemas.microsoft.com/office/word/2023/wordml/word16du" xmlns:w16sdtdh="http://schemas.microsoft.com/office/word/2020/wordml/sdtdatahash" xmlns:w16sdtfl="http://schemas.microsoft.com/office/word/2024/wordml/sdtformatlock" xmlns:w16se="http://schemas.microsoft.com/office/word/2015/wordml/symex" xmlns:wpg="http://schemas.microsoft.com/office/word/2010/wordprocessingGroup" xmlns:wpi="http://schemas.microsoft.com/office/word/2010/wordprocessingInk" xmlns:wne="http://schemas.microsoft.com/office/word/2006/wordml" xmlns:wps="http://schemas.microsoft.com/office/word/2010/wordprocessingShape" mc:Ignorable="w14 w15 w16se w16cid w16 w16cex w16sdtdh w16sdtfl w16du wp14">
+<w:footnotes xmlns:wpc="http://schemas.microsoft.com/office/word/2010/wordprocessingCanvas" xmlns:cx="http://schemas.microsoft.com/office/drawing/2014/chartex" xmlns:cx1="http://schemas.microsoft.com/office/drawing/2015/9/8/chartex" xmlns:cx2="http://schemas.microsoft.com/office/drawing/2015/10/21/chartex" xmlns:cx3="http://schemas.microsoft.com/office/drawing/2016/5/9/chartex" xmlns:cx4="http://schemas.microsoft.com/office/drawing/2016/5/10/chartex" xmlns:cx5="http://schemas.microsoft.com/office/drawing/2016/5/11/chartex" xmlns:cx6="http://schemas.microsoft.com/office/drawing/2016/5/12/chartex" xmlns:cx7="http://schemas.microsoft.com/office/drawing/2016/5/13/chartex" xmlns:cx8="http://schemas.microsoft.com/office/drawing/2016/5/14/chartex" xmlns:mc="http://schemas.openxmlformats.org/markup-compatibility/2006" xmlns:aink="http://schemas.microsoft.com/office/drawing/2016/ink" xmlns:am3d="http://schemas.microsoft.com/office/drawing/2017/model3d" xmlns:o="urn:schemas-microsoft-com:office:office" xmlns:oel="http://schemas.microsoft.com/office/2019/extlst" xmlns:r="http://schemas.openxmlformats.org/officeDocument/2006/relationships" xmlns:m="http://schemas.openxmlformats.org/officeDocument/2006/math" xmlns:v="urn:schemas-microsoft-com:vml" xmlns:wp14="http://schemas.microsoft.com/office/word/2010/wordprocessingDrawing" xmlns:wp="http://schemas.openxmlformats.org/drawingml/2006/wordprocessingDrawing" xmlns:w10="urn:schemas-microsoft-com:office:word" xmlns:w="http://schemas.openxmlformats.org/wordprocessingml/2006/main" xmlns:w14="http://schemas.microsoft.com/office/word/2010/wordml" xmlns:w15="http://schemas.microsoft.com/office/word/2012/wordml" xmlns:w16cex="http://schemas.microsoft.com/office/word/2018/wordml/cex" xmlns:w16cid="http://schemas.microsoft.com/office/word/2016/wordml/cid" xmlns:w16="http://schemas.microsoft.com/office/word/2018/wordml" xmlns:w16sdtdh="http://schemas.microsoft.com/office/word/2020/wordml/sdtdatahash" xmlns:w16se="http://schemas.microsoft.com/office/word/2015/wordml/symex" xmlns:wpg="http://schemas.microsoft.com/office/word/2010/wordprocessingGroup" xmlns:wpi="http://schemas.microsoft.com/office/word/2010/wordprocessingInk" xmlns:wne="http://schemas.microsoft.com/office/word/2006/wordml" xmlns:wps="http://schemas.microsoft.com/office/word/2010/wordprocessingShape" mc:Ignorable="w14 w15 w16se w16cid w16 w16cex w16sdtdh wp14">
   <w:footnote w:type="separator" w:id="-1">
     <w:p>
       <w:pPr>
@@ -5161,6 +5816,25 @@
       </w:r>
       <w:r>
         <w:t>https://ai.google.dev/gemini-api/docs/prompting-strategies</w:t>
+      </w:r>
+    </w:p>
+  </w:footnote>
+  <w:footnote w:id="3">
+    <w:p>
+      <w:pPr>
+        <w:pStyle w:val="FootnoteText"/>
+      </w:pPr>
+      <w:r>
+        <w:rPr>
+          <w:rStyle w:val="FootnoteReference"/>
+        </w:rPr>
+        <w:footnoteRef/>
+      </w:r>
+      <w:r>
+        <w:t xml:space="preserve"> </w:t>
+      </w:r>
+      <w:r>
+        <w:t>https://huggingface.co/GroNLP/bert-base-dutch-cased</w:t>
       </w:r>
     </w:p>
   </w:footnote>
@@ -5168,7 +5842,7 @@
 </file>
 
 <file path=word/numbering.xml><?xml version="1.0" encoding="utf-8"?>
-<w:numbering xmlns:wpc="http://schemas.microsoft.com/office/word/2010/wordprocessingCanvas" xmlns:cx="http://schemas.microsoft.com/office/drawing/2014/chartex" xmlns:cx1="http://schemas.microsoft.com/office/drawing/2015/9/8/chartex" xmlns:cx2="http://schemas.microsoft.com/office/drawing/2015/10/21/chartex" xmlns:cx3="http://schemas.microsoft.com/office/drawing/2016/5/9/chartex" xmlns:cx4="http://schemas.microsoft.com/office/drawing/2016/5/10/chartex" xmlns:cx5="http://schemas.microsoft.com/office/drawing/2016/5/11/chartex" xmlns:cx6="http://schemas.microsoft.com/office/drawing/2016/5/12/chartex" xmlns:cx7="http://schemas.microsoft.com/office/drawing/2016/5/13/chartex" xmlns:cx8="http://schemas.microsoft.com/office/drawing/2016/5/14/chartex" xmlns:mc="http://schemas.openxmlformats.org/markup-compatibility/2006" xmlns:aink="http://schemas.microsoft.com/office/drawing/2016/ink" xmlns:am3d="http://schemas.microsoft.com/office/drawing/2017/model3d" xmlns:o="urn:schemas-microsoft-com:office:office" xmlns:oel="http://schemas.microsoft.com/office/2019/extlst" xmlns:r="http://schemas.openxmlformats.org/officeDocument/2006/relationships" xmlns:m="http://schemas.openxmlformats.org/officeDocument/2006/math" xmlns:v="urn:schemas-microsoft-com:vml" xmlns:wp14="http://schemas.microsoft.com/office/word/2010/wordprocessingDrawing" xmlns:wp="http://schemas.openxmlformats.org/drawingml/2006/wordprocessingDrawing" xmlns:w10="urn:schemas-microsoft-com:office:word" xmlns:w="http://schemas.openxmlformats.org/wordprocessingml/2006/main" xmlns:w14="http://schemas.microsoft.com/office/word/2010/wordml" xmlns:w15="http://schemas.microsoft.com/office/word/2012/wordml" xmlns:w16cex="http://schemas.microsoft.com/office/word/2018/wordml/cex" xmlns:w16cid="http://schemas.microsoft.com/office/word/2016/wordml/cid" xmlns:w16="http://schemas.microsoft.com/office/word/2018/wordml" xmlns:w16du="http://schemas.microsoft.com/office/word/2023/wordml/word16du" xmlns:w16sdtdh="http://schemas.microsoft.com/office/word/2020/wordml/sdtdatahash" xmlns:w16sdtfl="http://schemas.microsoft.com/office/word/2024/wordml/sdtformatlock" xmlns:w16se="http://schemas.microsoft.com/office/word/2015/wordml/symex" xmlns:wpg="http://schemas.microsoft.com/office/word/2010/wordprocessingGroup" xmlns:wpi="http://schemas.microsoft.com/office/word/2010/wordprocessingInk" xmlns:wne="http://schemas.microsoft.com/office/word/2006/wordml" xmlns:wps="http://schemas.microsoft.com/office/word/2010/wordprocessingShape" mc:Ignorable="w14 w15 w16se w16cid w16 w16cex w16sdtdh w16sdtfl w16du wp14">
+<w:numbering xmlns:wpc="http://schemas.microsoft.com/office/word/2010/wordprocessingCanvas" xmlns:cx="http://schemas.microsoft.com/office/drawing/2014/chartex" xmlns:cx1="http://schemas.microsoft.com/office/drawing/2015/9/8/chartex" xmlns:cx2="http://schemas.microsoft.com/office/drawing/2015/10/21/chartex" xmlns:cx3="http://schemas.microsoft.com/office/drawing/2016/5/9/chartex" xmlns:cx4="http://schemas.microsoft.com/office/drawing/2016/5/10/chartex" xmlns:cx5="http://schemas.microsoft.com/office/drawing/2016/5/11/chartex" xmlns:cx6="http://schemas.microsoft.com/office/drawing/2016/5/12/chartex" xmlns:cx7="http://schemas.microsoft.com/office/drawing/2016/5/13/chartex" xmlns:cx8="http://schemas.microsoft.com/office/drawing/2016/5/14/chartex" xmlns:mc="http://schemas.openxmlformats.org/markup-compatibility/2006" xmlns:aink="http://schemas.microsoft.com/office/drawing/2016/ink" xmlns:am3d="http://schemas.microsoft.com/office/drawing/2017/model3d" xmlns:o="urn:schemas-microsoft-com:office:office" xmlns:oel="http://schemas.microsoft.com/office/2019/extlst" xmlns:r="http://schemas.openxmlformats.org/officeDocument/2006/relationships" xmlns:m="http://schemas.openxmlformats.org/officeDocument/2006/math" xmlns:v="urn:schemas-microsoft-com:vml" xmlns:wp14="http://schemas.microsoft.com/office/word/2010/wordprocessingDrawing" xmlns:wp="http://schemas.openxmlformats.org/drawingml/2006/wordprocessingDrawing" xmlns:w10="urn:schemas-microsoft-com:office:word" xmlns:w="http://schemas.openxmlformats.org/wordprocessingml/2006/main" xmlns:w14="http://schemas.microsoft.com/office/word/2010/wordml" xmlns:w15="http://schemas.microsoft.com/office/word/2012/wordml" xmlns:w16cex="http://schemas.microsoft.com/office/word/2018/wordml/cex" xmlns:w16cid="http://schemas.microsoft.com/office/word/2016/wordml/cid" xmlns:w16="http://schemas.microsoft.com/office/word/2018/wordml" xmlns:w16sdtdh="http://schemas.microsoft.com/office/word/2020/wordml/sdtdatahash" xmlns:w16se="http://schemas.microsoft.com/office/word/2015/wordml/symex" xmlns:wpg="http://schemas.microsoft.com/office/word/2010/wordprocessingGroup" xmlns:wpi="http://schemas.microsoft.com/office/word/2010/wordprocessingInk" xmlns:wne="http://schemas.microsoft.com/office/word/2006/wordml" xmlns:wps="http://schemas.microsoft.com/office/word/2010/wordprocessingShape" mc:Ignorable="w14 w15 w16se w16cid w16 w16cex w16sdtdh wp14">
   <w:abstractNum w:abstractNumId="0" w15:restartNumberingAfterBreak="0">
     <w:nsid w:val="3DDE38C8"/>
     <w:multiLevelType w:val="hybridMultilevel"/>
@@ -5404,8 +6078,16 @@
 </w:numbering>
 </file>
 
+<file path=word/people.xml><?xml version="1.0" encoding="utf-8"?>
+<w15:people xmlns:wpc="http://schemas.microsoft.com/office/word/2010/wordprocessingCanvas" xmlns:cx="http://schemas.microsoft.com/office/drawing/2014/chartex" xmlns:cx1="http://schemas.microsoft.com/office/drawing/2015/9/8/chartex" xmlns:cx2="http://schemas.microsoft.com/office/drawing/2015/10/21/chartex" xmlns:cx3="http://schemas.microsoft.com/office/drawing/2016/5/9/chartex" xmlns:cx4="http://schemas.microsoft.com/office/drawing/2016/5/10/chartex" xmlns:cx5="http://schemas.microsoft.com/office/drawing/2016/5/11/chartex" xmlns:cx6="http://schemas.microsoft.com/office/drawing/2016/5/12/chartex" xmlns:cx7="http://schemas.microsoft.com/office/drawing/2016/5/13/chartex" xmlns:cx8="http://schemas.microsoft.com/office/drawing/2016/5/14/chartex" xmlns:mc="http://schemas.openxmlformats.org/markup-compatibility/2006" xmlns:aink="http://schemas.microsoft.com/office/drawing/2016/ink" xmlns:am3d="http://schemas.microsoft.com/office/drawing/2017/model3d" xmlns:o="urn:schemas-microsoft-com:office:office" xmlns:oel="http://schemas.microsoft.com/office/2019/extlst" xmlns:r="http://schemas.openxmlformats.org/officeDocument/2006/relationships" xmlns:m="http://schemas.openxmlformats.org/officeDocument/2006/math" xmlns:v="urn:schemas-microsoft-com:vml" xmlns:wp14="http://schemas.microsoft.com/office/word/2010/wordprocessingDrawing" xmlns:wp="http://schemas.openxmlformats.org/drawingml/2006/wordprocessingDrawing" xmlns:w10="urn:schemas-microsoft-com:office:word" xmlns:w="http://schemas.openxmlformats.org/wordprocessingml/2006/main" xmlns:w14="http://schemas.microsoft.com/office/word/2010/wordml" xmlns:w15="http://schemas.microsoft.com/office/word/2012/wordml" xmlns:w16cex="http://schemas.microsoft.com/office/word/2018/wordml/cex" xmlns:w16cid="http://schemas.microsoft.com/office/word/2016/wordml/cid" xmlns:w16="http://schemas.microsoft.com/office/word/2018/wordml" xmlns:w16sdtdh="http://schemas.microsoft.com/office/word/2020/wordml/sdtdatahash" xmlns:w16se="http://schemas.microsoft.com/office/word/2015/wordml/symex" xmlns:wpg="http://schemas.microsoft.com/office/word/2010/wordprocessingGroup" xmlns:wpi="http://schemas.microsoft.com/office/word/2010/wordprocessingInk" xmlns:wne="http://schemas.microsoft.com/office/word/2006/wordml" xmlns:wps="http://schemas.microsoft.com/office/word/2010/wordprocessingShape" mc:Ignorable="w14 w15 w16se w16cid w16 w16cex w16sdtdh wp14">
+  <w15:person w15:author="Suchard, O. (Carmel)">
+    <w15:presenceInfo w15:providerId="AD" w15:userId="S::o.suchard@uu.nl::e0702fe5-9d97-4682-889c-c2be6ccaa09d"/>
+  </w15:person>
+</w15:people>
+</file>
+
 <file path=word/styles.xml><?xml version="1.0" encoding="utf-8"?>
-<w:styles xmlns:mc="http://schemas.openxmlformats.org/markup-compatibility/2006" xmlns:r="http://schemas.openxmlformats.org/officeDocument/2006/relationships" xmlns:w="http://schemas.openxmlformats.org/wordprocessingml/2006/main" xmlns:w14="http://schemas.microsoft.com/office/word/2010/wordml" xmlns:w15="http://schemas.microsoft.com/office/word/2012/wordml" xmlns:w16cex="http://schemas.microsoft.com/office/word/2018/wordml/cex" xmlns:w16cid="http://schemas.microsoft.com/office/word/2016/wordml/cid" xmlns:w16="http://schemas.microsoft.com/office/word/2018/wordml" xmlns:w16du="http://schemas.microsoft.com/office/word/2023/wordml/word16du" xmlns:w16sdtdh="http://schemas.microsoft.com/office/word/2020/wordml/sdtdatahash" xmlns:w16sdtfl="http://schemas.microsoft.com/office/word/2024/wordml/sdtformatlock" xmlns:w16se="http://schemas.microsoft.com/office/word/2015/wordml/symex" mc:Ignorable="w14 w15 w16se w16cid w16 w16cex w16sdtdh w16sdtfl w16du">
+<w:styles xmlns:mc="http://schemas.openxmlformats.org/markup-compatibility/2006" xmlns:r="http://schemas.openxmlformats.org/officeDocument/2006/relationships" xmlns:w="http://schemas.openxmlformats.org/wordprocessingml/2006/main" xmlns:w14="http://schemas.microsoft.com/office/word/2010/wordml" xmlns:w15="http://schemas.microsoft.com/office/word/2012/wordml" xmlns:w16cex="http://schemas.microsoft.com/office/word/2018/wordml/cex" xmlns:w16cid="http://schemas.microsoft.com/office/word/2016/wordml/cid" xmlns:w16="http://schemas.microsoft.com/office/word/2018/wordml" xmlns:w16sdtdh="http://schemas.microsoft.com/office/word/2020/wordml/sdtdatahash" xmlns:w16se="http://schemas.microsoft.com/office/word/2015/wordml/symex" mc:Ignorable="w14 w15 w16se w16cid w16 w16cex w16sdtdh">
   <w:docDefaults>
     <w:rPrDefault>
       <w:rPr>
@@ -6034,6 +6716,7 @@
   <w:style w:type="character" w:default="1" w:styleId="DefaultParagraphFont">
     <w:name w:val="Default Paragraph Font"/>
     <w:uiPriority w:val="1"/>
+    <w:semiHidden/>
     <w:unhideWhenUsed/>
   </w:style>
   <w:style w:type="table" w:default="1" w:styleId="TableNormal">
@@ -6869,4 +7552,16 @@
     </a:ext>
   </a:extLst>
 </a:theme>
+</file>
+
+<file path=customXml/item1.xml><?xml version="1.0" encoding="utf-8"?>
+<b:Sources xmlns:b="http://schemas.openxmlformats.org/officeDocument/2006/bibliography" xmlns="http://schemas.openxmlformats.org/officeDocument/2006/bibliography" SelectedStyle="\APASixthEditionOfficeOnline.xsl" StyleName="APA" Version="6"/>
+</file>
+
+<file path=customXml/itemProps1.xml><?xml version="1.0" encoding="utf-8"?>
+<ds:datastoreItem xmlns:ds="http://schemas.openxmlformats.org/officeDocument/2006/customXml" ds:itemID="{04A07CA3-2EBE-4FB0-95B6-98213A04199C}">
+  <ds:schemaRefs>
+    <ds:schemaRef ds:uri="http://schemas.openxmlformats.org/officeDocument/2006/bibliography"/>
+  </ds:schemaRefs>
+</ds:datastoreItem>
 </file>
</xml_diff>

<commit_message>
Edited NER model comparison
</commit_message>
<xml_diff>
--- a/writing/Carmel_Suchard_NER_model_comparison.docx
+++ b/writing/Carmel_Suchard_NER_model_comparison.docx
@@ -67,25 +67,13 @@
     </w:p>
     <w:p>
       <w:r>
-        <w:t xml:space="preserve">The </w:t>
-      </w:r>
-      <w:r>
-        <w:t>challenges</w:t>
-      </w:r>
-      <w:r>
-        <w:t xml:space="preserve"> of entity extraction</w:t>
+        <w:t>The challenges of entity extraction</w:t>
       </w:r>
       <w:r>
         <w:t>,</w:t>
       </w:r>
       <w:r>
-        <w:t xml:space="preserve"> and the model</w:t>
-      </w:r>
-      <w:r>
-        <w:t>s</w:t>
-      </w:r>
-      <w:r>
-        <w:t xml:space="preserve"> required for this task, depend on the categorization of the labels as objective or subjective. Bibliometric labels – </w:t>
+        <w:t xml:space="preserve"> and the models required for this task, depend on the categorization of the labels as objective or subjective. Bibliometric labels – </w:t>
       </w:r>
       <w:r>
         <w:rPr>
@@ -381,9 +369,11 @@
             <w:pPr>
               <w:jc w:val="left"/>
             </w:pPr>
+            <w:proofErr w:type="spellStart"/>
             <w:r>
               <w:t>InGroup</w:t>
             </w:r>
+            <w:proofErr w:type="spellEnd"/>
           </w:p>
         </w:tc>
         <w:tc>
@@ -438,6 +428,11 @@
       </w:r>
     </w:p>
     <w:p>
+      <w:pPr>
+        <w:rPr>
+          <w:lang w:val="nl-NL"/>
+        </w:rPr>
+      </w:pPr>
       <w:r>
         <w:t xml:space="preserve">As an example, </w:t>
       </w:r>
@@ -451,7 +446,66 @@
         <w:t xml:space="preserve"> the title page of a 1971 thesis as it was scanned, and as it was converted to text by OCR software and manually annotated. </w:t>
       </w:r>
       <w:r>
-        <w:t>Labels extracted from this text are:</w:t>
+        <w:rPr>
+          <w:lang w:val="nl-NL"/>
+        </w:rPr>
+        <w:t xml:space="preserve">Labels </w:t>
+      </w:r>
+      <w:proofErr w:type="spellStart"/>
+      <w:r>
+        <w:rPr>
+          <w:lang w:val="nl-NL"/>
+        </w:rPr>
+        <w:t>extracted</w:t>
+      </w:r>
+      <w:proofErr w:type="spellEnd"/>
+      <w:r>
+        <w:rPr>
+          <w:lang w:val="nl-NL"/>
+        </w:rPr>
+        <w:t xml:space="preserve"> </w:t>
+      </w:r>
+      <w:proofErr w:type="spellStart"/>
+      <w:r>
+        <w:rPr>
+          <w:lang w:val="nl-NL"/>
+        </w:rPr>
+        <w:t>from</w:t>
+      </w:r>
+      <w:proofErr w:type="spellEnd"/>
+      <w:r>
+        <w:rPr>
+          <w:lang w:val="nl-NL"/>
+        </w:rPr>
+        <w:t xml:space="preserve"> </w:t>
+      </w:r>
+      <w:proofErr w:type="spellStart"/>
+      <w:r>
+        <w:rPr>
+          <w:lang w:val="nl-NL"/>
+        </w:rPr>
+        <w:t>this</w:t>
+      </w:r>
+      <w:proofErr w:type="spellEnd"/>
+      <w:r>
+        <w:rPr>
+          <w:lang w:val="nl-NL"/>
+        </w:rPr>
+        <w:t xml:space="preserve"> </w:t>
+      </w:r>
+      <w:proofErr w:type="spellStart"/>
+      <w:r>
+        <w:rPr>
+          <w:lang w:val="nl-NL"/>
+        </w:rPr>
+        <w:t>text</w:t>
+      </w:r>
+      <w:proofErr w:type="spellEnd"/>
+      <w:r>
+        <w:rPr>
+          <w:lang w:val="nl-NL"/>
+        </w:rPr>
+        <w:t xml:space="preserve"> are:</w:t>
       </w:r>
     </w:p>
     <w:p>
@@ -461,6 +515,7 @@
           <w:lang w:val="nl-NL"/>
         </w:rPr>
       </w:pPr>
+      <w:proofErr w:type="spellStart"/>
       <w:r>
         <w:rPr>
           <w:b/>
@@ -470,17 +525,12 @@
         <w:lastRenderedPageBreak/>
         <w:t>Title</w:t>
       </w:r>
+      <w:proofErr w:type="spellEnd"/>
       <w:r>
         <w:rPr>
           <w:lang w:val="nl-NL"/>
         </w:rPr>
-        <w:t xml:space="preserve">: </w:t>
-      </w:r>
-      <w:r>
-        <w:rPr>
-          <w:lang w:val="nl-NL"/>
-        </w:rPr>
-        <w:t xml:space="preserve">ONTWIKKELINGEN IN DE INDUSTRIËLE STRUCTUUR VAN ZUID - WEST - NEDERLAND </w:t>
+        <w:t xml:space="preserve">: ONTWIKKELINGEN IN DE INDUSTRIËLE STRUCTUUR VAN ZUID - WEST - NEDERLAND </w:t>
       </w:r>
       <w:r>
         <w:rPr>
@@ -527,9 +577,11 @@
       <w:r>
         <w:t>F*</w:t>
       </w:r>
+      <w:proofErr w:type="spellStart"/>
       <w:r>
         <w:t>Abcouwer</w:t>
       </w:r>
+      <w:proofErr w:type="spellEnd"/>
     </w:p>
     <w:p>
       <w:pPr>
@@ -543,12 +595,28 @@
         <w:t>Issued</w:t>
       </w:r>
       <w:r>
-        <w:t>: february 1971</w:t>
-      </w:r>
-    </w:p>
-    <w:p>
-      <w:r>
-        <w:t>A human annotator could easily see that that these are small character recognition mistakes, but a a model evaluation procedure which is based on string similarity would not.</w:t>
+        <w:t xml:space="preserve">: </w:t>
+      </w:r>
+      <w:proofErr w:type="spellStart"/>
+      <w:r>
+        <w:t>february</w:t>
+      </w:r>
+      <w:proofErr w:type="spellEnd"/>
+      <w:r>
+        <w:t xml:space="preserve"> 1971</w:t>
+      </w:r>
+    </w:p>
+    <w:p>
+      <w:r>
+        <w:t xml:space="preserve">A human annotator could easily see that that these are small character recognition mistakes, but a </w:t>
+      </w:r>
+      <w:proofErr w:type="spellStart"/>
+      <w:r>
+        <w:t>a</w:t>
+      </w:r>
+      <w:proofErr w:type="spellEnd"/>
+      <w:r>
+        <w:t xml:space="preserve"> model evaluation procedure which is based on string similarity would not.</w:t>
       </w:r>
     </w:p>
     <w:tbl>
@@ -568,6 +636,9 @@
           </w:tcPr>
           <w:p>
             <w:r>
+              <w:rPr>
+                <w:noProof/>
+              </w:rPr>
               <w:drawing>
                 <wp:inline distT="0" distB="0" distL="0" distR="0" wp14:anchorId="20DB7DE7" wp14:editId="1F79CB41">
                   <wp:extent cx="3943553" cy="5105662"/>
@@ -612,7 +683,6 @@
           </w:tcPr>
           <w:p>
             <w:pPr>
-              <w:spacing w:after="0" w:line="240" w:lineRule="auto"/>
               <w:rPr>
                 <w:lang w:val="nl-NL"/>
               </w:rPr>
@@ -621,12 +691,19 @@
               <w:rPr>
                 <w:lang w:val="nl-NL"/>
               </w:rPr>
-              <w:t>ONTWIKKELINGEN B-title</w:t>
-            </w:r>
+              <w:t>ONTWIKKELINGEN B-</w:t>
+            </w:r>
+            <w:proofErr w:type="spellStart"/>
+            <w:r>
+              <w:rPr>
+                <w:lang w:val="nl-NL"/>
+              </w:rPr>
+              <w:t>title</w:t>
+            </w:r>
+            <w:proofErr w:type="spellEnd"/>
           </w:p>
           <w:p>
             <w:pPr>
-              <w:spacing w:after="0" w:line="240" w:lineRule="auto"/>
               <w:rPr>
                 <w:lang w:val="nl-NL"/>
               </w:rPr>
@@ -635,212 +712,166 @@
               <w:rPr>
                 <w:lang w:val="nl-NL"/>
               </w:rPr>
-              <w:t>IN I-title</w:t>
-            </w:r>
-          </w:p>
-          <w:p>
-            <w:pPr>
-              <w:spacing w:after="0" w:line="240" w:lineRule="auto"/>
-            </w:pPr>
+              <w:t>IN I-</w:t>
+            </w:r>
+            <w:proofErr w:type="spellStart"/>
+            <w:r>
+              <w:rPr>
+                <w:lang w:val="nl-NL"/>
+              </w:rPr>
+              <w:t>title</w:t>
+            </w:r>
+            <w:proofErr w:type="spellEnd"/>
+          </w:p>
+          <w:p>
             <w:r>
               <w:t>DE I-title</w:t>
             </w:r>
           </w:p>
           <w:p>
-            <w:pPr>
-              <w:spacing w:after="0" w:line="240" w:lineRule="auto"/>
-            </w:pPr>
             <w:r>
               <w:t>INDUSTRIËLE I-title</w:t>
             </w:r>
           </w:p>
           <w:p>
-            <w:pPr>
-              <w:spacing w:after="0" w:line="240" w:lineRule="auto"/>
-            </w:pPr>
             <w:r>
               <w:t>STRUCTUUR I-title</w:t>
             </w:r>
           </w:p>
           <w:p>
-            <w:pPr>
-              <w:spacing w:after="0" w:line="240" w:lineRule="auto"/>
-            </w:pPr>
             <w:r>
               <w:t>VAN I-title</w:t>
             </w:r>
           </w:p>
           <w:p>
-            <w:pPr>
-              <w:spacing w:after="0" w:line="240" w:lineRule="auto"/>
-            </w:pPr>
             <w:r>
               <w:t>ZUID I-title</w:t>
             </w:r>
           </w:p>
           <w:p>
-            <w:pPr>
-              <w:spacing w:after="0" w:line="240" w:lineRule="auto"/>
-            </w:pPr>
             <w:r>
               <w:t>- I-title</w:t>
             </w:r>
           </w:p>
           <w:p>
-            <w:pPr>
-              <w:spacing w:after="0" w:line="240" w:lineRule="auto"/>
-            </w:pPr>
             <w:r>
               <w:t>WEST I-title</w:t>
             </w:r>
           </w:p>
           <w:p>
-            <w:pPr>
-              <w:spacing w:after="0" w:line="240" w:lineRule="auto"/>
-            </w:pPr>
             <w:r>
               <w:t>- I-title</w:t>
             </w:r>
           </w:p>
           <w:p>
-            <w:pPr>
-              <w:spacing w:after="0" w:line="240" w:lineRule="auto"/>
-            </w:pPr>
             <w:r>
               <w:t>NEDERLAND I-title</w:t>
             </w:r>
           </w:p>
           <w:p>
-            <w:pPr>
-              <w:spacing w:after="0" w:line="240" w:lineRule="auto"/>
-            </w:pPr>
             <w:r>
               <w:t>1945 I-title</w:t>
             </w:r>
           </w:p>
           <w:p>
-            <w:pPr>
-              <w:spacing w:after="0" w:line="240" w:lineRule="auto"/>
-            </w:pPr>
             <w:r>
               <w:t>- I-title</w:t>
             </w:r>
           </w:p>
           <w:p>
-            <w:pPr>
-              <w:spacing w:after="0" w:line="240" w:lineRule="auto"/>
-            </w:pPr>
             <w:r>
               <w:t>19 I-title</w:t>
             </w:r>
           </w:p>
           <w:p>
-            <w:pPr>
-              <w:spacing w:after="0" w:line="240" w:lineRule="auto"/>
-            </w:pPr>
             <w:r>
               <w:t>7 I-title</w:t>
             </w:r>
           </w:p>
           <w:p>
-            <w:pPr>
-              <w:spacing w:after="0" w:line="240" w:lineRule="auto"/>
-            </w:pPr>
             <w:r>
               <w:t>0 I-title</w:t>
             </w:r>
           </w:p>
           <w:p>
-            <w:pPr>
-              <w:spacing w:after="0" w:line="240" w:lineRule="auto"/>
-            </w:pPr>
-            <w:r>
-              <w:t>een B-title</w:t>
-            </w:r>
-          </w:p>
-          <w:p>
-            <w:pPr>
-              <w:spacing w:after="0" w:line="240" w:lineRule="auto"/>
-            </w:pPr>
-            <w:r>
-              <w:t>sociaal-geografische I-title</w:t>
-            </w:r>
-          </w:p>
-          <w:p>
-            <w:pPr>
-              <w:spacing w:after="0" w:line="240" w:lineRule="auto"/>
-            </w:pPr>
-            <w:r>
-              <w:t>verkenning I-title</w:t>
-            </w:r>
-          </w:p>
-          <w:p>
-            <w:pPr>
-              <w:spacing w:after="0" w:line="240" w:lineRule="auto"/>
-            </w:pPr>
+            <w:proofErr w:type="spellStart"/>
+            <w:r>
+              <w:t>een</w:t>
+            </w:r>
+            <w:proofErr w:type="spellEnd"/>
+            <w:r>
+              <w:t xml:space="preserve"> B-title</w:t>
+            </w:r>
+          </w:p>
+          <w:p>
+            <w:proofErr w:type="spellStart"/>
+            <w:r>
+              <w:t>sociaal-geografische</w:t>
+            </w:r>
+            <w:proofErr w:type="spellEnd"/>
+            <w:r>
+              <w:t xml:space="preserve"> I-title</w:t>
+            </w:r>
+          </w:p>
+          <w:p>
+            <w:proofErr w:type="spellStart"/>
+            <w:r>
+              <w:t>verkenning</w:t>
+            </w:r>
+            <w:proofErr w:type="spellEnd"/>
+            <w:r>
+              <w:t xml:space="preserve"> I-title</w:t>
+            </w:r>
+          </w:p>
+          <w:p>
             <w:r>
               <w:t>N O</w:t>
             </w:r>
           </w:p>
           <w:p>
-            <w:pPr>
-              <w:spacing w:after="0" w:line="240" w:lineRule="auto"/>
-            </w:pPr>
             <w:r>
               <w:t>. O</w:t>
             </w:r>
           </w:p>
-          <w:p>
-            <w:pPr>
-              <w:spacing w:after="0" w:line="240" w:lineRule="auto"/>
-            </w:pPr>
-          </w:p>
-          <w:p>
-            <w:pPr>
-              <w:spacing w:after="0" w:line="240" w:lineRule="auto"/>
-            </w:pPr>
+          <w:p/>
+          <w:p>
             <w:r>
               <w:t>F B-author</w:t>
             </w:r>
           </w:p>
           <w:p>
-            <w:pPr>
-              <w:spacing w:after="0" w:line="240" w:lineRule="auto"/>
-            </w:pPr>
             <w:r>
               <w:t>* I-author</w:t>
             </w:r>
           </w:p>
           <w:p>
-            <w:pPr>
-              <w:spacing w:after="0" w:line="240" w:lineRule="auto"/>
-            </w:pPr>
-            <w:r>
-              <w:t>Abcouwer I-author</w:t>
-            </w:r>
-          </w:p>
-          <w:p>
-            <w:pPr>
-              <w:spacing w:after="0" w:line="240" w:lineRule="auto"/>
-            </w:pPr>
+            <w:proofErr w:type="spellStart"/>
+            <w:r>
+              <w:t>Abcouwer</w:t>
+            </w:r>
+            <w:proofErr w:type="spellEnd"/>
+            <w:r>
+              <w:t xml:space="preserve"> I-author</w:t>
+            </w:r>
+          </w:p>
+          <w:p>
             <w:r>
               <w:t>Utrecht O</w:t>
             </w:r>
           </w:p>
           <w:p>
-            <w:pPr>
-              <w:spacing w:after="0" w:line="240" w:lineRule="auto"/>
-            </w:pPr>
             <w:r>
               <w:t>, O</w:t>
             </w:r>
           </w:p>
           <w:p>
-            <w:pPr>
-              <w:spacing w:after="0" w:line="240" w:lineRule="auto"/>
-            </w:pPr>
-            <w:r>
-              <w:t>februari B-issued</w:t>
+            <w:proofErr w:type="spellStart"/>
+            <w:r>
+              <w:t>februari</w:t>
+            </w:r>
+            <w:proofErr w:type="spellEnd"/>
+            <w:r>
+              <w:t xml:space="preserve"> B-issued</w:t>
             </w:r>
           </w:p>
           <w:p>
@@ -884,10 +915,7 @@
         <w:spacing w:line="276" w:lineRule="auto"/>
       </w:pPr>
       <w:r>
-        <w:t>For the extraction of objective labels, a</w:t>
-      </w:r>
-      <w:r>
-        <w:t xml:space="preserve"> preliminary experiment compared two model types: </w:t>
+        <w:t xml:space="preserve">For the extraction of objective labels, a preliminary experiment compared two model types: </w:t>
       </w:r>
       <w:r>
         <w:rPr>
@@ -923,116 +951,151 @@
       </w:r>
       <w:commentRangeStart w:id="0"/>
       <w:r>
-        <w:t xml:space="preserve">general-purpose generative AI model developed by Google. The models were evaluated on their performance in the </w:t>
+        <w:t xml:space="preserve">general-purpose generative AI model developed by Google. </w:t>
+      </w:r>
+      <w:r>
+        <w:t>In addition, Gemini</w:t>
+      </w:r>
+      <w:r>
+        <w:t xml:space="preserve"> was __ tasked as a zero-shot task and with training data. </w:t>
+      </w:r>
+      <w:r>
+        <w:t xml:space="preserve">The models were evaluated on their performance in the </w:t>
+      </w:r>
+      <w:r>
+        <w:t xml:space="preserve">task of extracting the </w:t>
+      </w:r>
+      <w:r>
+        <w:rPr>
+          <w:i/>
+          <w:iCs/>
+        </w:rPr>
+        <w:t>title</w:t>
+      </w:r>
+      <w:r>
+        <w:t xml:space="preserve">, </w:t>
+      </w:r>
+      <w:r>
+        <w:rPr>
+          <w:i/>
+          <w:iCs/>
+        </w:rPr>
+        <w:t xml:space="preserve">author, </w:t>
+      </w:r>
+      <w:r>
+        <w:t xml:space="preserve">and </w:t>
+      </w:r>
+      <w:r>
+        <w:rPr>
+          <w:i/>
+          <w:iCs/>
+        </w:rPr>
+        <w:t>issued</w:t>
+      </w:r>
+      <w:r>
+        <w:t xml:space="preserve"> labels from the training dataset</w:t>
+      </w:r>
+      <w:r>
+        <w:t>.</w:t>
+      </w:r>
+      <w:r>
+        <w:t xml:space="preserve"> </w:t>
+      </w:r>
+      <w:commentRangeEnd w:id="0"/>
+      <w:r>
+        <w:rPr>
+          <w:rStyle w:val="CommentReference"/>
+        </w:rPr>
+        <w:commentReference w:id="0"/>
+      </w:r>
+    </w:p>
+    <w:p>
+      <w:r>
+        <w:t xml:space="preserve">To </w:t>
+      </w:r>
+      <w:r>
+        <w:t xml:space="preserve">reduce noise and to </w:t>
+      </w:r>
+      <w:r>
+        <w:t xml:space="preserve">enable </w:t>
+      </w:r>
+      <w:r>
+        <w:t xml:space="preserve">a fair </w:t>
+      </w:r>
+      <w:r>
+        <w:t>comparison between the models we limited the inputs to sections where the key information was likeliest to be found. For the BERT model, the text of each thesis was reduced to the first 1,000 words that have more than one character. This was done because</w:t>
+      </w:r>
+      <w:r>
+        <w:t xml:space="preserve"> </w:t>
+      </w:r>
+      <w:r>
+        <w:t xml:space="preserve">the OCR </w:t>
+      </w:r>
+      <w:r>
+        <w:t xml:space="preserve">software </w:t>
+      </w:r>
+      <w:r>
+        <w:t xml:space="preserve">can create hundreds of one-character words out of, for example, a decorative dividing line made of dashes. </w:t>
+      </w:r>
+      <w:r>
+        <w:t xml:space="preserve">For Gemini, </w:t>
+      </w:r>
+      <w:r>
+        <w:t xml:space="preserve">PDF </w:t>
+      </w:r>
+      <w:r>
+        <w:t>files</w:t>
+      </w:r>
+      <w:r>
+        <w:t xml:space="preserve"> of each thesis were reduced to the first three pages, which are always title pages. Each of the resulting text and PDF documents were manually checked to ensure that they contained the three objective labels. Automating the reduction of inputs to where the key information was located both improved the processing time and made it scalable to the entire archive for future inference.</w:t>
+      </w:r>
+      <w:commentRangeStart w:id="1"/>
+    </w:p>
+    <w:p>
+      <w:r>
+        <w:t xml:space="preserve">During development, </w:t>
+      </w:r>
+      <w:r>
+        <w:t>BERT and the few-shot Gemin</w:t>
+      </w:r>
+      <w:commentRangeEnd w:id="1"/>
+      <w:r>
+        <w:rPr>
+          <w:rStyle w:val="CommentReference"/>
+        </w:rPr>
+        <w:commentReference w:id="1"/>
+      </w:r>
+      <w:r>
+        <w:t>i models were trained</w:t>
+      </w:r>
+      <w:r>
+        <w:t xml:space="preserve"> using a </w:t>
+      </w:r>
+      <w:r>
+        <w:t>K-Fold cross-validation strategy with K=5</w:t>
+      </w:r>
+      <w:r>
+        <w:t xml:space="preserve">. </w:t>
+      </w:r>
+      <w:r>
+        <w:t xml:space="preserve">At each fold, 80% of the data was used for training and 20% for evaluation. The </w:t>
+      </w:r>
+      <w:r>
+        <w:t xml:space="preserve">recall, precision, </w:t>
+      </w:r>
+      <w:proofErr w:type="spellStart"/>
+      <w:r>
+        <w:t>overll</w:t>
+      </w:r>
+      <w:proofErr w:type="spellEnd"/>
+      <w:r>
+        <w:t xml:space="preserve"> score of best-performing epoch was saved, and the result of the folds were averaged together to determine the overall success of the model. In addition, the annotated theses were dividing into folds using a document-level splitting strategy. This approach was chosen over random sequence-level splitting chiefly to reflect real-world document processing and achieve a relatively balanced distribution of label types between training and validation, effectively serving as a stratified K-fold cross-validating strategy</w:t>
       </w:r>
       <w:r>
         <w:rPr>
           <w:highlight w:val="yellow"/>
         </w:rPr>
-        <w:t>NER</w:t>
-      </w:r>
-      <w:r>
-        <w:t xml:space="preserve"> task, using the same labeling scheme and rules that were used by the human annotators.</w:t>
-      </w:r>
-      <w:r>
-        <w:t xml:space="preserve"> </w:t>
-      </w:r>
-      <w:commentRangeEnd w:id="0"/>
-      <w:r>
-        <w:rPr>
-          <w:rStyle w:val="CommentReference"/>
-        </w:rPr>
-        <w:commentReference w:id="0"/>
-      </w:r>
-    </w:p>
-    <w:p>
-      <w:r>
-        <w:t xml:space="preserve">To enable comparison between </w:t>
-      </w:r>
-      <w:r>
-        <w:t xml:space="preserve">the models on the KEI task, we limited the inputs to sections where the key information was likeliest to be found. For the BERT model, the text of each thesis was reduced to the first 1,000 words that have more than one character. </w:t>
-      </w:r>
-      <w:r>
-        <w:t xml:space="preserve">This was done </w:t>
-      </w:r>
-      <w:r>
-        <w:t xml:space="preserve">because </w:t>
-      </w:r>
-      <w:r>
-        <w:t xml:space="preserve">sometimes the OCR can create hundreds of </w:t>
-      </w:r>
-      <w:r>
-        <w:t>one-character words</w:t>
-      </w:r>
-      <w:r>
-        <w:t xml:space="preserve"> out of, for example, a </w:t>
-      </w:r>
-      <w:r>
-        <w:t>decorative</w:t>
-      </w:r>
-      <w:r>
-        <w:t xml:space="preserve"> </w:t>
-      </w:r>
-      <w:r>
-        <w:t xml:space="preserve">dividing </w:t>
-      </w:r>
-      <w:r>
-        <w:t>line made of dashes.</w:t>
-      </w:r>
-      <w:r>
-        <w:t xml:space="preserve"> PDF documents of each thesis were reduced to the first three pages, which are always title pages. Each of the resulting text and PDF documents were manually checked to ensure that they contained the three objective labels. Automating the reduction of inputs to where the key information was located both improved the processing time and made it scalable to the entire archive for future inference.</w:t>
-      </w:r>
-    </w:p>
-    <w:p>
-      <w:r>
-        <w:t>During development, b</w:t>
-      </w:r>
-      <w:commentRangeStart w:id="1"/>
-      <w:r>
-        <w:t xml:space="preserve">oth models were evaluated using a </w:t>
-      </w:r>
-      <w:r>
-        <w:t xml:space="preserve">K-Fold cross-validation strategy with K=5.  </w:t>
-      </w:r>
-      <w:commentRangeEnd w:id="1"/>
-      <w:r>
-        <w:rPr>
-          <w:rStyle w:val="CommentReference"/>
-        </w:rPr>
-        <w:commentReference w:id="1"/>
-      </w:r>
-      <w:r>
-        <w:t>At each fold, 80% of the data was used for training and 20% for evaluation. The F1 score of best-performing epoch was saved, and the result of the folds were averaged together to determine the overall success of the model. In addition, the annotated theses were dividing into folds using</w:t>
-      </w:r>
-      <w:r>
-        <w:t xml:space="preserve"> </w:t>
-      </w:r>
-      <w:r>
-        <w:t xml:space="preserve">a </w:t>
-      </w:r>
-      <w:r>
-        <w:t>document-level splitting strategy</w:t>
-      </w:r>
-      <w:r>
-        <w:t xml:space="preserve">. </w:t>
-      </w:r>
-      <w:r>
-        <w:t>This approach was chosen over random sequence-level splitting chiefly to reflect real-world document processing and achieve a relatively balanced distribution of label types between training and validation</w:t>
-      </w:r>
-      <w:r>
-        <w:t>, effectively serving as a stratified K-fold cross-validating strategy</w:t>
-      </w:r>
-      <w:r>
-        <w:rPr>
-          <w:highlight w:val="yellow"/>
-        </w:rPr>
-        <w:t xml:space="preserve">. </w:t>
-      </w:r>
-      <w:r>
-        <w:rPr>
-          <w:highlight w:val="yellow"/>
-        </w:rPr>
-        <w:t xml:space="preserve"> </w:t>
+        <w:t xml:space="preserve">.  </w:t>
       </w:r>
       <w:commentRangeStart w:id="2"/>
       <w:r>
@@ -1086,7 +1149,15 @@
         <w:fldChar w:fldCharType="end"/>
       </w:r>
       <w:r>
-        <w:t xml:space="preserve">. Through transfer learning, it can be fine-tuned on annotated training data for specific NLP tasks. This study used BERTje, a monolingual Dutch BERT model with a token-level classification head for sequence labeling tasks </w:t>
+        <w:t xml:space="preserve">. Through transfer learning, it can be fine-tuned on annotated training data for specific NLP tasks. This study used </w:t>
+      </w:r>
+      <w:proofErr w:type="spellStart"/>
+      <w:r>
+        <w:t>BERTje</w:t>
+      </w:r>
+      <w:proofErr w:type="spellEnd"/>
+      <w:r>
+        <w:t xml:space="preserve">, a monolingual Dutch BERT model with a token-level classification head for sequence labeling tasks </w:t>
       </w:r>
       <w:r>
         <w:fldChar w:fldCharType="begin"/>
@@ -1115,7 +1186,15 @@
         <w:spacing w:line="276" w:lineRule="auto"/>
       </w:pPr>
       <w:r>
-        <w:t>The BERTje checkpoint</w:t>
+        <w:t xml:space="preserve">The </w:t>
+      </w:r>
+      <w:proofErr w:type="spellStart"/>
+      <w:r>
+        <w:t>BERTje</w:t>
+      </w:r>
+      <w:proofErr w:type="spellEnd"/>
+      <w:r>
+        <w:t xml:space="preserve"> checkpoint</w:t>
       </w:r>
       <w:r>
         <w:rPr>
@@ -1124,11 +1203,11 @@
         <w:footnoteReference w:id="1"/>
       </w:r>
       <w:r>
-        <w:t xml:space="preserve"> was fine-tuned on two versions of the training dataset to assess the effect of label sample size. The original BIO labeling scheme resulted in 13 possible labels, leading to a small sample size for per class. To avoid this, the documents were re-labeled with an IO (inside-outside) </w:t>
+        <w:t xml:space="preserve"> was fine-tuned on two versions of the training dataset to assess the effect of label sample size. The original BIO labeling scheme resulted in 13 possible labels, leading to a small </w:t>
       </w:r>
       <w:r>
         <w:lastRenderedPageBreak/>
-        <w:t xml:space="preserve">scheme. This reduced the number of labels, increased the sample size of each, and made explicit that that tokens that were previously labeled with B or I and the same label type are semantically related. </w:t>
+        <w:t xml:space="preserve">sample size for per class. To avoid this, the documents were re-labeled with an IO (inside-outside) scheme. This reduced the number of labels, increased the sample size of each, and made explicit that that tokens that were previously labeled with B or I and the same label type are semantically related. </w:t>
       </w:r>
     </w:p>
     <w:p/>
@@ -1392,47 +1471,72 @@
           <w:i/>
           <w:iCs/>
         </w:rPr>
-        <w:t>“Nieuwegein”</w:t>
-      </w:r>
-      <w:r>
-        <w:t xml:space="preserve"> was </w:t>
-      </w:r>
-      <w:r>
-        <w:t xml:space="preserve">labeled as </w:t>
-      </w:r>
+        <w:t>“</w:t>
+      </w:r>
+      <w:proofErr w:type="spellStart"/>
       <w:r>
         <w:rPr>
           <w:i/>
           <w:iCs/>
         </w:rPr>
-        <w:t>spatial</w:t>
-      </w:r>
+        <w:t>Nieuwegein</w:t>
+      </w:r>
+      <w:proofErr w:type="spellEnd"/>
       <w:r>
         <w:rPr>
           <w:i/>
           <w:iCs/>
         </w:rPr>
-        <w:t xml:space="preserve"> </w:t>
-      </w:r>
-      <w:r>
-        <w:t xml:space="preserve">in a given </w:t>
-      </w:r>
-      <w:r>
-        <w:t xml:space="preserve">thesis, and the model </w:t>
-      </w:r>
-      <w:r>
-        <w:t>predicted</w:t>
-      </w:r>
-      <w:r>
-        <w:t xml:space="preserve"> </w:t>
+        <w:t>”</w:t>
+      </w:r>
+      <w:r>
+        <w:t xml:space="preserve"> was </w:t>
+      </w:r>
+      <w:r>
+        <w:t xml:space="preserve">labeled as </w:t>
       </w:r>
       <w:r>
         <w:rPr>
           <w:i/>
           <w:iCs/>
         </w:rPr>
-        <w:t>“Nieuwegein</w:t>
-      </w:r>
+        <w:t>spatial</w:t>
+      </w:r>
+      <w:r>
+        <w:rPr>
+          <w:i/>
+          <w:iCs/>
+        </w:rPr>
+        <w:t xml:space="preserve"> </w:t>
+      </w:r>
+      <w:r>
+        <w:t xml:space="preserve">in a given </w:t>
+      </w:r>
+      <w:r>
+        <w:t xml:space="preserve">thesis, and the model </w:t>
+      </w:r>
+      <w:r>
+        <w:t>predicted</w:t>
+      </w:r>
+      <w:r>
+        <w:t xml:space="preserve"> </w:t>
+      </w:r>
+      <w:r>
+        <w:rPr>
+          <w:i/>
+          <w:iCs/>
+        </w:rPr>
+        <w:t>“</w:t>
+      </w:r>
+      <w:proofErr w:type="spellStart"/>
+      <w:r>
+        <w:rPr>
+          <w:i/>
+          <w:iCs/>
+        </w:rPr>
+        <w:t>Nieuwegein</w:t>
+      </w:r>
+      <w:proofErr w:type="spellEnd"/>
       <w:r>
         <w:rPr>
           <w:i/>
@@ -2176,7 +2280,15 @@
         <w:t xml:space="preserve"> the right label, but also whether the entity span matches exactly the reference or only partially overlaps with it </w:t>
       </w:r>
       <w:r>
-        <w:t>(Seow et al., 202</w:t>
+        <w:t>(</w:t>
+      </w:r>
+      <w:proofErr w:type="spellStart"/>
+      <w:r>
+        <w:t>Seow</w:t>
+      </w:r>
+      <w:proofErr w:type="spellEnd"/>
+      <w:r>
+        <w:t xml:space="preserve"> et al., 202</w:t>
       </w:r>
       <w:r>
         <w:t xml:space="preserve">5). </w:t>
@@ -2269,8 +2381,13 @@
       <w:r>
         <w:t xml:space="preserve">with </w:t>
       </w:r>
-      <w:r>
-        <w:t xml:space="preserve">Levenstein </w:t>
+      <w:proofErr w:type="spellStart"/>
+      <w:r>
+        <w:t>Levenstein</w:t>
+      </w:r>
+      <w:proofErr w:type="spellEnd"/>
+      <w:r>
+        <w:t xml:space="preserve"> </w:t>
       </w:r>
       <w:r>
         <w:t>D</w:t>
@@ -2287,8 +2404,13 @@
       <w:r>
         <w:t xml:space="preserve">Normalized </w:t>
       </w:r>
-      <w:r>
-        <w:t xml:space="preserve">Levenstein </w:t>
+      <w:proofErr w:type="spellStart"/>
+      <w:r>
+        <w:t>Levenstein</w:t>
+      </w:r>
+      <w:proofErr w:type="spellEnd"/>
+      <w:r>
+        <w:t xml:space="preserve"> </w:t>
       </w:r>
       <w:r>
         <w:t>D</w:t>
@@ -2417,10 +2539,18 @@
         <w:t>This study used</w:t>
       </w:r>
       <w:r>
-        <w:t xml:space="preserve"> BERTj</w:t>
-      </w:r>
-      <w:r>
-        <w:t xml:space="preserve">e, </w:t>
+        <w:t xml:space="preserve"> </w:t>
+      </w:r>
+      <w:proofErr w:type="spellStart"/>
+      <w:r>
+        <w:t>BERTj</w:t>
+      </w:r>
+      <w:r>
+        <w:t>e</w:t>
+      </w:r>
+      <w:proofErr w:type="spellEnd"/>
+      <w:r>
+        <w:t xml:space="preserve">, </w:t>
       </w:r>
       <w:r>
         <w:t>a monolingual Dutch BERT model with a token-level classification head for sequence labeling tasks</w:t>
@@ -2456,7 +2586,15 @@
       </w:pPr>
       <w:r>
         <w:lastRenderedPageBreak/>
-        <w:t>The BERTje checkpoint</w:t>
+        <w:t xml:space="preserve">The </w:t>
+      </w:r>
+      <w:proofErr w:type="spellStart"/>
+      <w:r>
+        <w:t>BERTje</w:t>
+      </w:r>
+      <w:proofErr w:type="spellEnd"/>
+      <w:r>
+        <w:t xml:space="preserve"> checkpoint</w:t>
       </w:r>
       <w:r>
         <w:rPr>
@@ -3035,8 +3173,13 @@
               <w:jc w:val="center"/>
             </w:pPr>
             <w:r>
-              <w:t>I-inGroup</w:t>
-            </w:r>
+              <w:t>I-</w:t>
+            </w:r>
+            <w:proofErr w:type="spellStart"/>
+            <w:r>
+              <w:t>inGroup</w:t>
+            </w:r>
+            <w:proofErr w:type="spellEnd"/>
           </w:p>
         </w:tc>
         <w:tc>
@@ -3310,8 +3453,13 @@
               <w:jc w:val="center"/>
             </w:pPr>
             <w:r>
-              <w:t>B-inGroup</w:t>
-            </w:r>
+              <w:t>B-</w:t>
+            </w:r>
+            <w:proofErr w:type="spellStart"/>
+            <w:r>
+              <w:t>inGroup</w:t>
+            </w:r>
+            <w:proofErr w:type="spellEnd"/>
           </w:p>
         </w:tc>
         <w:tc>
@@ -3546,7 +3694,7 @@
                 <w:noProof/>
               </w:rPr>
               <w:drawing>
-                <wp:inline distT="0" distB="0" distL="0" distR="0" wp14:anchorId="2B097BA5" wp14:editId="51D32F53">
+                <wp:inline distT="0" distB="0" distL="0" distR="0" wp14:anchorId="2B097BA5" wp14:editId="53918A10">
                   <wp:extent cx="2591187" cy="1554480"/>
                   <wp:effectExtent l="0" t="0" r="0" b="7620"/>
                   <wp:docPr id="913220108" name="Picture 12"/>
@@ -3610,7 +3758,7 @@
                 <w:noProof/>
               </w:rPr>
               <w:drawing>
-                <wp:inline distT="0" distB="0" distL="0" distR="0" wp14:anchorId="378B7171" wp14:editId="1E05712B">
+                <wp:inline distT="0" distB="0" distL="0" distR="0" wp14:anchorId="378B7171" wp14:editId="41ED9C4A">
                   <wp:extent cx="2591187" cy="1554480"/>
                   <wp:effectExtent l="0" t="0" r="0" b="7620"/>
                   <wp:docPr id="779736674" name="Picture 13"/>
@@ -3681,7 +3829,7 @@
               </w:rPr>
               <w:lastRenderedPageBreak/>
               <w:drawing>
-                <wp:inline distT="0" distB="0" distL="0" distR="0" wp14:anchorId="1C4A4BB7" wp14:editId="3F4A3CA6">
+                <wp:inline distT="0" distB="0" distL="0" distR="0" wp14:anchorId="1C4A4BB7" wp14:editId="321A9C5E">
                   <wp:extent cx="2591187" cy="1554480"/>
                   <wp:effectExtent l="0" t="0" r="0" b="7620"/>
                   <wp:docPr id="94020838" name="Picture 14"/>
@@ -3745,7 +3893,7 @@
                 <w:noProof/>
               </w:rPr>
               <w:drawing>
-                <wp:inline distT="0" distB="0" distL="0" distR="0" wp14:anchorId="6D27AE8D" wp14:editId="24F7537A">
+                <wp:inline distT="0" distB="0" distL="0" distR="0" wp14:anchorId="6D27AE8D" wp14:editId="34440FB0">
                   <wp:extent cx="2591187" cy="1554480"/>
                   <wp:effectExtent l="0" t="0" r="0" b="7620"/>
                   <wp:docPr id="1247163256" name="Picture 15"/>
@@ -3854,7 +4002,7 @@
                 <w:noProof/>
               </w:rPr>
               <w:drawing>
-                <wp:inline distT="0" distB="0" distL="0" distR="0" wp14:anchorId="6530FD25" wp14:editId="322A89DB">
+                <wp:inline distT="0" distB="0" distL="0" distR="0" wp14:anchorId="6530FD25" wp14:editId="5E0656FD">
                   <wp:extent cx="2589878" cy="1554480"/>
                   <wp:effectExtent l="0" t="0" r="1270" b="7620"/>
                   <wp:docPr id="1777130799" name="Picture 2"/>
@@ -4052,7 +4200,7 @@
                 <w:noProof/>
               </w:rPr>
               <w:drawing>
-                <wp:inline distT="0" distB="0" distL="0" distR="0" wp14:anchorId="3F5275A1" wp14:editId="337F353F">
+                <wp:inline distT="0" distB="0" distL="0" distR="0" wp14:anchorId="3F5275A1" wp14:editId="4F8936C1">
                   <wp:extent cx="2589880" cy="1554480"/>
                   <wp:effectExtent l="0" t="0" r="1270" b="7620"/>
                   <wp:docPr id="129154295" name="Picture 10"/>
@@ -4407,7 +4555,33 @@
           <w:lang w:eastAsia="nl-NL"/>
           <w14:ligatures w14:val="none"/>
         </w:rPr>
-        <w:t>subject (Concept that is the main subject of the thesis), inGroup (the group of persons studied), or as O (empty label). Non-empty labeled can start with a B- to indicate the beginning of an entity span,</w:t>
+        <w:t xml:space="preserve">subject (Concept that is the main subject of the thesis), </w:t>
+      </w:r>
+      <w:proofErr w:type="spellStart"/>
+      <w:r>
+        <w:rPr>
+          <w:rFonts w:ascii="Consolas" w:eastAsia="Times New Roman" w:hAnsi="Consolas" w:cs="Times New Roman"/>
+          <w:color w:val="448C27"/>
+          <w:kern w:val="0"/>
+          <w:sz w:val="21"/>
+          <w:szCs w:val="21"/>
+          <w:lang w:eastAsia="nl-NL"/>
+          <w14:ligatures w14:val="none"/>
+        </w:rPr>
+        <w:t>inGroup</w:t>
+      </w:r>
+      <w:proofErr w:type="spellEnd"/>
+      <w:r>
+        <w:rPr>
+          <w:rFonts w:ascii="Consolas" w:eastAsia="Times New Roman" w:hAnsi="Consolas" w:cs="Times New Roman"/>
+          <w:color w:val="448C27"/>
+          <w:kern w:val="0"/>
+          <w:sz w:val="21"/>
+          <w:szCs w:val="21"/>
+          <w:lang w:eastAsia="nl-NL"/>
+          <w14:ligatures w14:val="none"/>
+        </w:rPr>
+        <w:t xml:space="preserve"> (the group of persons studied), or as O (empty label). Non-empty labeled can start with a B- to indicate the beginning of an entity span,</w:t>
       </w:r>
       <w:r>
         <w:rPr>
@@ -4663,7 +4837,33 @@
           <w:lang w:eastAsia="nl-NL"/>
           <w14:ligatures w14:val="none"/>
         </w:rPr>
-        <w:t>• inGroup: should be specific for the research design</w:t>
+        <w:t xml:space="preserve">• </w:t>
+      </w:r>
+      <w:proofErr w:type="spellStart"/>
+      <w:r>
+        <w:rPr>
+          <w:rFonts w:ascii="Consolas" w:eastAsia="Times New Roman" w:hAnsi="Consolas" w:cs="Times New Roman"/>
+          <w:color w:val="448C27"/>
+          <w:kern w:val="0"/>
+          <w:sz w:val="21"/>
+          <w:szCs w:val="21"/>
+          <w:lang w:eastAsia="nl-NL"/>
+          <w14:ligatures w14:val="none"/>
+        </w:rPr>
+        <w:t>inGroup</w:t>
+      </w:r>
+      <w:proofErr w:type="spellEnd"/>
+      <w:r>
+        <w:rPr>
+          <w:rFonts w:ascii="Consolas" w:eastAsia="Times New Roman" w:hAnsi="Consolas" w:cs="Times New Roman"/>
+          <w:color w:val="448C27"/>
+          <w:kern w:val="0"/>
+          <w:sz w:val="21"/>
+          <w:szCs w:val="21"/>
+          <w:lang w:eastAsia="nl-NL"/>
+          <w14:ligatures w14:val="none"/>
+        </w:rPr>
+        <w:t>: should be specific for the research design</w:t>
       </w:r>
     </w:p>
     <w:p>
@@ -5221,7 +5421,33 @@
           <w:lang w:eastAsia="nl-NL"/>
           <w14:ligatures w14:val="none"/>
         </w:rPr>
-        <w:t>subject (Concept that is the main subject of the thesis), inGroup (the group of persons studied), or as O (empty label). Return it as a JSON, where each key is a label and each value is a list of entities that have that label.</w:t>
+        <w:t xml:space="preserve">subject (Concept that is the main subject of the thesis), </w:t>
+      </w:r>
+      <w:proofErr w:type="spellStart"/>
+      <w:r>
+        <w:rPr>
+          <w:rFonts w:ascii="Consolas" w:eastAsia="Times New Roman" w:hAnsi="Consolas" w:cs="Times New Roman"/>
+          <w:color w:val="448C27"/>
+          <w:kern w:val="0"/>
+          <w:sz w:val="21"/>
+          <w:szCs w:val="21"/>
+          <w:lang w:eastAsia="nl-NL"/>
+          <w14:ligatures w14:val="none"/>
+        </w:rPr>
+        <w:t>inGroup</w:t>
+      </w:r>
+      <w:proofErr w:type="spellEnd"/>
+      <w:r>
+        <w:rPr>
+          <w:rFonts w:ascii="Consolas" w:eastAsia="Times New Roman" w:hAnsi="Consolas" w:cs="Times New Roman"/>
+          <w:color w:val="448C27"/>
+          <w:kern w:val="0"/>
+          <w:sz w:val="21"/>
+          <w:szCs w:val="21"/>
+          <w:lang w:eastAsia="nl-NL"/>
+          <w14:ligatures w14:val="none"/>
+        </w:rPr>
+        <w:t xml:space="preserve"> (the group of persons studied), or as O (empty label). Return it as a JSON, where each key is a label and each value is a list of entities that have that label.</w:t>
       </w:r>
       <w:r>
         <w:rPr>
@@ -5429,7 +5655,33 @@
           <w:lang w:eastAsia="nl-NL"/>
           <w14:ligatures w14:val="none"/>
         </w:rPr>
-        <w:t>• inGroup: should be specific for the research design</w:t>
+        <w:t xml:space="preserve">• </w:t>
+      </w:r>
+      <w:proofErr w:type="spellStart"/>
+      <w:r>
+        <w:rPr>
+          <w:rFonts w:ascii="Consolas" w:eastAsia="Times New Roman" w:hAnsi="Consolas" w:cs="Times New Roman"/>
+          <w:color w:val="448C27"/>
+          <w:kern w:val="0"/>
+          <w:sz w:val="21"/>
+          <w:szCs w:val="21"/>
+          <w:lang w:eastAsia="nl-NL"/>
+          <w14:ligatures w14:val="none"/>
+        </w:rPr>
+        <w:t>inGroup</w:t>
+      </w:r>
+      <w:proofErr w:type="spellEnd"/>
+      <w:r>
+        <w:rPr>
+          <w:rFonts w:ascii="Consolas" w:eastAsia="Times New Roman" w:hAnsi="Consolas" w:cs="Times New Roman"/>
+          <w:color w:val="448C27"/>
+          <w:kern w:val="0"/>
+          <w:sz w:val="21"/>
+          <w:szCs w:val="21"/>
+          <w:lang w:eastAsia="nl-NL"/>
+          <w14:ligatures w14:val="none"/>
+        </w:rPr>
+        <w:t>: should be specific for the research design</w:t>
       </w:r>
     </w:p>
     <w:p>
@@ -5673,7 +5925,7 @@
       </w:r>
     </w:p>
   </w:comment>
-  <w:comment w:id="1" w:author="Suchard, O. (Carmel)" w:date="2026-02-14T16:50:00Z" w:initials="SO(">
+  <w:comment w:id="1" w:author="Suchard, O. (Carmel)" w:date="2026-02-25T01:52:00Z" w:initials="SO(">
     <w:p>
       <w:pPr>
         <w:pStyle w:val="CommentText"/>
@@ -5686,7 +5938,7 @@
         <w:annotationRef/>
       </w:r>
       <w:r>
-        <w:t>Maybe here I need to explain more explicitly what this is.</w:t>
+        <w:t>OMG, here I need to add all of my evaluation section!!!</w:t>
       </w:r>
     </w:p>
   </w:comment>
@@ -5713,7 +5965,7 @@
 <file path=word/commentsExtended.xml><?xml version="1.0" encoding="utf-8"?>
 <w15:commentsEx xmlns:wpc="http://schemas.microsoft.com/office/word/2010/wordprocessingCanvas" xmlns:cx="http://schemas.microsoft.com/office/drawing/2014/chartex" xmlns:cx1="http://schemas.microsoft.com/office/drawing/2015/9/8/chartex" xmlns:cx2="http://schemas.microsoft.com/office/drawing/2015/10/21/chartex" xmlns:cx3="http://schemas.microsoft.com/office/drawing/2016/5/9/chartex" xmlns:cx4="http://schemas.microsoft.com/office/drawing/2016/5/10/chartex" xmlns:cx5="http://schemas.microsoft.com/office/drawing/2016/5/11/chartex" xmlns:cx6="http://schemas.microsoft.com/office/drawing/2016/5/12/chartex" xmlns:cx7="http://schemas.microsoft.com/office/drawing/2016/5/13/chartex" xmlns:cx8="http://schemas.microsoft.com/office/drawing/2016/5/14/chartex" xmlns:mc="http://schemas.openxmlformats.org/markup-compatibility/2006" xmlns:aink="http://schemas.microsoft.com/office/drawing/2016/ink" xmlns:am3d="http://schemas.microsoft.com/office/drawing/2017/model3d" xmlns:o="urn:schemas-microsoft-com:office:office" xmlns:oel="http://schemas.microsoft.com/office/2019/extlst" xmlns:r="http://schemas.openxmlformats.org/officeDocument/2006/relationships" xmlns:m="http://schemas.openxmlformats.org/officeDocument/2006/math" xmlns:v="urn:schemas-microsoft-com:vml" xmlns:wp14="http://schemas.microsoft.com/office/word/2010/wordprocessingDrawing" xmlns:wp="http://schemas.openxmlformats.org/drawingml/2006/wordprocessingDrawing" xmlns:w10="urn:schemas-microsoft-com:office:word" xmlns:w="http://schemas.openxmlformats.org/wordprocessingml/2006/main" xmlns:w14="http://schemas.microsoft.com/office/word/2010/wordml" xmlns:w15="http://schemas.microsoft.com/office/word/2012/wordml" xmlns:w16cex="http://schemas.microsoft.com/office/word/2018/wordml/cex" xmlns:w16cid="http://schemas.microsoft.com/office/word/2016/wordml/cid" xmlns:w16="http://schemas.microsoft.com/office/word/2018/wordml" xmlns:w16sdtdh="http://schemas.microsoft.com/office/word/2020/wordml/sdtdatahash" xmlns:w16se="http://schemas.microsoft.com/office/word/2015/wordml/symex" xmlns:wpg="http://schemas.microsoft.com/office/word/2010/wordprocessingGroup" xmlns:wpi="http://schemas.microsoft.com/office/word/2010/wordprocessingInk" xmlns:wne="http://schemas.microsoft.com/office/word/2006/wordml" xmlns:wps="http://schemas.microsoft.com/office/word/2010/wordprocessingShape" mc:Ignorable="w14 w15 w16se w16cid w16 w16cex w16sdtdh wp14">
   <w15:commentEx w15:paraId="1B5E727B" w15:done="0"/>
-  <w15:commentEx w15:paraId="4C6460F9" w15:done="0"/>
+  <w15:commentEx w15:paraId="0BE53CB0" w15:done="0"/>
   <w15:commentEx w15:paraId="0A2E3AF6" w15:done="0"/>
 </w15:commentsEx>
 </file>
@@ -5721,7 +5973,7 @@
 <file path=word/commentsExtensible.xml><?xml version="1.0" encoding="utf-8"?>
 <w16cex:commentsExtensible xmlns:wpc="http://schemas.microsoft.com/office/word/2010/wordprocessingCanvas" xmlns:cx="http://schemas.microsoft.com/office/drawing/2014/chartex" xmlns:cx1="http://schemas.microsoft.com/office/drawing/2015/9/8/chartex" xmlns:cx2="http://schemas.microsoft.com/office/drawing/2015/10/21/chartex" xmlns:cx3="http://schemas.microsoft.com/office/drawing/2016/5/9/chartex" xmlns:cx4="http://schemas.microsoft.com/office/drawing/2016/5/10/chartex" xmlns:cx5="http://schemas.microsoft.com/office/drawing/2016/5/11/chartex" xmlns:cx6="http://schemas.microsoft.com/office/drawing/2016/5/12/chartex" xmlns:cx7="http://schemas.microsoft.com/office/drawing/2016/5/13/chartex" xmlns:cx8="http://schemas.microsoft.com/office/drawing/2016/5/14/chartex" xmlns:cr="http://schemas.microsoft.com/office/comments/2020/reactions" xmlns:mc="http://schemas.openxmlformats.org/markup-compatibility/2006" xmlns:aink="http://schemas.microsoft.com/office/drawing/2016/ink" xmlns:am3d="http://schemas.microsoft.com/office/drawing/2017/model3d" xmlns:o="urn:schemas-microsoft-com:office:office" xmlns:oel="http://schemas.microsoft.com/office/2019/extlst" xmlns:r="http://schemas.openxmlformats.org/officeDocument/2006/relationships" xmlns:m="http://schemas.openxmlformats.org/officeDocument/2006/math" xmlns:v="urn:schemas-microsoft-com:vml" xmlns:wp14="http://schemas.microsoft.com/office/word/2010/wordprocessingDrawing" xmlns:wp="http://schemas.openxmlformats.org/drawingml/2006/wordprocessingDrawing" xmlns:w10="urn:schemas-microsoft-com:office:word" xmlns:w="http://schemas.openxmlformats.org/wordprocessingml/2006/main" xmlns:w14="http://schemas.microsoft.com/office/word/2010/wordml" xmlns:w15="http://schemas.microsoft.com/office/word/2012/wordml" xmlns:w16cex="http://schemas.microsoft.com/office/word/2018/wordml/cex" xmlns:w16cid="http://schemas.microsoft.com/office/word/2016/wordml/cid" xmlns:w16="http://schemas.microsoft.com/office/word/2018/wordml" xmlns:w16sdtdh="http://schemas.microsoft.com/office/word/2020/wordml/sdtdatahash" xmlns:w16se="http://schemas.microsoft.com/office/word/2015/wordml/symex" xmlns:wpg="http://schemas.microsoft.com/office/word/2010/wordprocessingGroup" xmlns:wpi="http://schemas.microsoft.com/office/word/2010/wordprocessingInk" xmlns:wne="http://schemas.microsoft.com/office/word/2006/wordml" xmlns:wps="http://schemas.microsoft.com/office/word/2010/wordprocessingShape" mc:Ignorable="w14 w15 w16se w16cid w16 w16cex w16sdtdh cr wp14">
   <w16cex:commentExtensible w16cex:durableId="2D3B247C" w16cex:dateUtc="2026-02-14T15:42:00Z"/>
-  <w16cex:commentExtensible w16cex:durableId="2D3B265B" w16cex:dateUtc="2026-02-14T15:50:00Z"/>
+  <w16cex:commentExtensible w16cex:durableId="2D48D45C" w16cex:dateUtc="2026-02-25T00:52:00Z"/>
   <w16cex:commentExtensible w16cex:durableId="2D3B27ED" w16cex:dateUtc="2026-02-14T15:57:00Z"/>
 </w16cex:commentsExtensible>
 </file>
@@ -5729,7 +5981,7 @@
 <file path=word/commentsIds.xml><?xml version="1.0" encoding="utf-8"?>
 <w16cid:commentsIds xmlns:wpc="http://schemas.microsoft.com/office/word/2010/wordprocessingCanvas" xmlns:cx="http://schemas.microsoft.com/office/drawing/2014/chartex" xmlns:cx1="http://schemas.microsoft.com/office/drawing/2015/9/8/chartex" xmlns:cx2="http://schemas.microsoft.com/office/drawing/2015/10/21/chartex" xmlns:cx3="http://schemas.microsoft.com/office/drawing/2016/5/9/chartex" xmlns:cx4="http://schemas.microsoft.com/office/drawing/2016/5/10/chartex" xmlns:cx5="http://schemas.microsoft.com/office/drawing/2016/5/11/chartex" xmlns:cx6="http://schemas.microsoft.com/office/drawing/2016/5/12/chartex" xmlns:cx7="http://schemas.microsoft.com/office/drawing/2016/5/13/chartex" xmlns:cx8="http://schemas.microsoft.com/office/drawing/2016/5/14/chartex" xmlns:mc="http://schemas.openxmlformats.org/markup-compatibility/2006" xmlns:aink="http://schemas.microsoft.com/office/drawing/2016/ink" xmlns:am3d="http://schemas.microsoft.com/office/drawing/2017/model3d" xmlns:o="urn:schemas-microsoft-com:office:office" xmlns:oel="http://schemas.microsoft.com/office/2019/extlst" xmlns:r="http://schemas.openxmlformats.org/officeDocument/2006/relationships" xmlns:m="http://schemas.openxmlformats.org/officeDocument/2006/math" xmlns:v="urn:schemas-microsoft-com:vml" xmlns:wp14="http://schemas.microsoft.com/office/word/2010/wordprocessingDrawing" xmlns:wp="http://schemas.openxmlformats.org/drawingml/2006/wordprocessingDrawing" xmlns:w10="urn:schemas-microsoft-com:office:word" xmlns:w="http://schemas.openxmlformats.org/wordprocessingml/2006/main" xmlns:w14="http://schemas.microsoft.com/office/word/2010/wordml" xmlns:w15="http://schemas.microsoft.com/office/word/2012/wordml" xmlns:w16cex="http://schemas.microsoft.com/office/word/2018/wordml/cex" xmlns:w16cid="http://schemas.microsoft.com/office/word/2016/wordml/cid" xmlns:w16="http://schemas.microsoft.com/office/word/2018/wordml" xmlns:w16sdtdh="http://schemas.microsoft.com/office/word/2020/wordml/sdtdatahash" xmlns:w16se="http://schemas.microsoft.com/office/word/2015/wordml/symex" xmlns:wpg="http://schemas.microsoft.com/office/word/2010/wordprocessingGroup" xmlns:wpi="http://schemas.microsoft.com/office/word/2010/wordprocessingInk" xmlns:wne="http://schemas.microsoft.com/office/word/2006/wordml" xmlns:wps="http://schemas.microsoft.com/office/word/2010/wordprocessingShape" mc:Ignorable="w14 w15 w16se w16cid w16 w16cex w16sdtdh wp14">
   <w16cid:commentId w16cid:paraId="1B5E727B" w16cid:durableId="2D3B247C"/>
-  <w16cid:commentId w16cid:paraId="4C6460F9" w16cid:durableId="2D3B265B"/>
+  <w16cid:commentId w16cid:paraId="0BE53CB0" w16cid:durableId="2D48D45C"/>
   <w16cid:commentId w16cid:paraId="0A2E3AF6" w16cid:durableId="2D3B27ED"/>
 </w16cid:commentsIds>
 </file>

</xml_diff>